<commit_message>
feat: add AIL Weeks 3-4, a Session Slides download, and regenerate downloads for weeks 1-4
- Week 3 (plan and take deliberate steps, objective 3) and Week 4 (track,
  feedback, reflect, objective 4) authored as six offline oral/visual
  activities: cb-ail-making-an-action-plan, -managing-time-and-priorities,
  -finding-help-and-resources, -keeping-a-learning-journal,
  -seeking-and-using-feedback, -reflecting-on-your-growth. The unit now covers
  all four objectives across four weeks at 3h in-person + 2h independent.
- New editable Session Slides (PowerPoint) download for the unit.
- Facilitator plan, workbook, and slides regenerated to cover weeks 1-4.

Co-Authored-By: Claude Opus 4.8 <noreply@anthropic.com>
</commit_message>
<xml_diff>
--- a/public/downloads/agency-in-learning-facilitator-unit-plan.docx
+++ b/public/downloads/agency-in-learning-facilitator-unit-plan.docx
@@ -150,7 +150,7 @@
                 <w:sz w:val="21"/>
                 <w:szCs w:val="21"/>
               </w:rPr>
-              <w:t xml:space="preserve">3h in-person + 2h independent, across a minimum of 10 weeks. 2 weeks detailed here.</w:t>
+              <w:t xml:space="preserve">3h in-person + 2h independent, across a minimum of 10 weeks. 4 weeks detailed here.</w:t>
             </w:r>
           </w:p>
         </w:tc>
@@ -5034,6 +5034,4988 @@
           <w:szCs w:val="18"/>
         </w:rPr>
         <w:t xml:space="preserve">Flex: Taking the first step is independent by design and is the week's core independent practice; building the ladder and committing aloud stay in-person.</w:t>
+      </w:r>
+    </w:p>
+    <w:p>
+      <w:r>
+        <w:br w:type="page"/>
+      </w:r>
+    </w:p>
+    <w:p>
+      <w:pPr>
+        <w:pBdr>
+          <w:bottom w:val="single" w:color="8F993E" w:sz="12" w:space="6"/>
+        </w:pBdr>
+        <w:spacing w:after="60" w:before="240"/>
+      </w:pPr>
+      <w:r>
+        <w:rPr>
+          <w:b/>
+          <w:bCs/>
+          <w:color w:val="004976"/>
+          <w:sz w:val="40"/>
+          <w:szCs w:val="40"/>
+        </w:rPr>
+        <w:t xml:space="preserve">Week 3 — Plan and take deliberate steps</w:t>
+      </w:r>
+    </w:p>
+    <w:p>
+      <w:pPr>
+        <w:spacing w:after="80"/>
+      </w:pPr>
+      <w:r>
+        <w:rPr>
+          <w:i/>
+          <w:iCs/>
+          <w:color w:val="6B7280"/>
+          <w:sz w:val="19"/>
+          <w:szCs w:val="19"/>
+        </w:rPr>
+        <w:t xml:space="preserve">Objective 3: Plan and take deliberate steps towards your goals.</w:t>
+      </w:r>
+    </w:p>
+    <w:tbl>
+      <w:tblPr>
+        <w:tblW w:type="pct" w:w="100%"/>
+        <w:tblBorders>
+          <w:top w:val="none" w:color="FFFFFF" w:sz="0"/>
+          <w:left w:val="none" w:color="FFFFFF" w:sz="0"/>
+          <w:bottom w:val="none" w:color="FFFFFF" w:sz="0"/>
+          <w:right w:val="none" w:color="FFFFFF" w:sz="0"/>
+          <w:insideH w:val="none" w:color="FFFFFF" w:sz="0"/>
+          <w:insideV w:val="none" w:color="FFFFFF" w:sz="0"/>
+        </w:tblBorders>
+      </w:tblPr>
+      <w:tblGrid>
+        <w:gridCol w:w="100"/>
+      </w:tblGrid>
+      <w:tr>
+        <w:tc>
+          <w:tcPr>
+            <w:shd w:fill="FCEFC9" w:color="auto" w:val="clear"/>
+            <w:tcMar>
+              <w:top w:type="dxa" w:w="90"/>
+              <w:left w:type="dxa" w:w="140"/>
+              <w:bottom w:type="dxa" w:w="90"/>
+              <w:right w:type="dxa" w:w="140"/>
+            </w:tcMar>
+          </w:tcPr>
+          <w:p>
+            <w:pPr>
+              <w:spacing w:after="40"/>
+            </w:pPr>
+            <w:r>
+              <w:rPr>
+                <w:b/>
+                <w:bCs/>
+                <w:color w:val="EF9600"/>
+                <w:spacing w:val="30"/>
+                <w:sz w:val="15"/>
+                <w:szCs w:val="15"/>
+              </w:rPr>
+              <w:t xml:space="preserve">OUTCOME OF THE WEEK</w:t>
+            </w:r>
+          </w:p>
+          <w:p>
+            <w:r>
+              <w:rPr>
+                <w:color w:val="041E42"/>
+                <w:sz w:val="21"/>
+                <w:szCs w:val="21"/>
+              </w:rPr>
+              <w:t xml:space="preserve">Each learner turns their goal into a small action plan, protects a little time to work on it, and knows where to find the help and resources they need, so a goal becomes deliberate, sustained steps rather than intention alone.</w:t>
+            </w:r>
+          </w:p>
+        </w:tc>
+      </w:tr>
+    </w:tbl>
+    <w:p>
+      <w:pPr>
+        <w:spacing w:after="120" w:before="80"/>
+      </w:pPr>
+      <w:r>
+        <w:rPr>
+          <w:color w:val="97999B"/>
+          <w:sz w:val="19"/>
+          <w:szCs w:val="19"/>
+        </w:rPr>
+        <w:t xml:space="preserve">This week: 3h in-person · 2h independent, across 3 sessions.</w:t>
+      </w:r>
+    </w:p>
+    <w:p>
+      <w:pPr>
+        <w:spacing w:after="40" w:before="200"/>
+      </w:pPr>
+      <w:r>
+        <w:rPr>
+          <w:b/>
+          <w:bCs/>
+          <w:color w:val="041E42"/>
+          <w:sz w:val="26"/>
+          <w:szCs w:val="26"/>
+        </w:rPr>
+        <w:t xml:space="preserve">Session 1 — Make an action plan</w:t>
+      </w:r>
+    </w:p>
+    <w:p>
+      <w:pPr>
+        <w:spacing w:after="80"/>
+      </w:pPr>
+      <w:r>
+        <w:rPr>
+          <w:b/>
+          <w:bCs/>
+          <w:color w:val="3F8291"/>
+          <w:sz w:val="18"/>
+          <w:szCs w:val="18"/>
+        </w:rPr>
+        <w:t xml:space="preserve">1h in-person · 30 min independent</w:t>
+      </w:r>
+    </w:p>
+    <w:tbl>
+      <w:tblPr>
+        <w:tblW w:type="pct" w:w="100%"/>
+        <w:tblBorders>
+          <w:top w:val="none" w:color="FFFFFF" w:sz="0"/>
+          <w:left w:val="none" w:color="FFFFFF" w:sz="0"/>
+          <w:bottom w:val="none" w:color="FFFFFF" w:sz="0"/>
+          <w:right w:val="none" w:color="FFFFFF" w:sz="0"/>
+          <w:insideH w:val="none" w:color="FFFFFF" w:sz="0"/>
+          <w:insideV w:val="none" w:color="FFFFFF" w:sz="0"/>
+        </w:tblBorders>
+      </w:tblPr>
+      <w:tblGrid>
+        <w:gridCol w:w="100"/>
+      </w:tblGrid>
+      <w:tr>
+        <w:tc>
+          <w:tcPr>
+            <w:shd w:fill="FBEFE0" w:color="auto" w:val="clear"/>
+            <w:tcMar>
+              <w:top w:type="dxa" w:w="90"/>
+              <w:left w:type="dxa" w:w="140"/>
+              <w:bottom w:type="dxa" w:w="90"/>
+              <w:right w:type="dxa" w:w="140"/>
+            </w:tcMar>
+          </w:tcPr>
+          <w:p>
+            <w:pPr>
+              <w:spacing w:after="40"/>
+            </w:pPr>
+            <w:r>
+              <w:rPr>
+                <w:b/>
+                <w:bCs/>
+                <w:color w:val="EF9600"/>
+                <w:spacing w:val="30"/>
+                <w:sz w:val="15"/>
+                <w:szCs w:val="15"/>
+              </w:rPr>
+              <w:t xml:space="preserve">THE ONE THING TO GET RIGHT</w:t>
+            </w:r>
+          </w:p>
+          <w:p>
+            <w:r>
+              <w:rPr>
+                <w:color w:val="041E42"/>
+                <w:sz w:val="21"/>
+                <w:szCs w:val="21"/>
+              </w:rPr>
+              <w:t xml:space="preserve">An action plan only helps if it is small enough to act on this week. The one thing to get right is to stop learners drawing a big, overwhelming plan they will never start. Keep it to a real goal, a few step-pictures, and a first step small enough to take before you next meet. Do not labour the words action plan: it is just deliberate steps, drawn, not a document. Say aloud that a plan a learner owns and can truly begin beats a tidy one they abandon. Help them name what the first step needs, so a missing thing is spotted now rather than becoming an excuse later.</w:t>
+            </w:r>
+          </w:p>
+        </w:tc>
+      </w:tr>
+    </w:tbl>
+    <w:p>
+      <w:pPr>
+        <w:spacing w:after="40" w:before="160"/>
+      </w:pPr>
+      <w:r>
+        <w:rPr>
+          <w:b/>
+          <w:bCs/>
+          <w:color w:val="004976"/>
+          <w:spacing w:val="30"/>
+          <w:sz w:val="17"/>
+          <w:szCs w:val="17"/>
+        </w:rPr>
+        <w:t xml:space="preserve">PREPARE</w:t>
+      </w:r>
+    </w:p>
+    <w:p>
+      <w:pPr>
+        <w:pStyle w:val="ListParagraph"/>
+        <w:numPr>
+          <w:ilvl w:val="0"/>
+          <w:numId w:val="1"/>
+        </w:numPr>
+        <w:spacing w:after="40"/>
+      </w:pPr>
+      <w:r>
+        <w:rPr>
+          <w:color w:val="041E42"/>
+          <w:sz w:val="21"/>
+          <w:szCs w:val="21"/>
+        </w:rPr>
+        <w:t xml:space="preserve">Your own honest example of a real goal, three or four steps, and a first step with a by-when, to draw and model first.</w:t>
+      </w:r>
+    </w:p>
+    <w:p>
+      <w:pPr>
+        <w:pStyle w:val="ListParagraph"/>
+        <w:numPr>
+          <w:ilvl w:val="0"/>
+          <w:numId w:val="1"/>
+        </w:numPr>
+        <w:spacing w:after="40"/>
+      </w:pPr>
+      <w:r>
+        <w:rPr>
+          <w:color w:val="041E42"/>
+          <w:sz w:val="21"/>
+          <w:szCs w:val="21"/>
+        </w:rPr>
+        <w:t xml:space="preserve">The student workbook (a strip of empty boxes for step-pictures, and simple pictures for who or what a step needs).</w:t>
+      </w:r>
+    </w:p>
+    <w:p>
+      <w:pPr>
+        <w:pStyle w:val="ListParagraph"/>
+        <w:numPr>
+          <w:ilvl w:val="0"/>
+          <w:numId w:val="1"/>
+        </w:numPr>
+        <w:spacing w:after="40"/>
+      </w:pPr>
+      <w:r>
+        <w:rPr>
+          <w:color w:val="041E42"/>
+          <w:sz w:val="21"/>
+          <w:szCs w:val="21"/>
+        </w:rPr>
+        <w:t xml:space="preserve">Small stones, bottle caps, or scraps the learner can lay out and reorder as steps, so no writing is needed.</w:t>
+      </w:r>
+    </w:p>
+    <w:p>
+      <w:pPr>
+        <w:pStyle w:val="ListParagraph"/>
+        <w:numPr>
+          <w:ilvl w:val="0"/>
+          <w:numId w:val="1"/>
+        </w:numPr>
+        <w:spacing w:after="40"/>
+      </w:pPr>
+      <w:r>
+        <w:rPr>
+          <w:color w:val="041E42"/>
+          <w:sz w:val="21"/>
+          <w:szCs w:val="21"/>
+        </w:rPr>
+        <w:t xml:space="preserve">Sensitivity: a goal can touch on family, work, or leaving the camp. Let learners keep the goal private, choose a simpler one, and never require anyone to say their reasons aloud.</w:t>
+      </w:r>
+    </w:p>
+    <w:p>
+      <w:pPr>
+        <w:spacing w:after="40" w:before="140"/>
+      </w:pPr>
+      <w:r>
+        <w:rPr>
+          <w:b/>
+          <w:bCs/>
+          <w:color w:val="004976"/>
+          <w:sz w:val="22"/>
+          <w:szCs w:val="22"/>
+        </w:rPr>
+        <w:t xml:space="preserve">1. Draw the steps that would reach your goal</w:t>
+      </w:r>
+      <w:r>
+        <w:rPr>
+          <w:color w:val="97999B"/>
+          <w:sz w:val="17"/>
+          <w:szCs w:val="17"/>
+        </w:rPr>
+        <w:t xml:space="preserve">   14-16 min</w:t>
+      </w:r>
+    </w:p>
+    <w:p>
+      <w:pPr>
+        <w:spacing w:after="80"/>
+      </w:pPr>
+      <w:r>
+        <w:rPr>
+          <w:color w:val="041E42"/>
+          <w:sz w:val="21"/>
+          <w:szCs w:val="21"/>
+        </w:rPr>
+        <w:t xml:space="preserve">Draw your own goal first: say it aloud, then draw three or four small pictures of the steps that reach it, one per box. Then give learners quiet time to draw the steps for their own goal. Say aloud that each step should be a thing a person could actually do, not a wish, and that a few good steps beat twenty. Circulate and ask, do not tell, what the very next doable thing would be.</w:t>
+      </w:r>
+    </w:p>
+    <w:p>
+      <w:pPr>
+        <w:spacing w:after="20"/>
+      </w:pPr>
+      <w:r>
+        <w:rPr>
+          <w:b/>
+          <w:bCs/>
+          <w:color w:val="8F993E"/>
+          <w:sz w:val="18"/>
+          <w:szCs w:val="18"/>
+        </w:rPr>
+        <w:t xml:space="preserve">Ask:</w:t>
+      </w:r>
+    </w:p>
+    <w:p>
+      <w:pPr>
+        <w:pStyle w:val="ListParagraph"/>
+        <w:numPr>
+          <w:ilvl w:val="0"/>
+          <w:numId w:val="1"/>
+        </w:numPr>
+        <w:spacing w:after="20"/>
+      </w:pPr>
+      <w:r>
+        <w:rPr>
+          <w:color w:val="041E42"/>
+          <w:sz w:val="20"/>
+          <w:szCs w:val="20"/>
+        </w:rPr>
+        <w:t xml:space="preserve">What would actually have to happen for you to reach this goal?</w:t>
+      </w:r>
+    </w:p>
+    <w:p>
+      <w:pPr>
+        <w:pStyle w:val="ListParagraph"/>
+        <w:numPr>
+          <w:ilvl w:val="0"/>
+          <w:numId w:val="1"/>
+        </w:numPr>
+        <w:spacing w:after="20"/>
+      </w:pPr>
+      <w:r>
+        <w:rPr>
+          <w:color w:val="041E42"/>
+          <w:sz w:val="20"/>
+          <w:szCs w:val="20"/>
+        </w:rPr>
+        <w:t xml:space="preserve">Is each picture a thing you could do, or is it still just a wish?</w:t>
+      </w:r>
+    </w:p>
+    <w:p>
+      <w:pPr>
+        <w:pStyle w:val="ListParagraph"/>
+        <w:numPr>
+          <w:ilvl w:val="0"/>
+          <w:numId w:val="1"/>
+        </w:numPr>
+        <w:spacing w:after="20"/>
+      </w:pPr>
+      <w:r>
+        <w:rPr>
+          <w:color w:val="041E42"/>
+          <w:sz w:val="20"/>
+          <w:szCs w:val="20"/>
+        </w:rPr>
+        <w:t xml:space="preserve">What is the smallest first thing that would move this forward?</w:t>
+      </w:r>
+    </w:p>
+    <w:p>
+      <w:pPr>
+        <w:spacing w:after="20" w:before="40"/>
+      </w:pPr>
+      <w:r>
+        <w:rPr>
+          <w:b/>
+          <w:bCs/>
+          <w:color w:val="BD472A"/>
+          <w:sz w:val="18"/>
+          <w:szCs w:val="18"/>
+        </w:rPr>
+        <w:t xml:space="preserve">Watch out:</w:t>
+      </w:r>
+    </w:p>
+    <w:p>
+      <w:pPr>
+        <w:pStyle w:val="ListParagraph"/>
+        <w:numPr>
+          <w:ilvl w:val="0"/>
+          <w:numId w:val="1"/>
+        </w:numPr>
+        <w:spacing w:after="20"/>
+      </w:pPr>
+      <w:r>
+        <w:rPr>
+          <w:color w:val="041E42"/>
+          <w:sz w:val="20"/>
+          <w:szCs w:val="20"/>
+        </w:rPr>
+        <w:t xml:space="preserve">A learner draws steps so big each is really a goal of its own; help them break the first one down into a single doable action, and scribe a few words under the picture if they ask.</w:t>
+      </w:r>
+    </w:p>
+    <w:p>
+      <w:pPr>
+        <w:spacing w:after="40" w:before="20"/>
+      </w:pPr>
+      <w:r>
+        <w:rPr>
+          <w:i/>
+          <w:iCs/>
+          <w:color w:val="6B7280"/>
+          <w:sz w:val="18"/>
+          <w:szCs w:val="18"/>
+        </w:rPr>
+        <w:t xml:space="preserve">If low-resource: With no board or device, lay out stones or caps, one per step, and point. Learners draw or place, and you scribe a word only if asked. The steps matter more than the marking.</w:t>
+      </w:r>
+    </w:p>
+    <w:p>
+      <w:pPr>
+        <w:spacing w:after="40" w:before="140"/>
+      </w:pPr>
+      <w:r>
+        <w:rPr>
+          <w:b/>
+          <w:bCs/>
+          <w:color w:val="004976"/>
+          <w:sz w:val="22"/>
+          <w:szCs w:val="22"/>
+        </w:rPr>
+        <w:t xml:space="preserve">2. Put the steps in order and point to the first</w:t>
+      </w:r>
+      <w:r>
+        <w:rPr>
+          <w:color w:val="97999B"/>
+          <w:sz w:val="17"/>
+          <w:szCs w:val="17"/>
+        </w:rPr>
+        <w:t xml:space="preserve">   12-14 min</w:t>
+      </w:r>
+    </w:p>
+    <w:p>
+      <w:pPr>
+        <w:spacing w:after="80"/>
+      </w:pPr>
+      <w:r>
+        <w:rPr>
+          <w:color w:val="041E42"/>
+          <w:sz w:val="21"/>
+          <w:szCs w:val="21"/>
+        </w:rPr>
+        <w:t xml:space="preserve">Show learners how to put the step-pictures in order: what has to come before what, and which one they can start now. Say aloud that some steps must wait for others, so a sensible order stops a learner stalling on something they cannot yet do. Have each learner lay their pictures left to right and point to the one that comes first, checking it does not wait on a step not yet reached.</w:t>
+      </w:r>
+    </w:p>
+    <w:p>
+      <w:pPr>
+        <w:spacing w:after="20"/>
+      </w:pPr>
+      <w:r>
+        <w:rPr>
+          <w:b/>
+          <w:bCs/>
+          <w:color w:val="8F993E"/>
+          <w:sz w:val="18"/>
+          <w:szCs w:val="18"/>
+        </w:rPr>
+        <w:t xml:space="preserve">Ask:</w:t>
+      </w:r>
+    </w:p>
+    <w:p>
+      <w:pPr>
+        <w:pStyle w:val="ListParagraph"/>
+        <w:numPr>
+          <w:ilvl w:val="0"/>
+          <w:numId w:val="1"/>
+        </w:numPr>
+        <w:spacing w:after="20"/>
+      </w:pPr>
+      <w:r>
+        <w:rPr>
+          <w:color w:val="041E42"/>
+          <w:sz w:val="20"/>
+          <w:szCs w:val="20"/>
+        </w:rPr>
+        <w:t xml:space="preserve">Which of these steps has to happen before the others can?</w:t>
+      </w:r>
+    </w:p>
+    <w:p>
+      <w:pPr>
+        <w:pStyle w:val="ListParagraph"/>
+        <w:numPr>
+          <w:ilvl w:val="0"/>
+          <w:numId w:val="1"/>
+        </w:numPr>
+        <w:spacing w:after="20"/>
+      </w:pPr>
+      <w:r>
+        <w:rPr>
+          <w:color w:val="041E42"/>
+          <w:sz w:val="20"/>
+          <w:szCs w:val="20"/>
+        </w:rPr>
+        <w:t xml:space="preserve">Which step could you actually start first, this week?</w:t>
+      </w:r>
+    </w:p>
+    <w:p>
+      <w:pPr>
+        <w:pStyle w:val="ListParagraph"/>
+        <w:numPr>
+          <w:ilvl w:val="0"/>
+          <w:numId w:val="1"/>
+        </w:numPr>
+        <w:spacing w:after="20"/>
+      </w:pPr>
+      <w:r>
+        <w:rPr>
+          <w:color w:val="041E42"/>
+          <w:sz w:val="20"/>
+          <w:szCs w:val="20"/>
+        </w:rPr>
+        <w:t xml:space="preserve">Is anything you drew waiting on a step you have not done yet?</w:t>
+      </w:r>
+    </w:p>
+    <w:p>
+      <w:pPr>
+        <w:spacing w:after="20" w:before="40"/>
+      </w:pPr>
+      <w:r>
+        <w:rPr>
+          <w:b/>
+          <w:bCs/>
+          <w:color w:val="BD472A"/>
+          <w:sz w:val="18"/>
+          <w:szCs w:val="18"/>
+        </w:rPr>
+        <w:t xml:space="preserve">Watch out:</w:t>
+      </w:r>
+    </w:p>
+    <w:p>
+      <w:pPr>
+        <w:pStyle w:val="ListParagraph"/>
+        <w:numPr>
+          <w:ilvl w:val="0"/>
+          <w:numId w:val="1"/>
+        </w:numPr>
+        <w:spacing w:after="20"/>
+      </w:pPr>
+      <w:r>
+        <w:rPr>
+          <w:color w:val="041E42"/>
+          <w:sz w:val="20"/>
+          <w:szCs w:val="20"/>
+        </w:rPr>
+        <w:t xml:space="preserve">A learner points to a first step that quietly waits on a later one and then cannot start; walk them back to the true first action they can take alone.</w:t>
+      </w:r>
+    </w:p>
+    <w:p>
+      <w:pPr>
+        <w:spacing w:after="40" w:before="20"/>
+      </w:pPr>
+      <w:r>
+        <w:rPr>
+          <w:i/>
+          <w:iCs/>
+          <w:color w:val="6B7280"/>
+          <w:sz w:val="18"/>
+          <w:szCs w:val="18"/>
+        </w:rPr>
+        <w:t xml:space="preserve">If low-resource: If there are no boxes, laying the stones or scraps in a row and swapping their order by hand shows the sequence just as well as writing numbers.</w:t>
+      </w:r>
+    </w:p>
+    <w:p>
+      <w:pPr>
+        <w:spacing w:after="40" w:before="140"/>
+      </w:pPr>
+      <w:r>
+        <w:rPr>
+          <w:b/>
+          <w:bCs/>
+          <w:color w:val="004976"/>
+          <w:sz w:val="22"/>
+          <w:szCs w:val="22"/>
+        </w:rPr>
+        <w:t xml:space="preserve">3. Mark a by-when and say what the step needs</w:t>
+      </w:r>
+      <w:r>
+        <w:rPr>
+          <w:color w:val="97999B"/>
+          <w:sz w:val="17"/>
+          <w:szCs w:val="17"/>
+        </w:rPr>
+        <w:t xml:space="preserve">   14-16 min</w:t>
+      </w:r>
+    </w:p>
+    <w:p>
+      <w:pPr>
+        <w:spacing w:after="80"/>
+      </w:pPr>
+      <w:r>
+        <w:rPr>
+          <w:color w:val="041E42"/>
+          <w:sz w:val="21"/>
+          <w:szCs w:val="21"/>
+        </w:rPr>
+        <w:t xml:space="preserve">Move from order to commitment. Ask each learner to mark a real by-when for their first step (point to a day on the workbook week-strip), and to say what it needs: a person to ask, a thing, a place, or a slice of time. Say aloud that naming needs now is how a learner spots a blocker before it becomes an excuse. Keep the by-when close and honest, so the first step is done before you meet again.</w:t>
+      </w:r>
+    </w:p>
+    <w:p>
+      <w:pPr>
+        <w:spacing w:after="20"/>
+      </w:pPr>
+      <w:r>
+        <w:rPr>
+          <w:b/>
+          <w:bCs/>
+          <w:color w:val="8F993E"/>
+          <w:sz w:val="18"/>
+          <w:szCs w:val="18"/>
+        </w:rPr>
+        <w:t xml:space="preserve">Ask:</w:t>
+      </w:r>
+    </w:p>
+    <w:p>
+      <w:pPr>
+        <w:pStyle w:val="ListParagraph"/>
+        <w:numPr>
+          <w:ilvl w:val="0"/>
+          <w:numId w:val="1"/>
+        </w:numPr>
+        <w:spacing w:after="20"/>
+      </w:pPr>
+      <w:r>
+        <w:rPr>
+          <w:color w:val="041E42"/>
+          <w:sz w:val="20"/>
+          <w:szCs w:val="20"/>
+        </w:rPr>
+        <w:t xml:space="preserve">By when will you have taken your first step, pointing to a real day?</w:t>
+      </w:r>
+    </w:p>
+    <w:p>
+      <w:pPr>
+        <w:pStyle w:val="ListParagraph"/>
+        <w:numPr>
+          <w:ilvl w:val="0"/>
+          <w:numId w:val="1"/>
+        </w:numPr>
+        <w:spacing w:after="20"/>
+      </w:pPr>
+      <w:r>
+        <w:rPr>
+          <w:color w:val="041E42"/>
+          <w:sz w:val="20"/>
+          <w:szCs w:val="20"/>
+        </w:rPr>
+        <w:t xml:space="preserve">What do you need to take it: a person, a thing, or some time?</w:t>
+      </w:r>
+    </w:p>
+    <w:p>
+      <w:pPr>
+        <w:pStyle w:val="ListParagraph"/>
+        <w:numPr>
+          <w:ilvl w:val="0"/>
+          <w:numId w:val="1"/>
+        </w:numPr>
+        <w:spacing w:after="20"/>
+      </w:pPr>
+      <w:r>
+        <w:rPr>
+          <w:color w:val="041E42"/>
+          <w:sz w:val="20"/>
+          <w:szCs w:val="20"/>
+        </w:rPr>
+        <w:t xml:space="preserve">Is there anything that could get in the way, and how would you get around it?</w:t>
+      </w:r>
+    </w:p>
+    <w:p>
+      <w:pPr>
+        <w:spacing w:after="20" w:before="40"/>
+      </w:pPr>
+      <w:r>
+        <w:rPr>
+          <w:b/>
+          <w:bCs/>
+          <w:color w:val="BD472A"/>
+          <w:sz w:val="18"/>
+          <w:szCs w:val="18"/>
+        </w:rPr>
+        <w:t xml:space="preserve">Watch out:</w:t>
+      </w:r>
+    </w:p>
+    <w:p>
+      <w:pPr>
+        <w:pStyle w:val="ListParagraph"/>
+        <w:numPr>
+          <w:ilvl w:val="0"/>
+          <w:numId w:val="1"/>
+        </w:numPr>
+        <w:spacing w:after="20"/>
+      </w:pPr>
+      <w:r>
+        <w:rPr>
+          <w:color w:val="041E42"/>
+          <w:sz w:val="20"/>
+          <w:szCs w:val="20"/>
+        </w:rPr>
+        <w:t xml:space="preserve">A by-when is vague or far off, so nothing starts; pin it to a real day this week and shrink the step until it fits the time the learner honestly has.</w:t>
+      </w:r>
+    </w:p>
+    <w:p>
+      <w:pPr>
+        <w:spacing w:after="40" w:before="20"/>
+      </w:pPr>
+      <w:r>
+        <w:rPr>
+          <w:i/>
+          <w:iCs/>
+          <w:color w:val="6B7280"/>
+          <w:sz w:val="18"/>
+          <w:szCs w:val="18"/>
+        </w:rPr>
+        <w:t xml:space="preserve">If low-resource: If a needed thing turns out to be unavailable in the camp, help the learner reshape the step around what they do have rather than parking the whole plan.</w:t>
+      </w:r>
+    </w:p>
+    <w:p>
+      <w:pPr>
+        <w:spacing w:after="40" w:before="140"/>
+      </w:pPr>
+      <w:r>
+        <w:rPr>
+          <w:b/>
+          <w:bCs/>
+          <w:color w:val="004976"/>
+          <w:sz w:val="22"/>
+          <w:szCs w:val="22"/>
+        </w:rPr>
+        <w:t xml:space="preserve">4. Show a partner and say your step aloud</w:t>
+      </w:r>
+      <w:r>
+        <w:rPr>
+          <w:color w:val="97999B"/>
+          <w:sz w:val="17"/>
+          <w:szCs w:val="17"/>
+        </w:rPr>
+        <w:t xml:space="preserve">   12-14 min</w:t>
+      </w:r>
+    </w:p>
+    <w:p>
+      <w:pPr>
+        <w:spacing w:after="80"/>
+      </w:pPr>
+      <w:r>
+        <w:rPr>
+          <w:color w:val="041E42"/>
+          <w:sz w:val="21"/>
+          <w:szCs w:val="21"/>
+        </w:rPr>
+        <w:t xml:space="preserve">Put learners in same-gender pairs to show each other their first step and by-when. The partner's one job is to ask whether the step is really doable by then, and whether anything is missing. Each learner changes their step if needed, then says aloud, to their partner, the one step they will take and when. Saying it to someone is a light form of accountability that makes the step more likely.</w:t>
+      </w:r>
+    </w:p>
+    <w:p>
+      <w:pPr>
+        <w:spacing w:after="20"/>
+      </w:pPr>
+      <w:r>
+        <w:rPr>
+          <w:b/>
+          <w:bCs/>
+          <w:color w:val="8F993E"/>
+          <w:sz w:val="18"/>
+          <w:szCs w:val="18"/>
+        </w:rPr>
+        <w:t xml:space="preserve">Ask:</w:t>
+      </w:r>
+    </w:p>
+    <w:p>
+      <w:pPr>
+        <w:pStyle w:val="ListParagraph"/>
+        <w:numPr>
+          <w:ilvl w:val="0"/>
+          <w:numId w:val="1"/>
+        </w:numPr>
+        <w:spacing w:after="20"/>
+      </w:pPr>
+      <w:r>
+        <w:rPr>
+          <w:color w:val="041E42"/>
+          <w:sz w:val="20"/>
+          <w:szCs w:val="20"/>
+        </w:rPr>
+        <w:t xml:space="preserve">Could your partner really start their first step by the day they pointed to?</w:t>
+      </w:r>
+    </w:p>
+    <w:p>
+      <w:pPr>
+        <w:pStyle w:val="ListParagraph"/>
+        <w:numPr>
+          <w:ilvl w:val="0"/>
+          <w:numId w:val="1"/>
+        </w:numPr>
+        <w:spacing w:after="20"/>
+      </w:pPr>
+      <w:r>
+        <w:rPr>
+          <w:color w:val="041E42"/>
+          <w:sz w:val="20"/>
+          <w:szCs w:val="20"/>
+        </w:rPr>
+        <w:t xml:space="preserve">Is anything missing from their step that they have not spotted?</w:t>
+      </w:r>
+    </w:p>
+    <w:p>
+      <w:pPr>
+        <w:pStyle w:val="ListParagraph"/>
+        <w:numPr>
+          <w:ilvl w:val="0"/>
+          <w:numId w:val="1"/>
+        </w:numPr>
+        <w:spacing w:after="20"/>
+      </w:pPr>
+      <w:r>
+        <w:rPr>
+          <w:color w:val="041E42"/>
+          <w:sz w:val="20"/>
+          <w:szCs w:val="20"/>
+        </w:rPr>
+        <w:t xml:space="preserve">What is the one step you are committing to, and by when?</w:t>
+      </w:r>
+    </w:p>
+    <w:p>
+      <w:pPr>
+        <w:spacing w:after="20" w:before="40"/>
+      </w:pPr>
+      <w:r>
+        <w:rPr>
+          <w:b/>
+          <w:bCs/>
+          <w:color w:val="BD472A"/>
+          <w:sz w:val="18"/>
+          <w:szCs w:val="18"/>
+        </w:rPr>
+        <w:t xml:space="preserve">Watch out:</w:t>
+      </w:r>
+    </w:p>
+    <w:p>
+      <w:pPr>
+        <w:pStyle w:val="ListParagraph"/>
+        <w:numPr>
+          <w:ilvl w:val="0"/>
+          <w:numId w:val="1"/>
+        </w:numPr>
+        <w:spacing w:after="20"/>
+      </w:pPr>
+      <w:r>
+        <w:rPr>
+          <w:color w:val="041E42"/>
+          <w:sz w:val="20"/>
+          <w:szCs w:val="20"/>
+        </w:rPr>
+        <w:t xml:space="preserve">Pairs slip into admiring the drawing rather than testing it; give them the one question to ask each other, whether the first step is truly doable by that day, and keep them on it.</w:t>
+      </w:r>
+    </w:p>
+    <w:p>
+      <w:pPr>
+        <w:spacing w:after="40" w:before="20"/>
+      </w:pPr>
+      <w:r>
+        <w:rPr>
+          <w:i/>
+          <w:iCs/>
+          <w:color w:val="6B7280"/>
+          <w:sz w:val="18"/>
+          <w:szCs w:val="18"/>
+        </w:rPr>
+        <w:t xml:space="preserve">If low-resource: In thin attendance or a mentoring setting, the facilitator or mentor plays the partner and asks the same doable-by-when question aloud.</w:t>
+      </w:r>
+    </w:p>
+    <w:p>
+      <w:pPr>
+        <w:spacing w:after="40" w:before="160"/>
+      </w:pPr>
+      <w:r>
+        <w:rPr>
+          <w:b/>
+          <w:bCs/>
+          <w:color w:val="004976"/>
+          <w:spacing w:val="30"/>
+          <w:sz w:val="17"/>
+          <w:szCs w:val="17"/>
+        </w:rPr>
+        <w:t xml:space="preserve">CLOSING</w:t>
+      </w:r>
+    </w:p>
+    <w:p>
+      <w:pPr>
+        <w:spacing w:after="80"/>
+      </w:pPr>
+      <w:r>
+        <w:rPr>
+          <w:color w:val="041E42"/>
+          <w:sz w:val="21"/>
+          <w:szCs w:val="21"/>
+        </w:rPr>
+        <w:t xml:space="preserve">Ask two or three learners to say their first step and its by-when aloud. Say that the plan lives in their workbook and is not fixed: as steps are taken and things change, the plan is updated, not abandoned. Remind them the point is not a tidy picture but a first deliberate step actually taken before you next meet. Independent task: take your first small step, then mark in the workbook whether it happened and what got in the way.</w:t>
+      </w:r>
+    </w:p>
+    <w:tbl>
+      <w:tblPr>
+        <w:tblW w:type="pct" w:w="100%"/>
+        <w:tblBorders>
+          <w:top w:val="none" w:color="FFFFFF" w:sz="0"/>
+          <w:left w:val="none" w:color="FFFFFF" w:sz="0"/>
+          <w:bottom w:val="none" w:color="FFFFFF" w:sz="0"/>
+          <w:right w:val="none" w:color="FFFFFF" w:sz="0"/>
+          <w:insideH w:val="none" w:color="FFFFFF" w:sz="0"/>
+          <w:insideV w:val="none" w:color="FFFFFF" w:sz="0"/>
+        </w:tblBorders>
+      </w:tblPr>
+      <w:tblGrid>
+        <w:gridCol w:w="100"/>
+      </w:tblGrid>
+      <w:tr>
+        <w:tc>
+          <w:tcPr>
+            <w:shd w:fill="E1EEF1" w:color="auto" w:val="clear"/>
+            <w:tcMar>
+              <w:top w:type="dxa" w:w="90"/>
+              <w:left w:type="dxa" w:w="140"/>
+              <w:bottom w:type="dxa" w:w="90"/>
+              <w:right w:type="dxa" w:w="140"/>
+            </w:tcMar>
+          </w:tcPr>
+          <w:p>
+            <w:pPr>
+              <w:spacing w:after="40"/>
+            </w:pPr>
+            <w:r>
+              <w:rPr>
+                <w:b/>
+                <w:bCs/>
+                <w:color w:val="3F8291"/>
+                <w:spacing w:val="30"/>
+                <w:sz w:val="15"/>
+                <w:szCs w:val="15"/>
+              </w:rPr>
+              <w:t xml:space="preserve">INDEPENDENT TASK (30 MIN)</w:t>
+            </w:r>
+          </w:p>
+          <w:p>
+            <w:r>
+              <w:rPr>
+                <w:color w:val="041E42"/>
+                <w:sz w:val="21"/>
+                <w:szCs w:val="21"/>
+              </w:rPr>
+              <w:t xml:space="preserve">Take one step from your plan this week, and notice what helped or got in the way.</w:t>
+            </w:r>
+          </w:p>
+        </w:tc>
+      </w:tr>
+    </w:tbl>
+    <w:p>
+      <w:pPr>
+        <w:spacing w:after="80" w:before="40"/>
+      </w:pPr>
+      <w:r>
+        <w:rPr>
+          <w:i/>
+          <w:iCs/>
+          <w:color w:val="6B7280"/>
+          <w:sz w:val="18"/>
+          <w:szCs w:val="18"/>
+        </w:rPr>
+        <w:t xml:space="preserve">Flex: Drawing the plan can be set as independent work from the workbook; the modelling and the partner check stay in-person.</w:t>
+      </w:r>
+    </w:p>
+    <w:p>
+      <w:pPr>
+        <w:spacing w:after="40" w:before="200"/>
+      </w:pPr>
+      <w:r>
+        <w:rPr>
+          <w:b/>
+          <w:bCs/>
+          <w:color w:val="041E42"/>
+          <w:sz w:val="26"/>
+          <w:szCs w:val="26"/>
+        </w:rPr>
+        <w:t xml:space="preserve">Session 2 — Manage your time and what matters</w:t>
+      </w:r>
+    </w:p>
+    <w:p>
+      <w:pPr>
+        <w:spacing w:after="80"/>
+      </w:pPr>
+      <w:r>
+        <w:rPr>
+          <w:b/>
+          <w:bCs/>
+          <w:color w:val="3F8291"/>
+          <w:sz w:val="18"/>
+          <w:szCs w:val="18"/>
+        </w:rPr>
+        <w:t xml:space="preserve">1h in-person · 30 min independent</w:t>
+      </w:r>
+    </w:p>
+    <w:tbl>
+      <w:tblPr>
+        <w:tblW w:type="pct" w:w="100%"/>
+        <w:tblBorders>
+          <w:top w:val="none" w:color="FFFFFF" w:sz="0"/>
+          <w:left w:val="none" w:color="FFFFFF" w:sz="0"/>
+          <w:bottom w:val="none" w:color="FFFFFF" w:sz="0"/>
+          <w:right w:val="none" w:color="FFFFFF" w:sz="0"/>
+          <w:insideH w:val="none" w:color="FFFFFF" w:sz="0"/>
+          <w:insideV w:val="none" w:color="FFFFFF" w:sz="0"/>
+        </w:tblBorders>
+      </w:tblPr>
+      <w:tblGrid>
+        <w:gridCol w:w="100"/>
+      </w:tblGrid>
+      <w:tr>
+        <w:tc>
+          <w:tcPr>
+            <w:shd w:fill="FBEFE0" w:color="auto" w:val="clear"/>
+            <w:tcMar>
+              <w:top w:type="dxa" w:w="90"/>
+              <w:left w:type="dxa" w:w="140"/>
+              <w:bottom w:type="dxa" w:w="90"/>
+              <w:right w:type="dxa" w:w="140"/>
+            </w:tcMar>
+          </w:tcPr>
+          <w:p>
+            <w:pPr>
+              <w:spacing w:after="40"/>
+            </w:pPr>
+            <w:r>
+              <w:rPr>
+                <w:b/>
+                <w:bCs/>
+                <w:color w:val="EF9600"/>
+                <w:spacing w:val="30"/>
+                <w:sz w:val="15"/>
+                <w:szCs w:val="15"/>
+              </w:rPr>
+              <w:t xml:space="preserve">THE ONE THING TO GET RIGHT</w:t>
+            </w:r>
+          </w:p>
+          <w:p>
+            <w:r>
+              <w:rPr>
+                <w:color w:val="041E42"/>
+                <w:sz w:val="21"/>
+                <w:szCs w:val="21"/>
+              </w:rPr>
+              <w:t xml:space="preserve">Between-session progress is where goals are reached or quietly abandoned, and time decides which. The one thing to get right is that plans are honest about the learner's real life: study competes with family, work, caring and much else, and a plan that ignores that fails in the first week and leaves the learner feeling they are the problem. Aim for one small, protected slot a learner can truly keep, not an ambitious timetable. Say aloud that protecting rest is part of the plan, not a reward for finishing it. Resist making anyone feel they should have more time than they do.</w:t>
+            </w:r>
+          </w:p>
+        </w:tc>
+      </w:tr>
+    </w:tbl>
+    <w:p>
+      <w:pPr>
+        <w:spacing w:after="40" w:before="160"/>
+      </w:pPr>
+      <w:r>
+        <w:rPr>
+          <w:b/>
+          <w:bCs/>
+          <w:color w:val="004976"/>
+          <w:spacing w:val="30"/>
+          <w:sz w:val="17"/>
+          <w:szCs w:val="17"/>
+        </w:rPr>
+        <w:t xml:space="preserve">PREPARE</w:t>
+      </w:r>
+    </w:p>
+    <w:p>
+      <w:pPr>
+        <w:pStyle w:val="ListParagraph"/>
+        <w:numPr>
+          <w:ilvl w:val="0"/>
+          <w:numId w:val="1"/>
+        </w:numPr>
+        <w:spacing w:after="40"/>
+      </w:pPr>
+      <w:r>
+        <w:rPr>
+          <w:color w:val="041E42"/>
+          <w:sz w:val="21"/>
+          <w:szCs w:val="21"/>
+        </w:rPr>
+        <w:t xml:space="preserve">The student workbook (a week-strip of seven day-boxes to mark with simple pictures).</w:t>
+      </w:r>
+    </w:p>
+    <w:p>
+      <w:pPr>
+        <w:pStyle w:val="ListParagraph"/>
+        <w:numPr>
+          <w:ilvl w:val="0"/>
+          <w:numId w:val="1"/>
+        </w:numPr>
+        <w:spacing w:after="40"/>
+      </w:pPr>
+      <w:r>
+        <w:rPr>
+          <w:color w:val="041E42"/>
+          <w:sz w:val="21"/>
+          <w:szCs w:val="21"/>
+        </w:rPr>
+        <w:t xml:space="preserve">Small stones or caps to lay on the day-boxes for fixed duties and for the one protected slot, so no writing is needed.</w:t>
+      </w:r>
+    </w:p>
+    <w:p>
+      <w:pPr>
+        <w:pStyle w:val="ListParagraph"/>
+        <w:numPr>
+          <w:ilvl w:val="0"/>
+          <w:numId w:val="1"/>
+        </w:numPr>
+        <w:spacing w:after="40"/>
+      </w:pPr>
+      <w:r>
+        <w:rPr>
+          <w:color w:val="041E42"/>
+          <w:sz w:val="21"/>
+          <w:szCs w:val="21"/>
+        </w:rPr>
+        <w:t xml:space="preserve">Your own honest example of a busy week with one protected slot marked in it, to draw and model before learners plan.</w:t>
+      </w:r>
+    </w:p>
+    <w:p>
+      <w:pPr>
+        <w:pStyle w:val="ListParagraph"/>
+        <w:numPr>
+          <w:ilvl w:val="0"/>
+          <w:numId w:val="1"/>
+        </w:numPr>
+        <w:spacing w:after="40"/>
+      </w:pPr>
+      <w:r>
+        <w:rPr>
+          <w:color w:val="041E42"/>
+          <w:sz w:val="21"/>
+          <w:szCs w:val="21"/>
+        </w:rPr>
+        <w:t xml:space="preserve">Sensitivity: a real week can expose caring loads, work, or hardship at home. Let learners keep the details private, share only a general shape, and never require anyone to explain why a day is full.</w:t>
+      </w:r>
+    </w:p>
+    <w:p>
+      <w:pPr>
+        <w:spacing w:after="40" w:before="140"/>
+      </w:pPr>
+      <w:r>
+        <w:rPr>
+          <w:b/>
+          <w:bCs/>
+          <w:color w:val="004976"/>
+          <w:sz w:val="22"/>
+          <w:szCs w:val="22"/>
+        </w:rPr>
+        <w:t xml:space="preserve">1. Map a normal week honestly, in pictures</w:t>
+      </w:r>
+      <w:r>
+        <w:rPr>
+          <w:color w:val="97999B"/>
+          <w:sz w:val="17"/>
+          <w:szCs w:val="17"/>
+        </w:rPr>
+        <w:t xml:space="preserve">   14-16 min</w:t>
+      </w:r>
+    </w:p>
+    <w:p>
+      <w:pPr>
+        <w:spacing w:after="80"/>
+      </w:pPr>
+      <w:r>
+        <w:rPr>
+          <w:color w:val="041E42"/>
+          <w:sz w:val="21"/>
+          <w:szCs w:val="21"/>
+        </w:rPr>
+        <w:t xml:space="preserve">Have learners map a normal week as it really is: the fixed things first (family, work, caring, fetching water, prayer, rest), then the gaps that are left. Say aloud that the point is to see the real shape of the week before planning any study into it. Draw your own busy week first so no one feels theirs is too full to admit. Keep it quick and concrete; a rough picture-strip is enough.</w:t>
+      </w:r>
+    </w:p>
+    <w:p>
+      <w:pPr>
+        <w:spacing w:after="20"/>
+      </w:pPr>
+      <w:r>
+        <w:rPr>
+          <w:b/>
+          <w:bCs/>
+          <w:color w:val="8F993E"/>
+          <w:sz w:val="18"/>
+          <w:szCs w:val="18"/>
+        </w:rPr>
+        <w:t xml:space="preserve">Ask:</w:t>
+      </w:r>
+    </w:p>
+    <w:p>
+      <w:pPr>
+        <w:pStyle w:val="ListParagraph"/>
+        <w:numPr>
+          <w:ilvl w:val="0"/>
+          <w:numId w:val="1"/>
+        </w:numPr>
+        <w:spacing w:after="20"/>
+      </w:pPr>
+      <w:r>
+        <w:rPr>
+          <w:color w:val="041E42"/>
+          <w:sz w:val="20"/>
+          <w:szCs w:val="20"/>
+        </w:rPr>
+        <w:t xml:space="preserve">What are the fixed things in your week that you cannot move?</w:t>
+      </w:r>
+    </w:p>
+    <w:p>
+      <w:pPr>
+        <w:pStyle w:val="ListParagraph"/>
+        <w:numPr>
+          <w:ilvl w:val="0"/>
+          <w:numId w:val="1"/>
+        </w:numPr>
+        <w:spacing w:after="20"/>
+      </w:pPr>
+      <w:r>
+        <w:rPr>
+          <w:color w:val="041E42"/>
+          <w:sz w:val="20"/>
+          <w:szCs w:val="20"/>
+        </w:rPr>
+        <w:t xml:space="preserve">Where in a normal week do you actually have a little time that is your own?</w:t>
+      </w:r>
+    </w:p>
+    <w:p>
+      <w:pPr>
+        <w:pStyle w:val="ListParagraph"/>
+        <w:numPr>
+          <w:ilvl w:val="0"/>
+          <w:numId w:val="1"/>
+        </w:numPr>
+        <w:spacing w:after="20"/>
+      </w:pPr>
+      <w:r>
+        <w:rPr>
+          <w:color w:val="041E42"/>
+          <w:sz w:val="20"/>
+          <w:szCs w:val="20"/>
+        </w:rPr>
+        <w:t xml:space="preserve">What tends to eat the time you thought you had?</w:t>
+      </w:r>
+    </w:p>
+    <w:p>
+      <w:pPr>
+        <w:spacing w:after="20" w:before="40"/>
+      </w:pPr>
+      <w:r>
+        <w:rPr>
+          <w:b/>
+          <w:bCs/>
+          <w:color w:val="BD472A"/>
+          <w:sz w:val="18"/>
+          <w:szCs w:val="18"/>
+        </w:rPr>
+        <w:t xml:space="preserve">Watch out:</w:t>
+      </w:r>
+    </w:p>
+    <w:p>
+      <w:pPr>
+        <w:pStyle w:val="ListParagraph"/>
+        <w:numPr>
+          <w:ilvl w:val="0"/>
+          <w:numId w:val="1"/>
+        </w:numPr>
+        <w:spacing w:after="20"/>
+      </w:pPr>
+      <w:r>
+        <w:rPr>
+          <w:color w:val="041E42"/>
+          <w:sz w:val="20"/>
+          <w:szCs w:val="20"/>
+        </w:rPr>
+        <w:t xml:space="preserve">Learners map an ideal week rather than a real one; ask about last week specifically, not a typical week, since the real week is where the honest gaps and pressures show up.</w:t>
+      </w:r>
+    </w:p>
+    <w:p>
+      <w:pPr>
+        <w:spacing w:after="40" w:before="20"/>
+      </w:pPr>
+      <w:r>
+        <w:rPr>
+          <w:i/>
+          <w:iCs/>
+          <w:color w:val="6B7280"/>
+          <w:sz w:val="18"/>
+          <w:szCs w:val="18"/>
+        </w:rPr>
+        <w:t xml:space="preserve">If low-resource: With no planner or device, lay a stone on each day-box for a fixed duty, or count the days on fingers and say them aloud. The honest picture matters more than the format.</w:t>
+      </w:r>
+    </w:p>
+    <w:p>
+      <w:pPr>
+        <w:spacing w:after="40" w:before="140"/>
+      </w:pPr>
+      <w:r>
+        <w:rPr>
+          <w:b/>
+          <w:bCs/>
+          <w:color w:val="004976"/>
+          <w:sz w:val="22"/>
+          <w:szCs w:val="22"/>
+        </w:rPr>
+        <w:t xml:space="preserve">2. Protect one small, realistic slot</w:t>
+      </w:r>
+      <w:r>
+        <w:rPr>
+          <w:color w:val="97999B"/>
+          <w:sz w:val="17"/>
+          <w:szCs w:val="17"/>
+        </w:rPr>
+        <w:t xml:space="preserve">   14-16 min</w:t>
+      </w:r>
+    </w:p>
+    <w:p>
+      <w:pPr>
+        <w:spacing w:after="80"/>
+      </w:pPr>
+      <w:r>
+        <w:rPr>
+          <w:color w:val="041E42"/>
+          <w:sz w:val="21"/>
+          <w:szCs w:val="21"/>
+        </w:rPr>
+        <w:t xml:space="preserve">Ask each learner to choose one small slot in their real week, as little as twenty or thirty minutes, that they can genuinely protect for working towards their goal. Steer them away from grand timetables towards one slot they can actually keep. Have them mark where it sits, say what might threaten it, and how they will guard it. Say aloud that one kept slot beats five hopeful ones that never happen.</w:t>
+      </w:r>
+    </w:p>
+    <w:p>
+      <w:pPr>
+        <w:spacing w:after="20"/>
+      </w:pPr>
+      <w:r>
+        <w:rPr>
+          <w:b/>
+          <w:bCs/>
+          <w:color w:val="8F993E"/>
+          <w:sz w:val="18"/>
+          <w:szCs w:val="18"/>
+        </w:rPr>
+        <w:t xml:space="preserve">Ask:</w:t>
+      </w:r>
+    </w:p>
+    <w:p>
+      <w:pPr>
+        <w:pStyle w:val="ListParagraph"/>
+        <w:numPr>
+          <w:ilvl w:val="0"/>
+          <w:numId w:val="1"/>
+        </w:numPr>
+        <w:spacing w:after="20"/>
+      </w:pPr>
+      <w:r>
+        <w:rPr>
+          <w:color w:val="041E42"/>
+          <w:sz w:val="20"/>
+          <w:szCs w:val="20"/>
+        </w:rPr>
+        <w:t xml:space="preserve">Which one slot could you realistically protect for your goal this week?</w:t>
+      </w:r>
+    </w:p>
+    <w:p>
+      <w:pPr>
+        <w:pStyle w:val="ListParagraph"/>
+        <w:numPr>
+          <w:ilvl w:val="0"/>
+          <w:numId w:val="1"/>
+        </w:numPr>
+        <w:spacing w:after="20"/>
+      </w:pPr>
+      <w:r>
+        <w:rPr>
+          <w:color w:val="041E42"/>
+          <w:sz w:val="20"/>
+          <w:szCs w:val="20"/>
+        </w:rPr>
+        <w:t xml:space="preserve">What is most likely to steal that slot, and how could you guard it?</w:t>
+      </w:r>
+    </w:p>
+    <w:p>
+      <w:pPr>
+        <w:pStyle w:val="ListParagraph"/>
+        <w:numPr>
+          <w:ilvl w:val="0"/>
+          <w:numId w:val="1"/>
+        </w:numPr>
+        <w:spacing w:after="20"/>
+      </w:pPr>
+      <w:r>
+        <w:rPr>
+          <w:color w:val="041E42"/>
+          <w:sz w:val="20"/>
+          <w:szCs w:val="20"/>
+        </w:rPr>
+        <w:t xml:space="preserve">Is this slot small enough that you could keep it even in a hard week?</w:t>
+      </w:r>
+    </w:p>
+    <w:p>
+      <w:pPr>
+        <w:spacing w:after="20" w:before="40"/>
+      </w:pPr>
+      <w:r>
+        <w:rPr>
+          <w:b/>
+          <w:bCs/>
+          <w:color w:val="BD472A"/>
+          <w:sz w:val="18"/>
+          <w:szCs w:val="18"/>
+        </w:rPr>
+        <w:t xml:space="preserve">Watch out:</w:t>
+      </w:r>
+    </w:p>
+    <w:p>
+      <w:pPr>
+        <w:pStyle w:val="ListParagraph"/>
+        <w:numPr>
+          <w:ilvl w:val="0"/>
+          <w:numId w:val="1"/>
+        </w:numPr>
+        <w:spacing w:after="20"/>
+      </w:pPr>
+      <w:r>
+        <w:rPr>
+          <w:color w:val="041E42"/>
+          <w:sz w:val="20"/>
+          <w:szCs w:val="20"/>
+        </w:rPr>
+        <w:t xml:space="preserve">A learner marks several hours they will not keep; push for one small, protected slot, because a plan that assumes a good week collapses the moment the week is ordinary.</w:t>
+      </w:r>
+    </w:p>
+    <w:p>
+      <w:pPr>
+        <w:spacing w:after="40" w:before="20"/>
+      </w:pPr>
+      <w:r>
+        <w:rPr>
+          <w:i/>
+          <w:iCs/>
+          <w:color w:val="6B7280"/>
+          <w:sz w:val="18"/>
+          <w:szCs w:val="18"/>
+        </w:rPr>
+        <w:t xml:space="preserve">If low-resource: A single bright stone or cap laid on one day-box marks the protected slot clearly, and can be moved if the week changes, without any writing.</w:t>
+      </w:r>
+    </w:p>
+    <w:p>
+      <w:pPr>
+        <w:spacing w:after="40" w:before="140"/>
+      </w:pPr>
+      <w:r>
+        <w:rPr>
+          <w:b/>
+          <w:bCs/>
+          <w:color w:val="004976"/>
+          <w:sz w:val="22"/>
+          <w:szCs w:val="22"/>
+        </w:rPr>
+        <w:t xml:space="preserve">3. Match the next step to the slot, then plan for a hard week</w:t>
+      </w:r>
+      <w:r>
+        <w:rPr>
+          <w:color w:val="97999B"/>
+          <w:sz w:val="17"/>
+          <w:szCs w:val="17"/>
+        </w:rPr>
+        <w:t xml:space="preserve">   14-16 min</w:t>
+      </w:r>
+    </w:p>
+    <w:p>
+      <w:pPr>
+        <w:spacing w:after="80"/>
+      </w:pPr>
+      <w:r>
+        <w:rPr>
+          <w:color w:val="041E42"/>
+          <w:sz w:val="21"/>
+          <w:szCs w:val="21"/>
+        </w:rPr>
+        <w:t xml:space="preserve">Have learners choose the one next step towards their goal that actually fits the slot they protected, not the biggest step they wish they could take. Then plan for the week going wrong: say aloud, in advance, what they will drop or shrink if time runs short, so a hard week costs them progress rather than their wellbeing or confidence. Finish by pairing learners to test each other's plans in same-gender pairs.</w:t>
+      </w:r>
+    </w:p>
+    <w:p>
+      <w:pPr>
+        <w:spacing w:after="20"/>
+      </w:pPr>
+      <w:r>
+        <w:rPr>
+          <w:b/>
+          <w:bCs/>
+          <w:color w:val="8F993E"/>
+          <w:sz w:val="18"/>
+          <w:szCs w:val="18"/>
+        </w:rPr>
+        <w:t xml:space="preserve">Ask:</w:t>
+      </w:r>
+    </w:p>
+    <w:p>
+      <w:pPr>
+        <w:pStyle w:val="ListParagraph"/>
+        <w:numPr>
+          <w:ilvl w:val="0"/>
+          <w:numId w:val="1"/>
+        </w:numPr>
+        <w:spacing w:after="20"/>
+      </w:pPr>
+      <w:r>
+        <w:rPr>
+          <w:color w:val="041E42"/>
+          <w:sz w:val="20"/>
+          <w:szCs w:val="20"/>
+        </w:rPr>
+        <w:t xml:space="preserve">What is one step towards your goal that genuinely fits the time you have protected?</w:t>
+      </w:r>
+    </w:p>
+    <w:p>
+      <w:pPr>
+        <w:pStyle w:val="ListParagraph"/>
+        <w:numPr>
+          <w:ilvl w:val="0"/>
+          <w:numId w:val="1"/>
+        </w:numPr>
+        <w:spacing w:after="20"/>
+      </w:pPr>
+      <w:r>
+        <w:rPr>
+          <w:color w:val="041E42"/>
+          <w:sz w:val="20"/>
+          <w:szCs w:val="20"/>
+        </w:rPr>
+        <w:t xml:space="preserve">If this week gets hard, what will you do instead of giving up completely?</w:t>
+      </w:r>
+    </w:p>
+    <w:p>
+      <w:pPr>
+        <w:pStyle w:val="ListParagraph"/>
+        <w:numPr>
+          <w:ilvl w:val="0"/>
+          <w:numId w:val="1"/>
+        </w:numPr>
+        <w:spacing w:after="20"/>
+      </w:pPr>
+      <w:r>
+        <w:rPr>
+          <w:color w:val="041E42"/>
+          <w:sz w:val="20"/>
+          <w:szCs w:val="20"/>
+        </w:rPr>
+        <w:t xml:space="preserve">What is the smallest version of this step that would still count as progress?</w:t>
+      </w:r>
+    </w:p>
+    <w:p>
+      <w:pPr>
+        <w:spacing w:after="20" w:before="40"/>
+      </w:pPr>
+      <w:r>
+        <w:rPr>
+          <w:b/>
+          <w:bCs/>
+          <w:color w:val="BD472A"/>
+          <w:sz w:val="18"/>
+          <w:szCs w:val="18"/>
+        </w:rPr>
+        <w:t xml:space="preserve">Watch out:</w:t>
+      </w:r>
+    </w:p>
+    <w:p>
+      <w:pPr>
+        <w:pStyle w:val="ListParagraph"/>
+        <w:numPr>
+          <w:ilvl w:val="0"/>
+          <w:numId w:val="1"/>
+        </w:numPr>
+        <w:spacing w:after="20"/>
+      </w:pPr>
+      <w:r>
+        <w:rPr>
+          <w:color w:val="041E42"/>
+          <w:sz w:val="20"/>
+          <w:szCs w:val="20"/>
+        </w:rPr>
+        <w:t xml:space="preserve">Learners treat a missed week as failure and stop; say clearly, in advance, that a smaller step, or picking the slot back up next week, is the plan working, not the plan breaking.</w:t>
+      </w:r>
+    </w:p>
+    <w:p>
+      <w:pPr>
+        <w:spacing w:after="40" w:before="20"/>
+      </w:pPr>
+      <w:r>
+        <w:rPr>
+          <w:i/>
+          <w:iCs/>
+          <w:color w:val="6B7280"/>
+          <w:sz w:val="18"/>
+          <w:szCs w:val="18"/>
+        </w:rPr>
+        <w:t xml:space="preserve">If low-resource: If pairing is hard in stop-start attendance, the facilitator plays the partner and asks each learner aloud what would really threaten their slot.</w:t>
+      </w:r>
+    </w:p>
+    <w:p>
+      <w:pPr>
+        <w:spacing w:after="40" w:before="160"/>
+      </w:pPr>
+      <w:r>
+        <w:rPr>
+          <w:b/>
+          <w:bCs/>
+          <w:color w:val="004976"/>
+          <w:spacing w:val="30"/>
+          <w:sz w:val="17"/>
+          <w:szCs w:val="17"/>
+        </w:rPr>
+        <w:t xml:space="preserve">CLOSING</w:t>
+      </w:r>
+    </w:p>
+    <w:p>
+      <w:pPr>
+        <w:spacing w:after="80"/>
+      </w:pPr>
+      <w:r>
+        <w:rPr>
+          <w:color w:val="041E42"/>
+          <w:sz w:val="21"/>
+          <w:szCs w:val="21"/>
+        </w:rPr>
+        <w:t xml:space="preserve">Ask two or three learners to say their protected slot and first step aloud, and one thing they will drop if the week gets hard. Say that the plan lives in their workbook and is meant to be adjusted, not obeyed. Remind them that protecting time and wellbeing is a skill they are practising, and that a small step kept every week beats a big plan kept for none. Independent task: keep your slot once this week, then mark in the workbook whether it happened and what threatened it.</w:t>
+      </w:r>
+    </w:p>
+    <w:tbl>
+      <w:tblPr>
+        <w:tblW w:type="pct" w:w="100%"/>
+        <w:tblBorders>
+          <w:top w:val="none" w:color="FFFFFF" w:sz="0"/>
+          <w:left w:val="none" w:color="FFFFFF" w:sz="0"/>
+          <w:bottom w:val="none" w:color="FFFFFF" w:sz="0"/>
+          <w:right w:val="none" w:color="FFFFFF" w:sz="0"/>
+          <w:insideH w:val="none" w:color="FFFFFF" w:sz="0"/>
+          <w:insideV w:val="none" w:color="FFFFFF" w:sz="0"/>
+        </w:tblBorders>
+      </w:tblPr>
+      <w:tblGrid>
+        <w:gridCol w:w="100"/>
+      </w:tblGrid>
+      <w:tr>
+        <w:tc>
+          <w:tcPr>
+            <w:shd w:fill="E1EEF1" w:color="auto" w:val="clear"/>
+            <w:tcMar>
+              <w:top w:type="dxa" w:w="90"/>
+              <w:left w:type="dxa" w:w="140"/>
+              <w:bottom w:type="dxa" w:w="90"/>
+              <w:right w:type="dxa" w:w="140"/>
+            </w:tcMar>
+          </w:tcPr>
+          <w:p>
+            <w:pPr>
+              <w:spacing w:after="40"/>
+            </w:pPr>
+            <w:r>
+              <w:rPr>
+                <w:b/>
+                <w:bCs/>
+                <w:color w:val="3F8291"/>
+                <w:spacing w:val="30"/>
+                <w:sz w:val="15"/>
+                <w:szCs w:val="15"/>
+              </w:rPr>
+              <w:t xml:space="preserve">INDEPENDENT TASK (30 MIN)</w:t>
+            </w:r>
+          </w:p>
+          <w:p>
+            <w:r>
+              <w:rPr>
+                <w:color w:val="041E42"/>
+                <w:sz w:val="21"/>
+                <w:szCs w:val="21"/>
+              </w:rPr>
+              <w:t xml:space="preserve">For a few days, do your most important learning thing first, before the easier things.</w:t>
+            </w:r>
+          </w:p>
+        </w:tc>
+      </w:tr>
+    </w:tbl>
+    <w:p>
+      <w:pPr>
+        <w:spacing w:after="80" w:before="40"/>
+      </w:pPr>
+      <w:r>
+        <w:rPr>
+          <w:i/>
+          <w:iCs/>
+          <w:color w:val="6B7280"/>
+          <w:sz w:val="18"/>
+          <w:szCs w:val="18"/>
+        </w:rPr>
+        <w:t xml:space="preserve">Flex: The sorting of what matters most is best done in-person; trying the routine is the independent practice.</w:t>
+      </w:r>
+    </w:p>
+    <w:p>
+      <w:pPr>
+        <w:spacing w:after="40" w:before="200"/>
+      </w:pPr>
+      <w:r>
+        <w:rPr>
+          <w:b/>
+          <w:bCs/>
+          <w:color w:val="041E42"/>
+          <w:sz w:val="26"/>
+          <w:szCs w:val="26"/>
+        </w:rPr>
+        <w:t xml:space="preserve">Session 3 — Find help and resources</w:t>
+      </w:r>
+    </w:p>
+    <w:p>
+      <w:pPr>
+        <w:spacing w:after="80"/>
+      </w:pPr>
+      <w:r>
+        <w:rPr>
+          <w:b/>
+          <w:bCs/>
+          <w:color w:val="3F8291"/>
+          <w:sz w:val="18"/>
+          <w:szCs w:val="18"/>
+        </w:rPr>
+        <w:t xml:space="preserve">1h in-person · 1h independent</w:t>
+      </w:r>
+    </w:p>
+    <w:tbl>
+      <w:tblPr>
+        <w:tblW w:type="pct" w:w="100%"/>
+        <w:tblBorders>
+          <w:top w:val="none" w:color="FFFFFF" w:sz="0"/>
+          <w:left w:val="none" w:color="FFFFFF" w:sz="0"/>
+          <w:bottom w:val="none" w:color="FFFFFF" w:sz="0"/>
+          <w:right w:val="none" w:color="FFFFFF" w:sz="0"/>
+          <w:insideH w:val="none" w:color="FFFFFF" w:sz="0"/>
+          <w:insideV w:val="none" w:color="FFFFFF" w:sz="0"/>
+        </w:tblBorders>
+      </w:tblPr>
+      <w:tblGrid>
+        <w:gridCol w:w="100"/>
+      </w:tblGrid>
+      <w:tr>
+        <w:tc>
+          <w:tcPr>
+            <w:shd w:fill="FBEFE0" w:color="auto" w:val="clear"/>
+            <w:tcMar>
+              <w:top w:type="dxa" w:w="90"/>
+              <w:left w:type="dxa" w:w="140"/>
+              <w:bottom w:type="dxa" w:w="90"/>
+              <w:right w:type="dxa" w:w="140"/>
+            </w:tcMar>
+          </w:tcPr>
+          <w:p>
+            <w:pPr>
+              <w:spacing w:after="40"/>
+            </w:pPr>
+            <w:r>
+              <w:rPr>
+                <w:b/>
+                <w:bCs/>
+                <w:color w:val="EF9600"/>
+                <w:spacing w:val="30"/>
+                <w:sz w:val="15"/>
+                <w:szCs w:val="15"/>
+              </w:rPr>
+              <w:t xml:space="preserve">THE ONE THING TO GET RIGHT</w:t>
+            </w:r>
+          </w:p>
+          <w:p>
+            <w:r>
+              <w:rPr>
+                <w:color w:val="041E42"/>
+                <w:sz w:val="21"/>
+                <w:szCs w:val="21"/>
+              </w:rPr>
+              <w:t xml:space="preserve">Learners often treat a goal as something they must reach alone, and so stall. The one thing to get right is the shift from what do I know to who and what could help me, and then the courage to ask. Keep the focus on help that is genuinely reachable in the camp, not an ideal list they can never use, and keep every suggested helper safe and appropriate for the learner. The most valuable help in the room is usually the room itself, so protect the pooling step. Your job is to help learners find and approach help, not to supply it for them.</w:t>
+            </w:r>
+          </w:p>
+        </w:tc>
+      </w:tr>
+    </w:tbl>
+    <w:p>
+      <w:pPr>
+        <w:spacing w:after="40" w:before="160"/>
+      </w:pPr>
+      <w:r>
+        <w:rPr>
+          <w:b/>
+          <w:bCs/>
+          <w:color w:val="004976"/>
+          <w:spacing w:val="30"/>
+          <w:sz w:val="17"/>
+          <w:szCs w:val="17"/>
+        </w:rPr>
+        <w:t xml:space="preserve">PREPARE</w:t>
+      </w:r>
+    </w:p>
+    <w:p>
+      <w:pPr>
+        <w:pStyle w:val="ListParagraph"/>
+        <w:numPr>
+          <w:ilvl w:val="0"/>
+          <w:numId w:val="1"/>
+        </w:numPr>
+        <w:spacing w:after="40"/>
+      </w:pPr>
+      <w:r>
+        <w:rPr>
+          <w:color w:val="041E42"/>
+          <w:sz w:val="21"/>
+          <w:szCs w:val="21"/>
+        </w:rPr>
+        <w:t xml:space="preserve">The student workbook (one goal-picture at the top and space to draw or place helpers around it).</w:t>
+      </w:r>
+    </w:p>
+    <w:p>
+      <w:pPr>
+        <w:pStyle w:val="ListParagraph"/>
+        <w:numPr>
+          <w:ilvl w:val="0"/>
+          <w:numId w:val="1"/>
+        </w:numPr>
+        <w:spacing w:after="40"/>
+      </w:pPr>
+      <w:r>
+        <w:rPr>
+          <w:color w:val="041E42"/>
+          <w:sz w:val="21"/>
+          <w:szCs w:val="21"/>
+        </w:rPr>
+        <w:t xml:space="preserve">Small stones or caps and simple people-pictures (a friend, a teacher, a family member, a facility worker) to lay out and sort.</w:t>
+      </w:r>
+    </w:p>
+    <w:p>
+      <w:pPr>
+        <w:pStyle w:val="ListParagraph"/>
+        <w:numPr>
+          <w:ilvl w:val="0"/>
+          <w:numId w:val="1"/>
+        </w:numPr>
+        <w:spacing w:after="40"/>
+      </w:pPr>
+      <w:r>
+        <w:rPr>
+          <w:color w:val="041E42"/>
+          <w:sz w:val="21"/>
+          <w:szCs w:val="21"/>
+        </w:rPr>
+        <w:t xml:space="preserve">Your own honest example of a helper you sought out for a goal, and what you said to reach them, to model first.</w:t>
+      </w:r>
+    </w:p>
+    <w:p>
+      <w:pPr>
+        <w:pStyle w:val="ListParagraph"/>
+        <w:numPr>
+          <w:ilvl w:val="0"/>
+          <w:numId w:val="1"/>
+        </w:numPr>
+        <w:spacing w:after="40"/>
+      </w:pPr>
+      <w:r>
+        <w:rPr>
+          <w:color w:val="041E42"/>
+          <w:sz w:val="21"/>
+          <w:szCs w:val="21"/>
+        </w:rPr>
+        <w:t xml:space="preserve">Sensitivity: a goal, and who a learner can safely ask, can touch on family, gender and safety. Keep help within safe, same-gender or trusted reach, let learners keep details private, and never push anyone towards a contact that feels unsafe.</w:t>
+      </w:r>
+    </w:p>
+    <w:p>
+      <w:pPr>
+        <w:spacing w:after="40" w:before="140"/>
+      </w:pPr>
+      <w:r>
+        <w:rPr>
+          <w:b/>
+          <w:bCs/>
+          <w:color w:val="004976"/>
+          <w:sz w:val="22"/>
+          <w:szCs w:val="22"/>
+        </w:rPr>
+        <w:t xml:space="preserve">1. Name the goal help has to move forward</w:t>
+      </w:r>
+      <w:r>
+        <w:rPr>
+          <w:color w:val="97999B"/>
+          <w:sz w:val="17"/>
+          <w:szCs w:val="17"/>
+        </w:rPr>
+        <w:t xml:space="preserve">   8-10 min</w:t>
+      </w:r>
+    </w:p>
+    <w:p>
+      <w:pPr>
+        <w:spacing w:after="80"/>
+      </w:pPr>
+      <w:r>
+        <w:rPr>
+          <w:color w:val="041E42"/>
+          <w:sz w:val="21"/>
+          <w:szCs w:val="21"/>
+        </w:rPr>
+        <w:t xml:space="preserve">Have each learner choose one real goal they are working towards and draw or place it at the top of the page. Everything that follows is tied to this goal, so the map stays useful rather than vague. Give a quick spoken example of your own, then let them choose. Keep it brief: the point is to anchor the search for help in a specific aim, not to set a new goal.</w:t>
+      </w:r>
+    </w:p>
+    <w:p>
+      <w:pPr>
+        <w:spacing w:after="20"/>
+      </w:pPr>
+      <w:r>
+        <w:rPr>
+          <w:b/>
+          <w:bCs/>
+          <w:color w:val="8F993E"/>
+          <w:sz w:val="18"/>
+          <w:szCs w:val="18"/>
+        </w:rPr>
+        <w:t xml:space="preserve">Ask:</w:t>
+      </w:r>
+    </w:p>
+    <w:p>
+      <w:pPr>
+        <w:pStyle w:val="ListParagraph"/>
+        <w:numPr>
+          <w:ilvl w:val="0"/>
+          <w:numId w:val="1"/>
+        </w:numPr>
+        <w:spacing w:after="20"/>
+      </w:pPr>
+      <w:r>
+        <w:rPr>
+          <w:color w:val="041E42"/>
+          <w:sz w:val="20"/>
+          <w:szCs w:val="20"/>
+        </w:rPr>
+        <w:t xml:space="preserve">Which goal do you most want help moving forward right now?</w:t>
+      </w:r>
+    </w:p>
+    <w:p>
+      <w:pPr>
+        <w:pStyle w:val="ListParagraph"/>
+        <w:numPr>
+          <w:ilvl w:val="0"/>
+          <w:numId w:val="1"/>
+        </w:numPr>
+        <w:spacing w:after="20"/>
+      </w:pPr>
+      <w:r>
+        <w:rPr>
+          <w:color w:val="041E42"/>
+          <w:sz w:val="20"/>
+          <w:szCs w:val="20"/>
+        </w:rPr>
+        <w:t xml:space="preserve">What has made this goal hard to progress on your own?</w:t>
+      </w:r>
+    </w:p>
+    <w:p>
+      <w:pPr>
+        <w:pStyle w:val="ListParagraph"/>
+        <w:numPr>
+          <w:ilvl w:val="0"/>
+          <w:numId w:val="1"/>
+        </w:numPr>
+        <w:spacing w:after="20"/>
+      </w:pPr>
+      <w:r>
+        <w:rPr>
+          <w:color w:val="041E42"/>
+          <w:sz w:val="20"/>
+          <w:szCs w:val="20"/>
+        </w:rPr>
+        <w:t xml:space="preserve">What would getting help with this actually change for you?</w:t>
+      </w:r>
+    </w:p>
+    <w:p>
+      <w:pPr>
+        <w:spacing w:after="20" w:before="40"/>
+      </w:pPr>
+      <w:r>
+        <w:rPr>
+          <w:b/>
+          <w:bCs/>
+          <w:color w:val="BD472A"/>
+          <w:sz w:val="18"/>
+          <w:szCs w:val="18"/>
+        </w:rPr>
+        <w:t xml:space="preserve">Watch out:</w:t>
+      </w:r>
+    </w:p>
+    <w:p>
+      <w:pPr>
+        <w:pStyle w:val="ListParagraph"/>
+        <w:numPr>
+          <w:ilvl w:val="0"/>
+          <w:numId w:val="1"/>
+        </w:numPr>
+        <w:spacing w:after="20"/>
+      </w:pPr>
+      <w:r>
+        <w:rPr>
+          <w:color w:val="041E42"/>
+          <w:sz w:val="20"/>
+          <w:szCs w:val="20"/>
+        </w:rPr>
+        <w:t xml:space="preserve">A learner picks a goal so vague that no helper fits it; steer them to a concrete, current goal, or borrow one from their earlier goal work so the mapping has something real to grip.</w:t>
+      </w:r>
+    </w:p>
+    <w:p>
+      <w:pPr>
+        <w:spacing w:after="40" w:before="20"/>
+      </w:pPr>
+      <w:r>
+        <w:rPr>
+          <w:i/>
+          <w:iCs/>
+          <w:color w:val="6B7280"/>
+          <w:sz w:val="18"/>
+          <w:szCs w:val="18"/>
+        </w:rPr>
+        <w:t xml:space="preserve">If low-resource: No device or writing is needed. A single goal-picture, or even the goal spoken aloud and held in mind, is enough to anchor the rest of the activity.</w:t>
+      </w:r>
+    </w:p>
+    <w:p>
+      <w:pPr>
+        <w:spacing w:after="40" w:before="140"/>
+      </w:pPr>
+      <w:r>
+        <w:rPr>
+          <w:b/>
+          <w:bCs/>
+          <w:color w:val="004976"/>
+          <w:sz w:val="22"/>
+          <w:szCs w:val="22"/>
+        </w:rPr>
+        <w:t xml:space="preserve">2. Map who and what could help</w:t>
+      </w:r>
+      <w:r>
+        <w:rPr>
+          <w:color w:val="97999B"/>
+          <w:sz w:val="17"/>
+          <w:szCs w:val="17"/>
+        </w:rPr>
+        <w:t xml:space="preserve">   14-16 min</w:t>
+      </w:r>
+    </w:p>
+    <w:p>
+      <w:pPr>
+        <w:spacing w:after="80"/>
+      </w:pPr>
+      <w:r>
+        <w:rPr>
+          <w:color w:val="041E42"/>
+          <w:sz w:val="21"/>
+          <w:szCs w:val="21"/>
+        </w:rPr>
+        <w:t xml:space="preserve">Give learners quiet time to map every possible source of help for that goal. Offer the people- pictures and say the types aloud so thinking goes wider than a teacher: mentors, peers, family, facility workers, neighbours, a local place, a tool, a printed book. Circulate and ask rather than tell. Push for many first; judging usefulness comes next. The aim is to break the belief that the learner is the only help they have.</w:t>
+      </w:r>
+    </w:p>
+    <w:p>
+      <w:pPr>
+        <w:spacing w:after="20"/>
+      </w:pPr>
+      <w:r>
+        <w:rPr>
+          <w:b/>
+          <w:bCs/>
+          <w:color w:val="8F993E"/>
+          <w:sz w:val="18"/>
+          <w:szCs w:val="18"/>
+        </w:rPr>
+        <w:t xml:space="preserve">Ask:</w:t>
+      </w:r>
+    </w:p>
+    <w:p>
+      <w:pPr>
+        <w:pStyle w:val="ListParagraph"/>
+        <w:numPr>
+          <w:ilvl w:val="0"/>
+          <w:numId w:val="1"/>
+        </w:numPr>
+        <w:spacing w:after="20"/>
+      </w:pPr>
+      <w:r>
+        <w:rPr>
+          <w:color w:val="041E42"/>
+          <w:sz w:val="20"/>
+          <w:szCs w:val="20"/>
+        </w:rPr>
+        <w:t xml:space="preserve">Who do you know, or know of, who has done something like this?</w:t>
+      </w:r>
+    </w:p>
+    <w:p>
+      <w:pPr>
+        <w:pStyle w:val="ListParagraph"/>
+        <w:numPr>
+          <w:ilvl w:val="0"/>
+          <w:numId w:val="1"/>
+        </w:numPr>
+        <w:spacing w:after="20"/>
+      </w:pPr>
+      <w:r>
+        <w:rPr>
+          <w:color w:val="041E42"/>
+          <w:sz w:val="20"/>
+          <w:szCs w:val="20"/>
+        </w:rPr>
+        <w:t xml:space="preserve">What places, workers, books or tools in the camp could help with this?</w:t>
+      </w:r>
+    </w:p>
+    <w:p>
+      <w:pPr>
+        <w:pStyle w:val="ListParagraph"/>
+        <w:numPr>
+          <w:ilvl w:val="0"/>
+          <w:numId w:val="1"/>
+        </w:numPr>
+        <w:spacing w:after="20"/>
+      </w:pPr>
+      <w:r>
+        <w:rPr>
+          <w:color w:val="041E42"/>
+          <w:sz w:val="20"/>
+          <w:szCs w:val="20"/>
+        </w:rPr>
+        <w:t xml:space="preserve">Where might you find help you have not thought to look for yet?</w:t>
+      </w:r>
+    </w:p>
+    <w:p>
+      <w:pPr>
+        <w:spacing w:after="20" w:before="40"/>
+      </w:pPr>
+      <w:r>
+        <w:rPr>
+          <w:b/>
+          <w:bCs/>
+          <w:color w:val="BD472A"/>
+          <w:sz w:val="18"/>
+          <w:szCs w:val="18"/>
+        </w:rPr>
+        <w:t xml:space="preserve">Watch out:</w:t>
+      </w:r>
+    </w:p>
+    <w:p>
+      <w:pPr>
+        <w:pStyle w:val="ListParagraph"/>
+        <w:numPr>
+          <w:ilvl w:val="0"/>
+          <w:numId w:val="1"/>
+        </w:numPr>
+        <w:spacing w:after="20"/>
+      </w:pPr>
+      <w:r>
+        <w:rPr>
+          <w:color w:val="041E42"/>
+          <w:sz w:val="20"/>
+          <w:szCs w:val="20"/>
+        </w:rPr>
+        <w:t xml:space="preserve">A learner names only people they already know well; prompt them gently towards facility workers, safe community members and places too, since useful help is often just outside their existing circle.</w:t>
+      </w:r>
+    </w:p>
+    <w:p>
+      <w:pPr>
+        <w:spacing w:after="40" w:before="20"/>
+      </w:pPr>
+      <w:r>
+        <w:rPr>
+          <w:i/>
+          <w:iCs/>
+          <w:color w:val="6B7280"/>
+          <w:sz w:val="18"/>
+          <w:szCs w:val="18"/>
+        </w:rPr>
+        <w:t xml:space="preserve">If low-resource: Lay a stone or a people-picture for each helper around the goal-picture, and scribe a name under it only if the learner asks. Focus the map on people, places and printed help reachable offline.</w:t>
+      </w:r>
+    </w:p>
+    <w:p>
+      <w:pPr>
+        <w:spacing w:after="40" w:before="140"/>
+      </w:pPr>
+      <w:r>
+        <w:rPr>
+          <w:b/>
+          <w:bCs/>
+          <w:color w:val="004976"/>
+          <w:sz w:val="22"/>
+          <w:szCs w:val="22"/>
+        </w:rPr>
+        <w:t xml:space="preserve">3. Sort your map by what is within reach</w:t>
+      </w:r>
+      <w:r>
+        <w:rPr>
+          <w:color w:val="97999B"/>
+          <w:sz w:val="17"/>
+          <w:szCs w:val="17"/>
+        </w:rPr>
+        <w:t xml:space="preserve">   12-14 min</w:t>
+      </w:r>
+    </w:p>
+    <w:p>
+      <w:pPr>
+        <w:spacing w:after="80"/>
+      </w:pPr>
+      <w:r>
+        <w:rPr>
+          <w:color w:val="041E42"/>
+          <w:sz w:val="21"/>
+          <w:szCs w:val="21"/>
+        </w:rPr>
+        <w:t xml:space="preserve">Have learners move the helpers into two groups: those they can genuinely reach now, and those they cannot. Say aloud that a far-off helper who will never answer is worth less than a friend down the path. Then pool in same-gender pairs or small groups: each learner shows their goal, and the others name helpers for it. This peer harvest is the engine of the activity, since someone almost always knows an option the learner missed.</w:t>
+      </w:r>
+    </w:p>
+    <w:p>
+      <w:pPr>
+        <w:spacing w:after="20"/>
+      </w:pPr>
+      <w:r>
+        <w:rPr>
+          <w:b/>
+          <w:bCs/>
+          <w:color w:val="8F993E"/>
+          <w:sz w:val="18"/>
+          <w:szCs w:val="18"/>
+        </w:rPr>
+        <w:t xml:space="preserve">Ask:</w:t>
+      </w:r>
+    </w:p>
+    <w:p>
+      <w:pPr>
+        <w:pStyle w:val="ListParagraph"/>
+        <w:numPr>
+          <w:ilvl w:val="0"/>
+          <w:numId w:val="1"/>
+        </w:numPr>
+        <w:spacing w:after="20"/>
+      </w:pPr>
+      <w:r>
+        <w:rPr>
+          <w:color w:val="041E42"/>
+          <w:sz w:val="20"/>
+          <w:szCs w:val="20"/>
+        </w:rPr>
+        <w:t xml:space="preserve">Which of these could you actually reach in the next week or two?</w:t>
+      </w:r>
+    </w:p>
+    <w:p>
+      <w:pPr>
+        <w:pStyle w:val="ListParagraph"/>
+        <w:numPr>
+          <w:ilvl w:val="0"/>
+          <w:numId w:val="1"/>
+        </w:numPr>
+        <w:spacing w:after="20"/>
+      </w:pPr>
+      <w:r>
+        <w:rPr>
+          <w:color w:val="041E42"/>
+          <w:sz w:val="20"/>
+          <w:szCs w:val="20"/>
+        </w:rPr>
+        <w:t xml:space="preserve">What is stopping you reaching the ones you set aside, and is that real or only assumed?</w:t>
+      </w:r>
+    </w:p>
+    <w:p>
+      <w:pPr>
+        <w:pStyle w:val="ListParagraph"/>
+        <w:numPr>
+          <w:ilvl w:val="0"/>
+          <w:numId w:val="1"/>
+        </w:numPr>
+        <w:spacing w:after="20"/>
+      </w:pPr>
+      <w:r>
+        <w:rPr>
+          <w:color w:val="041E42"/>
+          <w:sz w:val="20"/>
+          <w:szCs w:val="20"/>
+        </w:rPr>
+        <w:t xml:space="preserve">As you listen to each other: what helper comes to mind for their goal?</w:t>
+      </w:r>
+    </w:p>
+    <w:p>
+      <w:pPr>
+        <w:spacing w:after="20" w:before="40"/>
+      </w:pPr>
+      <w:r>
+        <w:rPr>
+          <w:b/>
+          <w:bCs/>
+          <w:color w:val="BD472A"/>
+          <w:sz w:val="18"/>
+          <w:szCs w:val="18"/>
+        </w:rPr>
+        <w:t xml:space="preserve">Watch out:</w:t>
+      </w:r>
+    </w:p>
+    <w:p>
+      <w:pPr>
+        <w:pStyle w:val="ListParagraph"/>
+        <w:numPr>
+          <w:ilvl w:val="0"/>
+          <w:numId w:val="1"/>
+        </w:numPr>
+        <w:spacing w:after="20"/>
+      </w:pPr>
+      <w:r>
+        <w:rPr>
+          <w:color w:val="041E42"/>
+          <w:sz w:val="20"/>
+          <w:szCs w:val="20"/>
+        </w:rPr>
+        <w:t xml:space="preserve">Learners dismiss reachable help as not for someone like me; name this gently and remind them that most people and workers here are more willing to help than we expect, and asking costs little.</w:t>
+      </w:r>
+    </w:p>
+    <w:p>
+      <w:pPr>
+        <w:spacing w:after="40" w:before="20"/>
+      </w:pPr>
+      <w:r>
+        <w:rPr>
+          <w:i/>
+          <w:iCs/>
+          <w:color w:val="6B7280"/>
+          <w:sz w:val="18"/>
+          <w:szCs w:val="18"/>
+        </w:rPr>
+        <w:t xml:space="preserve">If low-resource: Moving stones into a near pile and a far pile shows the sort with no writing, and the group can add a stone to a partner's near pile as they name new help.</w:t>
+      </w:r>
+    </w:p>
+    <w:p>
+      <w:pPr>
+        <w:spacing w:after="40" w:before="140"/>
+      </w:pPr>
+      <w:r>
+        <w:rPr>
+          <w:b/>
+          <w:bCs/>
+          <w:color w:val="004976"/>
+          <w:sz w:val="22"/>
+          <w:szCs w:val="22"/>
+        </w:rPr>
+        <w:t xml:space="preserve">4. Practise the ask and commit to one</w:t>
+      </w:r>
+      <w:r>
+        <w:rPr>
+          <w:color w:val="97999B"/>
+          <w:sz w:val="17"/>
+          <w:szCs w:val="17"/>
+        </w:rPr>
+        <w:t xml:space="preserve">   12-14 min</w:t>
+      </w:r>
+    </w:p>
+    <w:p>
+      <w:pPr>
+        <w:spacing w:after="80"/>
+      </w:pPr>
+      <w:r>
+        <w:rPr>
+          <w:color w:val="041E42"/>
+          <w:sz w:val="21"/>
+          <w:szCs w:val="21"/>
+        </w:rPr>
+        <w:t xml:space="preserve">Move from a map to an action. Reaching out is where most learners freeze, so have each learner say aloud how they would actually approach one helper: the words they would use to a person, or the first step to reach a place or worker. Let a same-gender pair rehearse one ask aloud. Close by having each learner commit to one specific, safe request they will make before the next session.</w:t>
+      </w:r>
+    </w:p>
+    <w:p>
+      <w:pPr>
+        <w:spacing w:after="20"/>
+      </w:pPr>
+      <w:r>
+        <w:rPr>
+          <w:b/>
+          <w:bCs/>
+          <w:color w:val="8F993E"/>
+          <w:sz w:val="18"/>
+          <w:szCs w:val="18"/>
+        </w:rPr>
+        <w:t xml:space="preserve">Ask:</w:t>
+      </w:r>
+    </w:p>
+    <w:p>
+      <w:pPr>
+        <w:pStyle w:val="ListParagraph"/>
+        <w:numPr>
+          <w:ilvl w:val="0"/>
+          <w:numId w:val="1"/>
+        </w:numPr>
+        <w:spacing w:after="20"/>
+      </w:pPr>
+      <w:r>
+        <w:rPr>
+          <w:color w:val="041E42"/>
+          <w:sz w:val="20"/>
+          <w:szCs w:val="20"/>
+        </w:rPr>
+        <w:t xml:space="preserve">What exactly would you say to ask this person, or to reach this place?</w:t>
+      </w:r>
+    </w:p>
+    <w:p>
+      <w:pPr>
+        <w:pStyle w:val="ListParagraph"/>
+        <w:numPr>
+          <w:ilvl w:val="0"/>
+          <w:numId w:val="1"/>
+        </w:numPr>
+        <w:spacing w:after="20"/>
+      </w:pPr>
+      <w:r>
+        <w:rPr>
+          <w:color w:val="041E42"/>
+          <w:sz w:val="20"/>
+          <w:szCs w:val="20"/>
+        </w:rPr>
+        <w:t xml:space="preserve">Which one request will you make before we next meet?</w:t>
+      </w:r>
+    </w:p>
+    <w:p>
+      <w:pPr>
+        <w:pStyle w:val="ListParagraph"/>
+        <w:numPr>
+          <w:ilvl w:val="0"/>
+          <w:numId w:val="1"/>
+        </w:numPr>
+        <w:spacing w:after="20"/>
+      </w:pPr>
+      <w:r>
+        <w:rPr>
+          <w:color w:val="041E42"/>
+          <w:sz w:val="20"/>
+          <w:szCs w:val="20"/>
+        </w:rPr>
+        <w:t xml:space="preserve">What is the smallest first step that gets you started today?</w:t>
+      </w:r>
+    </w:p>
+    <w:p>
+      <w:pPr>
+        <w:spacing w:after="20" w:before="40"/>
+      </w:pPr>
+      <w:r>
+        <w:rPr>
+          <w:b/>
+          <w:bCs/>
+          <w:color w:val="BD472A"/>
+          <w:sz w:val="18"/>
+          <w:szCs w:val="18"/>
+        </w:rPr>
+        <w:t xml:space="preserve">Watch out:</w:t>
+      </w:r>
+    </w:p>
+    <w:p>
+      <w:pPr>
+        <w:pStyle w:val="ListParagraph"/>
+        <w:numPr>
+          <w:ilvl w:val="0"/>
+          <w:numId w:val="1"/>
+        </w:numPr>
+        <w:spacing w:after="20"/>
+      </w:pPr>
+      <w:r>
+        <w:rPr>
+          <w:color w:val="041E42"/>
+          <w:sz w:val="20"/>
+          <w:szCs w:val="20"/>
+        </w:rPr>
+        <w:t xml:space="preserve">A learner leaves with a long map but no committed action; insist on one concrete, safe request with a name and a first line, so the map turns into an approach made rather than a plan admired.</w:t>
+      </w:r>
+    </w:p>
+    <w:p>
+      <w:pPr>
+        <w:spacing w:after="40" w:before="20"/>
+      </w:pPr>
+      <w:r>
+        <w:rPr>
+          <w:i/>
+          <w:iCs/>
+          <w:color w:val="6B7280"/>
+          <w:sz w:val="18"/>
+          <w:szCs w:val="18"/>
+        </w:rPr>
+        <w:t xml:space="preserve">If low-resource: With no paper, the ask is simply rehearsed aloud between partners, twice, until the words come easily; the facilitator can play the helper for a learner with no partner.</w:t>
+      </w:r>
+    </w:p>
+    <w:p>
+      <w:pPr>
+        <w:spacing w:after="40" w:before="160"/>
+      </w:pPr>
+      <w:r>
+        <w:rPr>
+          <w:b/>
+          <w:bCs/>
+          <w:color w:val="004976"/>
+          <w:spacing w:val="30"/>
+          <w:sz w:val="17"/>
+          <w:szCs w:val="17"/>
+        </w:rPr>
+        <w:t xml:space="preserve">CLOSING</w:t>
+      </w:r>
+    </w:p>
+    <w:p>
+      <w:pPr>
+        <w:spacing w:after="80"/>
+      </w:pPr>
+      <w:r>
+        <w:rPr>
+          <w:color w:val="041E42"/>
+          <w:sz w:val="21"/>
+          <w:szCs w:val="21"/>
+        </w:rPr>
+        <w:t xml:space="preserve">Ask two or three learners to say the one helper they will reach out to and how they will do it. Draw out how much help the room surfaced together that no one held alone. Remind learners that finding and asking for help is a skill they will use for every goal ahead, not just this one, and that the map lives in their workbook to add to as they go. Independent task: make your one request, then mark in the workbook what happened and how it felt to ask.</w:t>
+      </w:r>
+    </w:p>
+    <w:tbl>
+      <w:tblPr>
+        <w:tblW w:type="pct" w:w="100%"/>
+        <w:tblBorders>
+          <w:top w:val="none" w:color="FFFFFF" w:sz="0"/>
+          <w:left w:val="none" w:color="FFFFFF" w:sz="0"/>
+          <w:bottom w:val="none" w:color="FFFFFF" w:sz="0"/>
+          <w:right w:val="none" w:color="FFFFFF" w:sz="0"/>
+          <w:insideH w:val="none" w:color="FFFFFF" w:sz="0"/>
+          <w:insideV w:val="none" w:color="FFFFFF" w:sz="0"/>
+        </w:tblBorders>
+      </w:tblPr>
+      <w:tblGrid>
+        <w:gridCol w:w="100"/>
+      </w:tblGrid>
+      <w:tr>
+        <w:tc>
+          <w:tcPr>
+            <w:shd w:fill="E1EEF1" w:color="auto" w:val="clear"/>
+            <w:tcMar>
+              <w:top w:type="dxa" w:w="90"/>
+              <w:left w:type="dxa" w:w="140"/>
+              <w:bottom w:type="dxa" w:w="90"/>
+              <w:right w:type="dxa" w:w="140"/>
+            </w:tcMar>
+          </w:tcPr>
+          <w:p>
+            <w:pPr>
+              <w:spacing w:after="40"/>
+            </w:pPr>
+            <w:r>
+              <w:rPr>
+                <w:b/>
+                <w:bCs/>
+                <w:color w:val="3F8291"/>
+                <w:spacing w:val="30"/>
+                <w:sz w:val="15"/>
+                <w:szCs w:val="15"/>
+              </w:rPr>
+              <w:t xml:space="preserve">INDEPENDENT TASK (1H)</w:t>
+            </w:r>
+          </w:p>
+          <w:p>
+            <w:r>
+              <w:rPr>
+                <w:color w:val="041E42"/>
+                <w:sz w:val="21"/>
+                <w:szCs w:val="21"/>
+              </w:rPr>
+              <w:t xml:space="preserve">Ask one person for the help or resource you named, and use it towards your goal.</w:t>
+            </w:r>
+          </w:p>
+        </w:tc>
+      </w:tr>
+    </w:tbl>
+    <w:p>
+      <w:pPr>
+        <w:spacing w:after="80" w:before="40"/>
+      </w:pPr>
+      <w:r>
+        <w:rPr>
+          <w:i/>
+          <w:iCs/>
+          <w:color w:val="6B7280"/>
+          <w:sz w:val="18"/>
+          <w:szCs w:val="18"/>
+        </w:rPr>
+        <w:t xml:space="preserve">Flex: Naming who and what can help stays in-person; actually reaching out and using the help is the independent task.</w:t>
+      </w:r>
+    </w:p>
+    <w:p>
+      <w:r>
+        <w:br w:type="page"/>
+      </w:r>
+    </w:p>
+    <w:p>
+      <w:pPr>
+        <w:pBdr>
+          <w:bottom w:val="single" w:color="8F993E" w:sz="12" w:space="6"/>
+        </w:pBdr>
+        <w:spacing w:after="60" w:before="240"/>
+      </w:pPr>
+      <w:r>
+        <w:rPr>
+          <w:b/>
+          <w:bCs/>
+          <w:color w:val="004976"/>
+          <w:sz w:val="40"/>
+          <w:szCs w:val="40"/>
+        </w:rPr>
+        <w:t xml:space="preserve">Week 4 — Track progress, use feedback, and reflect</w:t>
+      </w:r>
+    </w:p>
+    <w:p>
+      <w:pPr>
+        <w:spacing w:after="80"/>
+      </w:pPr>
+      <w:r>
+        <w:rPr>
+          <w:i/>
+          <w:iCs/>
+          <w:color w:val="6B7280"/>
+          <w:sz w:val="19"/>
+          <w:szCs w:val="19"/>
+        </w:rPr>
+        <w:t xml:space="preserve">Objective 4: Track progress, use feedback, and reflect on your growth.</w:t>
+      </w:r>
+    </w:p>
+    <w:tbl>
+      <w:tblPr>
+        <w:tblW w:type="pct" w:w="100%"/>
+        <w:tblBorders>
+          <w:top w:val="none" w:color="FFFFFF" w:sz="0"/>
+          <w:left w:val="none" w:color="FFFFFF" w:sz="0"/>
+          <w:bottom w:val="none" w:color="FFFFFF" w:sz="0"/>
+          <w:right w:val="none" w:color="FFFFFF" w:sz="0"/>
+          <w:insideH w:val="none" w:color="FFFFFF" w:sz="0"/>
+          <w:insideV w:val="none" w:color="FFFFFF" w:sz="0"/>
+        </w:tblBorders>
+      </w:tblPr>
+      <w:tblGrid>
+        <w:gridCol w:w="100"/>
+      </w:tblGrid>
+      <w:tr>
+        <w:tc>
+          <w:tcPr>
+            <w:shd w:fill="FCEFC9" w:color="auto" w:val="clear"/>
+            <w:tcMar>
+              <w:top w:type="dxa" w:w="90"/>
+              <w:left w:type="dxa" w:w="140"/>
+              <w:bottom w:type="dxa" w:w="90"/>
+              <w:right w:type="dxa" w:w="140"/>
+            </w:tcMar>
+          </w:tcPr>
+          <w:p>
+            <w:pPr>
+              <w:spacing w:after="40"/>
+            </w:pPr>
+            <w:r>
+              <w:rPr>
+                <w:b/>
+                <w:bCs/>
+                <w:color w:val="EF9600"/>
+                <w:spacing w:val="30"/>
+                <w:sz w:val="15"/>
+                <w:szCs w:val="15"/>
+              </w:rPr>
+              <w:t xml:space="preserve">OUTCOME OF THE WEEK</w:t>
+            </w:r>
+          </w:p>
+          <w:p>
+            <w:r>
+              <w:rPr>
+                <w:color w:val="041E42"/>
+                <w:sz w:val="21"/>
+                <w:szCs w:val="21"/>
+              </w:rPr>
+              <w:t xml:space="preserve">Each learner keeps a simple record of their progress, seeks and uses feedback, and reflects on how they have grown against their original goal. This completes the goal cycle and produces the evidence of self-directed learning the programme assesses.</w:t>
+            </w:r>
+          </w:p>
+        </w:tc>
+      </w:tr>
+    </w:tbl>
+    <w:p>
+      <w:pPr>
+        <w:spacing w:after="120" w:before="80"/>
+      </w:pPr>
+      <w:r>
+        <w:rPr>
+          <w:color w:val="97999B"/>
+          <w:sz w:val="19"/>
+          <w:szCs w:val="19"/>
+        </w:rPr>
+        <w:t xml:space="preserve">This week: 3h in-person · 2h independent, across 3 sessions.</w:t>
+      </w:r>
+    </w:p>
+    <w:p>
+      <w:pPr>
+        <w:spacing w:after="40" w:before="200"/>
+      </w:pPr>
+      <w:r>
+        <w:rPr>
+          <w:b/>
+          <w:bCs/>
+          <w:color w:val="041E42"/>
+          <w:sz w:val="26"/>
+          <w:szCs w:val="26"/>
+        </w:rPr>
+        <w:t xml:space="preserve">Session 1 — Keep your learning book</w:t>
+      </w:r>
+    </w:p>
+    <w:p>
+      <w:pPr>
+        <w:spacing w:after="80"/>
+      </w:pPr>
+      <w:r>
+        <w:rPr>
+          <w:b/>
+          <w:bCs/>
+          <w:color w:val="3F8291"/>
+          <w:sz w:val="18"/>
+          <w:szCs w:val="18"/>
+        </w:rPr>
+        <w:t xml:space="preserve">1h in-person · 30 min independent</w:t>
+      </w:r>
+    </w:p>
+    <w:tbl>
+      <w:tblPr>
+        <w:tblW w:type="pct" w:w="100%"/>
+        <w:tblBorders>
+          <w:top w:val="none" w:color="FFFFFF" w:sz="0"/>
+          <w:left w:val="none" w:color="FFFFFF" w:sz="0"/>
+          <w:bottom w:val="none" w:color="FFFFFF" w:sz="0"/>
+          <w:right w:val="none" w:color="FFFFFF" w:sz="0"/>
+          <w:insideH w:val="none" w:color="FFFFFF" w:sz="0"/>
+          <w:insideV w:val="none" w:color="FFFFFF" w:sz="0"/>
+        </w:tblBorders>
+      </w:tblPr>
+      <w:tblGrid>
+        <w:gridCol w:w="100"/>
+      </w:tblGrid>
+      <w:tr>
+        <w:tc>
+          <w:tcPr>
+            <w:shd w:fill="FBEFE0" w:color="auto" w:val="clear"/>
+            <w:tcMar>
+              <w:top w:type="dxa" w:w="90"/>
+              <w:left w:type="dxa" w:w="140"/>
+              <w:bottom w:type="dxa" w:w="90"/>
+              <w:right w:type="dxa" w:w="140"/>
+            </w:tcMar>
+          </w:tcPr>
+          <w:p>
+            <w:pPr>
+              <w:spacing w:after="40"/>
+            </w:pPr>
+            <w:r>
+              <w:rPr>
+                <w:b/>
+                <w:bCs/>
+                <w:color w:val="EF9600"/>
+                <w:spacing w:val="30"/>
+                <w:sz w:val="15"/>
+                <w:szCs w:val="15"/>
+              </w:rPr>
+              <w:t xml:space="preserve">THE ONE THING TO GET RIGHT</w:t>
+            </w:r>
+          </w:p>
+          <w:p>
+            <w:r>
+              <w:rPr>
+                <w:color w:val="041E42"/>
+                <w:sz w:val="21"/>
+                <w:szCs w:val="21"/>
+              </w:rPr>
+              <w:t xml:space="preserve">This workbook is the spine the other Agency in Learning activities draw and mark into, so the one thing to get right is that it is easy and habitual, not a chore. Because most learners do not read or write, an entry is a drawing, a mark, a face, or a few words the facilitator scribes when asked, never a demand to write. A book a learner marks once a session beats a neat one they abandon. Say aloud, often, that there is no right way to keep it and one small drawing is enough, so no learner freezes at a blank page or hides an untidy one.</w:t>
+            </w:r>
+          </w:p>
+        </w:tc>
+      </w:tr>
+    </w:tbl>
+    <w:p>
+      <w:pPr>
+        <w:spacing w:after="40" w:before="160"/>
+      </w:pPr>
+      <w:r>
+        <w:rPr>
+          <w:b/>
+          <w:bCs/>
+          <w:color w:val="004976"/>
+          <w:spacing w:val="30"/>
+          <w:sz w:val="17"/>
+          <w:szCs w:val="17"/>
+        </w:rPr>
+        <w:t xml:space="preserve">PREPARE</w:t>
+      </w:r>
+    </w:p>
+    <w:p>
+      <w:pPr>
+        <w:pStyle w:val="ListParagraph"/>
+        <w:numPr>
+          <w:ilvl w:val="0"/>
+          <w:numId w:val="1"/>
+        </w:numPr>
+        <w:spacing w:after="40"/>
+      </w:pPr>
+      <w:r>
+        <w:rPr>
+          <w:color w:val="041E42"/>
+          <w:sz w:val="21"/>
+          <w:szCs w:val="21"/>
+        </w:rPr>
+        <w:t xml:space="preserve">The student workbook, one per learner, with blank picture pages and a place for their goal.</w:t>
+      </w:r>
+    </w:p>
+    <w:p>
+      <w:pPr>
+        <w:pStyle w:val="ListParagraph"/>
+        <w:numPr>
+          <w:ilvl w:val="0"/>
+          <w:numId w:val="1"/>
+        </w:numPr>
+        <w:spacing w:after="40"/>
+      </w:pPr>
+      <w:r>
+        <w:rPr>
+          <w:color w:val="041E42"/>
+          <w:sz w:val="21"/>
+          <w:szCs w:val="21"/>
+        </w:rPr>
+        <w:t xml:space="preserve">Coloured pencils or crayons the whole group can share, and a facilitator pen for scribing a few words when asked.</w:t>
+      </w:r>
+    </w:p>
+    <w:p>
+      <w:pPr>
+        <w:pStyle w:val="ListParagraph"/>
+        <w:numPr>
+          <w:ilvl w:val="0"/>
+          <w:numId w:val="1"/>
+        </w:numPr>
+        <w:spacing w:after="40"/>
+      </w:pPr>
+      <w:r>
+        <w:rPr>
+          <w:color w:val="041E42"/>
+          <w:sz w:val="21"/>
+          <w:szCs w:val="21"/>
+        </w:rPr>
+        <w:t xml:space="preserve">Your own simple example mark (one drawing plus one word), to show that a small mark is a full entry.</w:t>
+      </w:r>
+    </w:p>
+    <w:p>
+      <w:pPr>
+        <w:pStyle w:val="ListParagraph"/>
+        <w:numPr>
+          <w:ilvl w:val="0"/>
+          <w:numId w:val="1"/>
+        </w:numPr>
+        <w:spacing w:after="40"/>
+      </w:pPr>
+      <w:r>
+        <w:rPr>
+          <w:color w:val="041E42"/>
+          <w:sz w:val="21"/>
+          <w:szCs w:val="21"/>
+        </w:rPr>
+        <w:t xml:space="preserve">Sensitivity: a workbook can hold private things about home and family. Say clearly no one else reads it unless the learner chooses, and a learner may keep any page just for themselves.</w:t>
+      </w:r>
+    </w:p>
+    <w:p>
+      <w:pPr>
+        <w:spacing w:after="40" w:before="140"/>
+      </w:pPr>
+      <w:r>
+        <w:rPr>
+          <w:b/>
+          <w:bCs/>
+          <w:color w:val="004976"/>
+          <w:sz w:val="22"/>
+          <w:szCs w:val="22"/>
+        </w:rPr>
+        <w:t xml:space="preserve">1. Set up a book you can find and keep</w:t>
+      </w:r>
+      <w:r>
+        <w:rPr>
+          <w:color w:val="97999B"/>
+          <w:sz w:val="17"/>
+          <w:szCs w:val="17"/>
+        </w:rPr>
+        <w:t xml:space="preserve">   14-16 min</w:t>
+      </w:r>
+    </w:p>
+    <w:p>
+      <w:pPr>
+        <w:spacing w:after="80"/>
+      </w:pPr>
+      <w:r>
+        <w:rPr>
+          <w:color w:val="041E42"/>
+          <w:sz w:val="21"/>
+          <w:szCs w:val="21"/>
+        </w:rPr>
+        <w:t xml:space="preserve">Say aloud what the book is for: a private place where a learner keeps pictures of what they are learning across the whole programme, so they can see themselves grow. Hand out the workbooks and let each learner mark the front (their name, a drawing, or a mark only they know) so they can always find their own. Walk round and check every learner can recognise their book. The point is ownership, not neatness.</w:t>
+      </w:r>
+    </w:p>
+    <w:p>
+      <w:pPr>
+        <w:spacing w:after="20"/>
+      </w:pPr>
+      <w:r>
+        <w:rPr>
+          <w:b/>
+          <w:bCs/>
+          <w:color w:val="8F993E"/>
+          <w:sz w:val="18"/>
+          <w:szCs w:val="18"/>
+        </w:rPr>
+        <w:t xml:space="preserve">Ask:</w:t>
+      </w:r>
+    </w:p>
+    <w:p>
+      <w:pPr>
+        <w:pStyle w:val="ListParagraph"/>
+        <w:numPr>
+          <w:ilvl w:val="0"/>
+          <w:numId w:val="1"/>
+        </w:numPr>
+        <w:spacing w:after="20"/>
+      </w:pPr>
+      <w:r>
+        <w:rPr>
+          <w:color w:val="041E42"/>
+          <w:sz w:val="20"/>
+          <w:szCs w:val="20"/>
+        </w:rPr>
+        <w:t xml:space="preserve">Whose book is this, and how will you know it is yours when they are all stacked together?</w:t>
+      </w:r>
+    </w:p>
+    <w:p>
+      <w:pPr>
+        <w:pStyle w:val="ListParagraph"/>
+        <w:numPr>
+          <w:ilvl w:val="0"/>
+          <w:numId w:val="1"/>
+        </w:numPr>
+        <w:spacing w:after="20"/>
+      </w:pPr>
+      <w:r>
+        <w:rPr>
+          <w:color w:val="041E42"/>
+          <w:sz w:val="20"/>
+          <w:szCs w:val="20"/>
+        </w:rPr>
+        <w:t xml:space="preserve">What small mark or drawing could you put on the front so you find it fast?</w:t>
+      </w:r>
+    </w:p>
+    <w:p>
+      <w:pPr>
+        <w:spacing w:after="20" w:before="40"/>
+      </w:pPr>
+      <w:r>
+        <w:rPr>
+          <w:b/>
+          <w:bCs/>
+          <w:color w:val="BD472A"/>
+          <w:sz w:val="18"/>
+          <w:szCs w:val="18"/>
+        </w:rPr>
+        <w:t xml:space="preserve">Watch out:</w:t>
+      </w:r>
+    </w:p>
+    <w:p>
+      <w:pPr>
+        <w:pStyle w:val="ListParagraph"/>
+        <w:numPr>
+          <w:ilvl w:val="0"/>
+          <w:numId w:val="1"/>
+        </w:numPr>
+        <w:spacing w:after="20"/>
+      </w:pPr>
+      <w:r>
+        <w:rPr>
+          <w:color w:val="041E42"/>
+          <w:sz w:val="20"/>
+          <w:szCs w:val="20"/>
+        </w:rPr>
+        <w:t xml:space="preserve">A learner is anxious because they cannot write their name; offer to scribe it, or let a drawing or thumbprint be their mark, so no one is shamed at the very first step.</w:t>
+      </w:r>
+    </w:p>
+    <w:p>
+      <w:pPr>
+        <w:spacing w:after="40" w:before="20"/>
+      </w:pPr>
+      <w:r>
+        <w:rPr>
+          <w:i/>
+          <w:iCs/>
+          <w:color w:val="6B7280"/>
+          <w:sz w:val="18"/>
+          <w:szCs w:val="18"/>
+        </w:rPr>
+        <w:t xml:space="preserve">If low-resource: No printed book is needed if supply is short: a few stapled sheets or the back of a shared notebook works. The book being the learner's own, and findable again, matters far more than what it is made of.</w:t>
+      </w:r>
+    </w:p>
+    <w:p>
+      <w:pPr>
+        <w:spacing w:after="40" w:before="140"/>
+      </w:pPr>
+      <w:r>
+        <w:rPr>
+          <w:b/>
+          <w:bCs/>
+          <w:color w:val="004976"/>
+          <w:sz w:val="22"/>
+          <w:szCs w:val="22"/>
+        </w:rPr>
+        <w:t xml:space="preserve">2. Put your goal on the first page</w:t>
+      </w:r>
+      <w:r>
+        <w:rPr>
+          <w:color w:val="97999B"/>
+          <w:sz w:val="17"/>
+          <w:szCs w:val="17"/>
+        </w:rPr>
+        <w:t xml:space="preserve">   14-16 min</w:t>
+      </w:r>
+    </w:p>
+    <w:p>
+      <w:pPr>
+        <w:spacing w:after="80"/>
+      </w:pPr>
+      <w:r>
+        <w:rPr>
+          <w:color w:val="041E42"/>
+          <w:sz w:val="21"/>
+          <w:szCs w:val="21"/>
+        </w:rPr>
+        <w:t xml:space="preserve">Have each learner draw or mark their learning goal on the first page: the thing they are working towards, as a picture. If a learner wants a word or two added, scribe it for them beside the drawing. Anchoring the book to a real goal is what makes later marks meaningful, because the learner has something concrete to track against, not a blank page. Keep it to one goal so the page stays light.</w:t>
+      </w:r>
+    </w:p>
+    <w:p>
+      <w:pPr>
+        <w:spacing w:after="20"/>
+      </w:pPr>
+      <w:r>
+        <w:rPr>
+          <w:b/>
+          <w:bCs/>
+          <w:color w:val="8F993E"/>
+          <w:sz w:val="18"/>
+          <w:szCs w:val="18"/>
+        </w:rPr>
+        <w:t xml:space="preserve">Ask:</w:t>
+      </w:r>
+    </w:p>
+    <w:p>
+      <w:pPr>
+        <w:pStyle w:val="ListParagraph"/>
+        <w:numPr>
+          <w:ilvl w:val="0"/>
+          <w:numId w:val="1"/>
+        </w:numPr>
+        <w:spacing w:after="20"/>
+      </w:pPr>
+      <w:r>
+        <w:rPr>
+          <w:color w:val="041E42"/>
+          <w:sz w:val="20"/>
+          <w:szCs w:val="20"/>
+        </w:rPr>
+        <w:t xml:space="preserve">What are you working towards? Draw it, or show me and I will help you mark it.</w:t>
+      </w:r>
+    </w:p>
+    <w:p>
+      <w:pPr>
+        <w:pStyle w:val="ListParagraph"/>
+        <w:numPr>
+          <w:ilvl w:val="0"/>
+          <w:numId w:val="1"/>
+        </w:numPr>
+        <w:spacing w:after="20"/>
+      </w:pPr>
+      <w:r>
+        <w:rPr>
+          <w:color w:val="041E42"/>
+          <w:sz w:val="20"/>
+          <w:szCs w:val="20"/>
+        </w:rPr>
+        <w:t xml:space="preserve">When you turn to this page next time, what will remind you what you were aiming for?</w:t>
+      </w:r>
+    </w:p>
+    <w:p>
+      <w:pPr>
+        <w:spacing w:after="20" w:before="40"/>
+      </w:pPr>
+      <w:r>
+        <w:rPr>
+          <w:b/>
+          <w:bCs/>
+          <w:color w:val="BD472A"/>
+          <w:sz w:val="18"/>
+          <w:szCs w:val="18"/>
+        </w:rPr>
+        <w:t xml:space="preserve">Watch out:</w:t>
+      </w:r>
+    </w:p>
+    <w:p>
+      <w:pPr>
+        <w:pStyle w:val="ListParagraph"/>
+        <w:numPr>
+          <w:ilvl w:val="0"/>
+          <w:numId w:val="1"/>
+        </w:numPr>
+        <w:spacing w:after="20"/>
+      </w:pPr>
+      <w:r>
+        <w:rPr>
+          <w:color w:val="041E42"/>
+          <w:sz w:val="20"/>
+          <w:szCs w:val="20"/>
+        </w:rPr>
+        <w:t xml:space="preserve">A learner copies a neighbour's goal picture because they are unsure; kneel beside them and ask what they themselves want, then help them mark their own, so the book starts from their real goal.</w:t>
+      </w:r>
+    </w:p>
+    <w:p>
+      <w:pPr>
+        <w:spacing w:after="40" w:before="20"/>
+      </w:pPr>
+      <w:r>
+        <w:rPr>
+          <w:i/>
+          <w:iCs/>
+          <w:color w:val="6B7280"/>
+          <w:sz w:val="18"/>
+          <w:szCs w:val="18"/>
+        </w:rPr>
+        <w:t xml:space="preserve">If low-resource: If a learner has not set a goal yet, they draw one thing they want to get better at. A rough picture is plenty; the book can hold a clearer goal later without being restarted.</w:t>
+      </w:r>
+    </w:p>
+    <w:p>
+      <w:pPr>
+        <w:spacing w:after="40" w:before="140"/>
+      </w:pPr>
+      <w:r>
+        <w:rPr>
+          <w:b/>
+          <w:bCs/>
+          <w:color w:val="004976"/>
+          <w:sz w:val="22"/>
+          <w:szCs w:val="22"/>
+        </w:rPr>
+        <w:t xml:space="preserve">3. Make one small mark live</w:t>
+      </w:r>
+      <w:r>
+        <w:rPr>
+          <w:color w:val="97999B"/>
+          <w:sz w:val="17"/>
+          <w:szCs w:val="17"/>
+        </w:rPr>
+        <w:t xml:space="preserve">   14-16 min</w:t>
+      </w:r>
+    </w:p>
+    <w:p>
+      <w:pPr>
+        <w:spacing w:after="80"/>
+      </w:pPr>
+      <w:r>
+        <w:rPr>
+          <w:color w:val="041E42"/>
+          <w:sz w:val="21"/>
+          <w:szCs w:val="21"/>
+        </w:rPr>
+        <w:t xml:space="preserve">Break the empty page at once. Show your own example (one drawing and one word), then give quiet time for each learner to make one small mark about today: something they did, or a face for how the learning felt. Offer to scribe a few words for any learner who points and tells you. The point is to prove a mark can be quick and honest, so the book never feels like a task a learner has to steel themselves for.</w:t>
+      </w:r>
+    </w:p>
+    <w:p>
+      <w:pPr>
+        <w:spacing w:after="20"/>
+      </w:pPr>
+      <w:r>
+        <w:rPr>
+          <w:b/>
+          <w:bCs/>
+          <w:color w:val="8F993E"/>
+          <w:sz w:val="18"/>
+          <w:szCs w:val="18"/>
+        </w:rPr>
+        <w:t xml:space="preserve">Ask:</w:t>
+      </w:r>
+    </w:p>
+    <w:p>
+      <w:pPr>
+        <w:pStyle w:val="ListParagraph"/>
+        <w:numPr>
+          <w:ilvl w:val="0"/>
+          <w:numId w:val="1"/>
+        </w:numPr>
+        <w:spacing w:after="20"/>
+      </w:pPr>
+      <w:r>
+        <w:rPr>
+          <w:color w:val="041E42"/>
+          <w:sz w:val="20"/>
+          <w:szCs w:val="20"/>
+        </w:rPr>
+        <w:t xml:space="preserve">What is one thing you did today towards your goal? Draw it, however small.</w:t>
+      </w:r>
+    </w:p>
+    <w:p>
+      <w:pPr>
+        <w:pStyle w:val="ListParagraph"/>
+        <w:numPr>
+          <w:ilvl w:val="0"/>
+          <w:numId w:val="1"/>
+        </w:numPr>
+        <w:spacing w:after="20"/>
+      </w:pPr>
+      <w:r>
+        <w:rPr>
+          <w:color w:val="041E42"/>
+          <w:sz w:val="20"/>
+          <w:szCs w:val="20"/>
+        </w:rPr>
+        <w:t xml:space="preserve">How did today feel? Point to a face, or make a mark for it, and I will add a word if you like.</w:t>
+      </w:r>
+    </w:p>
+    <w:p>
+      <w:pPr>
+        <w:spacing w:after="20" w:before="40"/>
+      </w:pPr>
+      <w:r>
+        <w:rPr>
+          <w:b/>
+          <w:bCs/>
+          <w:color w:val="BD472A"/>
+          <w:sz w:val="18"/>
+          <w:szCs w:val="18"/>
+        </w:rPr>
+        <w:t xml:space="preserve">Watch out:</w:t>
+      </w:r>
+    </w:p>
+    <w:p>
+      <w:pPr>
+        <w:pStyle w:val="ListParagraph"/>
+        <w:numPr>
+          <w:ilvl w:val="0"/>
+          <w:numId w:val="1"/>
+        </w:numPr>
+        <w:spacing w:after="20"/>
+      </w:pPr>
+      <w:r>
+        <w:rPr>
+          <w:color w:val="041E42"/>
+          <w:sz w:val="20"/>
+          <w:szCs w:val="20"/>
+        </w:rPr>
+        <w:t xml:space="preserve">A learner freezes because they think the mark must be big or beautiful; say aloud that one small drawing is a full entry, and show just how quick and rough yours was.</w:t>
+      </w:r>
+    </w:p>
+    <w:p>
+      <w:pPr>
+        <w:spacing w:after="40" w:before="20"/>
+      </w:pPr>
+      <w:r>
+        <w:rPr>
+          <w:i/>
+          <w:iCs/>
+          <w:color w:val="6B7280"/>
+          <w:sz w:val="18"/>
+          <w:szCs w:val="18"/>
+        </w:rPr>
+        <w:t xml:space="preserve">If low-resource: If time is very short, one face or one mark against one prompt is a complete entry. One real mark made in the room is worth more than a fuller page promised for later.</w:t>
+      </w:r>
+    </w:p>
+    <w:p>
+      <w:pPr>
+        <w:spacing w:after="40" w:before="140"/>
+      </w:pPr>
+      <w:r>
+        <w:rPr>
+          <w:b/>
+          <w:bCs/>
+          <w:color w:val="004976"/>
+          <w:sz w:val="22"/>
+          <w:szCs w:val="22"/>
+        </w:rPr>
+        <w:t xml:space="preserve">4. Agree one moment each session</w:t>
+      </w:r>
+      <w:r>
+        <w:rPr>
+          <w:color w:val="97999B"/>
+          <w:sz w:val="17"/>
+          <w:szCs w:val="17"/>
+        </w:rPr>
+        <w:t xml:space="preserve">   12-14 min</w:t>
+      </w:r>
+    </w:p>
+    <w:p>
+      <w:pPr>
+        <w:spacing w:after="80"/>
+      </w:pPr>
+      <w:r>
+        <w:rPr>
+          <w:color w:val="041E42"/>
+          <w:sz w:val="21"/>
+          <w:szCs w:val="21"/>
+        </w:rPr>
+        <w:t xml:space="preserve">Turn the one mark into a habit. Agree together a fixed moment for marking the book (the last few minutes of each session, before anyone leaves), so it does not depend on remembering. Say clearly what counts as done: one drawing or one mark. Tell learners the book will be opened again in the goal-setting, feedback, and reflection sessions, so they know it is going somewhere.</w:t>
+      </w:r>
+    </w:p>
+    <w:p>
+      <w:pPr>
+        <w:spacing w:after="20"/>
+      </w:pPr>
+      <w:r>
+        <w:rPr>
+          <w:b/>
+          <w:bCs/>
+          <w:color w:val="8F993E"/>
+          <w:sz w:val="18"/>
+          <w:szCs w:val="18"/>
+        </w:rPr>
+        <w:t xml:space="preserve">Ask:</w:t>
+      </w:r>
+    </w:p>
+    <w:p>
+      <w:pPr>
+        <w:pStyle w:val="ListParagraph"/>
+        <w:numPr>
+          <w:ilvl w:val="0"/>
+          <w:numId w:val="1"/>
+        </w:numPr>
+        <w:spacing w:after="20"/>
+      </w:pPr>
+      <w:r>
+        <w:rPr>
+          <w:color w:val="041E42"/>
+          <w:sz w:val="20"/>
+          <w:szCs w:val="20"/>
+        </w:rPr>
+        <w:t xml:space="preserve">When exactly will we mark our books each time, so no one has to remember on their own?</w:t>
+      </w:r>
+    </w:p>
+    <w:p>
+      <w:pPr>
+        <w:pStyle w:val="ListParagraph"/>
+        <w:numPr>
+          <w:ilvl w:val="0"/>
+          <w:numId w:val="1"/>
+        </w:numPr>
+        <w:spacing w:after="20"/>
+      </w:pPr>
+      <w:r>
+        <w:rPr>
+          <w:color w:val="041E42"/>
+          <w:sz w:val="20"/>
+          <w:szCs w:val="20"/>
+        </w:rPr>
+        <w:t xml:space="preserve">What is the smallest mark that still counts as done for the day?</w:t>
+      </w:r>
+    </w:p>
+    <w:p>
+      <w:pPr>
+        <w:spacing w:after="20" w:before="40"/>
+      </w:pPr>
+      <w:r>
+        <w:rPr>
+          <w:b/>
+          <w:bCs/>
+          <w:color w:val="BD472A"/>
+          <w:sz w:val="18"/>
+          <w:szCs w:val="18"/>
+        </w:rPr>
+        <w:t xml:space="preserve">Watch out:</w:t>
+      </w:r>
+    </w:p>
+    <w:p>
+      <w:pPr>
+        <w:pStyle w:val="ListParagraph"/>
+        <w:numPr>
+          <w:ilvl w:val="0"/>
+          <w:numId w:val="1"/>
+        </w:numPr>
+        <w:spacing w:after="20"/>
+      </w:pPr>
+      <w:r>
+        <w:rPr>
+          <w:color w:val="041E42"/>
+          <w:sz w:val="20"/>
+          <w:szCs w:val="20"/>
+        </w:rPr>
+        <w:t xml:space="preserve">The group agrees an over-ambitious routine (a full drawing every day at home) that will collapse; steer them to one small mark at a fixed moment in the room, and say it can grow later if it works.</w:t>
+      </w:r>
+    </w:p>
+    <w:p>
+      <w:pPr>
+        <w:spacing w:after="40" w:before="160"/>
+      </w:pPr>
+      <w:r>
+        <w:rPr>
+          <w:b/>
+          <w:bCs/>
+          <w:color w:val="004976"/>
+          <w:spacing w:val="30"/>
+          <w:sz w:val="17"/>
+          <w:szCs w:val="17"/>
+        </w:rPr>
+        <w:t xml:space="preserve">CLOSING</w:t>
+      </w:r>
+    </w:p>
+    <w:p>
+      <w:pPr>
+        <w:spacing w:after="80"/>
+      </w:pPr>
+      <w:r>
+        <w:rPr>
+          <w:color w:val="041E42"/>
+          <w:sz w:val="21"/>
+          <w:szCs w:val="21"/>
+        </w:rPr>
+        <w:t xml:space="preserve">Ask two or three learners to hold up their book and show the front they made and their goal page, not the private marks inside, which stay theirs. Say aloud that this book is a living thing the other sessions will build on: goals go in it, small marks are made in it each time, and growth is looked back on from it. A kept book is how a learner watches their own learning move. Independent task: before the next session, make one small mark or drawing in your book about something you learned or did.</w:t>
+      </w:r>
+    </w:p>
+    <w:tbl>
+      <w:tblPr>
+        <w:tblW w:type="pct" w:w="100%"/>
+        <w:tblBorders>
+          <w:top w:val="none" w:color="FFFFFF" w:sz="0"/>
+          <w:left w:val="none" w:color="FFFFFF" w:sz="0"/>
+          <w:bottom w:val="none" w:color="FFFFFF" w:sz="0"/>
+          <w:right w:val="none" w:color="FFFFFF" w:sz="0"/>
+          <w:insideH w:val="none" w:color="FFFFFF" w:sz="0"/>
+          <w:insideV w:val="none" w:color="FFFFFF" w:sz="0"/>
+        </w:tblBorders>
+      </w:tblPr>
+      <w:tblGrid>
+        <w:gridCol w:w="100"/>
+      </w:tblGrid>
+      <w:tr>
+        <w:tc>
+          <w:tcPr>
+            <w:shd w:fill="E1EEF1" w:color="auto" w:val="clear"/>
+            <w:tcMar>
+              <w:top w:type="dxa" w:w="90"/>
+              <w:left w:type="dxa" w:w="140"/>
+              <w:bottom w:type="dxa" w:w="90"/>
+              <w:right w:type="dxa" w:w="140"/>
+            </w:tcMar>
+          </w:tcPr>
+          <w:p>
+            <w:pPr>
+              <w:spacing w:after="40"/>
+            </w:pPr>
+            <w:r>
+              <w:rPr>
+                <w:b/>
+                <w:bCs/>
+                <w:color w:val="3F8291"/>
+                <w:spacing w:val="30"/>
+                <w:sz w:val="15"/>
+                <w:szCs w:val="15"/>
+              </w:rPr>
+              <w:t xml:space="preserve">INDEPENDENT TASK (30 MIN)</w:t>
+            </w:r>
+          </w:p>
+          <w:p>
+            <w:r>
+              <w:rPr>
+                <w:color w:val="041E42"/>
+                <w:sz w:val="21"/>
+                <w:szCs w:val="21"/>
+              </w:rPr>
+              <w:t xml:space="preserve">Make one small mark or drawing in your learning book after each session this week.</w:t>
+            </w:r>
+          </w:p>
+        </w:tc>
+      </w:tr>
+    </w:tbl>
+    <w:p>
+      <w:pPr>
+        <w:spacing w:after="80" w:before="40"/>
+      </w:pPr>
+      <w:r>
+        <w:rPr>
+          <w:i/>
+          <w:iCs/>
+          <w:color w:val="6B7280"/>
+          <w:sz w:val="18"/>
+          <w:szCs w:val="18"/>
+        </w:rPr>
+        <w:t xml:space="preserve">Flex: Setting up the book and the first mark stay in-person; keeping the routine going is the independent practice, and the spine the whole component marks into.</w:t>
+      </w:r>
+    </w:p>
+    <w:p>
+      <w:pPr>
+        <w:spacing w:after="40" w:before="200"/>
+      </w:pPr>
+      <w:r>
+        <w:rPr>
+          <w:b/>
+          <w:bCs/>
+          <w:color w:val="041E42"/>
+          <w:sz w:val="26"/>
+          <w:szCs w:val="26"/>
+        </w:rPr>
+        <w:t xml:space="preserve">Session 2 — Ask for and use feedback</w:t>
+      </w:r>
+    </w:p>
+    <w:p>
+      <w:pPr>
+        <w:spacing w:after="80"/>
+      </w:pPr>
+      <w:r>
+        <w:rPr>
+          <w:b/>
+          <w:bCs/>
+          <w:color w:val="3F8291"/>
+          <w:sz w:val="18"/>
+          <w:szCs w:val="18"/>
+        </w:rPr>
+        <w:t xml:space="preserve">1h in-person · 30 min independent</w:t>
+      </w:r>
+    </w:p>
+    <w:tbl>
+      <w:tblPr>
+        <w:tblW w:type="pct" w:w="100%"/>
+        <w:tblBorders>
+          <w:top w:val="none" w:color="FFFFFF" w:sz="0"/>
+          <w:left w:val="none" w:color="FFFFFF" w:sz="0"/>
+          <w:bottom w:val="none" w:color="FFFFFF" w:sz="0"/>
+          <w:right w:val="none" w:color="FFFFFF" w:sz="0"/>
+          <w:insideH w:val="none" w:color="FFFFFF" w:sz="0"/>
+          <w:insideV w:val="none" w:color="FFFFFF" w:sz="0"/>
+        </w:tblBorders>
+      </w:tblPr>
+      <w:tblGrid>
+        <w:gridCol w:w="100"/>
+      </w:tblGrid>
+      <w:tr>
+        <w:tc>
+          <w:tcPr>
+            <w:shd w:fill="FBEFE0" w:color="auto" w:val="clear"/>
+            <w:tcMar>
+              <w:top w:type="dxa" w:w="90"/>
+              <w:left w:type="dxa" w:w="140"/>
+              <w:bottom w:type="dxa" w:w="90"/>
+              <w:right w:type="dxa" w:w="140"/>
+            </w:tcMar>
+          </w:tcPr>
+          <w:p>
+            <w:pPr>
+              <w:spacing w:after="40"/>
+            </w:pPr>
+            <w:r>
+              <w:rPr>
+                <w:b/>
+                <w:bCs/>
+                <w:color w:val="EF9600"/>
+                <w:spacing w:val="30"/>
+                <w:sz w:val="15"/>
+                <w:szCs w:val="15"/>
+              </w:rPr>
+              <w:t xml:space="preserve">THE ONE THING TO GET RIGHT</w:t>
+            </w:r>
+          </w:p>
+          <w:p>
+            <w:r>
+              <w:rPr>
+                <w:color w:val="041E42"/>
+                <w:sz w:val="21"/>
+                <w:szCs w:val="21"/>
+              </w:rPr>
+              <w:t xml:space="preserve">Advice only helps a learner who asks for it well and can hear it without defending. The one thing to get right is the shift from advice as judgement to advice the learner controls: they choose what to ask about, and they choose what to act on. Protect that. Do not let partners grade each other, and do not push any learner to accept every comment. Because the room does not read, do it all by speaking: model the two requests aloud, keep the keep-wait-leave sort as three spots to stand at. Name the first sting of criticism openly so learners expect it and can breathe through it rather than argue back.</w:t>
+            </w:r>
+          </w:p>
+        </w:tc>
+      </w:tr>
+    </w:tbl>
+    <w:p>
+      <w:pPr>
+        <w:spacing w:after="40" w:before="160"/>
+      </w:pPr>
+      <w:r>
+        <w:rPr>
+          <w:b/>
+          <w:bCs/>
+          <w:color w:val="004976"/>
+          <w:spacing w:val="30"/>
+          <w:sz w:val="17"/>
+          <w:szCs w:val="17"/>
+        </w:rPr>
+        <w:t xml:space="preserve">PREPARE</w:t>
+      </w:r>
+    </w:p>
+    <w:p>
+      <w:pPr>
+        <w:pStyle w:val="ListParagraph"/>
+        <w:numPr>
+          <w:ilvl w:val="0"/>
+          <w:numId w:val="1"/>
+        </w:numPr>
+        <w:spacing w:after="40"/>
+      </w:pPr>
+      <w:r>
+        <w:rPr>
+          <w:color w:val="041E42"/>
+          <w:sz w:val="21"/>
+          <w:szCs w:val="21"/>
+        </w:rPr>
+        <w:t xml:space="preserve">A real piece of the learner's work, a drawing, or a current goal to ask about.</w:t>
+      </w:r>
+    </w:p>
+    <w:p>
+      <w:pPr>
+        <w:pStyle w:val="ListParagraph"/>
+        <w:numPr>
+          <w:ilvl w:val="0"/>
+          <w:numId w:val="1"/>
+        </w:numPr>
+        <w:spacing w:after="40"/>
+      </w:pPr>
+      <w:r>
+        <w:rPr>
+          <w:color w:val="041E42"/>
+          <w:sz w:val="21"/>
+          <w:szCs w:val="21"/>
+        </w:rPr>
+        <w:t xml:space="preserve">Two spoken example requests ready (one vague, one specific), so you can model the difference aloud.</w:t>
+      </w:r>
+    </w:p>
+    <w:p>
+      <w:pPr>
+        <w:pStyle w:val="ListParagraph"/>
+        <w:numPr>
+          <w:ilvl w:val="0"/>
+          <w:numId w:val="1"/>
+        </w:numPr>
+        <w:spacing w:after="40"/>
+      </w:pPr>
+      <w:r>
+        <w:rPr>
+          <w:color w:val="041E42"/>
+          <w:sz w:val="21"/>
+          <w:szCs w:val="21"/>
+        </w:rPr>
+        <w:t xml:space="preserve">A simple keep, wait, leave sort the group can point to, drawn large as three spots on the floor or table.</w:t>
+      </w:r>
+    </w:p>
+    <w:p>
+      <w:pPr>
+        <w:pStyle w:val="ListParagraph"/>
+        <w:numPr>
+          <w:ilvl w:val="0"/>
+          <w:numId w:val="1"/>
+        </w:numPr>
+        <w:spacing w:after="40"/>
+      </w:pPr>
+      <w:r>
+        <w:rPr>
+          <w:color w:val="041E42"/>
+          <w:sz w:val="21"/>
+          <w:szCs w:val="21"/>
+        </w:rPr>
+        <w:t xml:space="preserve">Sensitivity: hearing what could be better can sting or feel shaming. Say clearly that asking for help is a strength, no one is being graded, and a learner may keep their work private and only say their goal aloud.</w:t>
+      </w:r>
+    </w:p>
+    <w:p>
+      <w:pPr>
+        <w:spacing w:after="40" w:before="140"/>
+      </w:pPr>
+      <w:r>
+        <w:rPr>
+          <w:b/>
+          <w:bCs/>
+          <w:color w:val="004976"/>
+          <w:sz w:val="22"/>
+          <w:szCs w:val="22"/>
+        </w:rPr>
+        <w:t xml:space="preserve">1. Hear a vague ask and a specific ask</w:t>
+      </w:r>
+      <w:r>
+        <w:rPr>
+          <w:color w:val="97999B"/>
+          <w:sz w:val="17"/>
+          <w:szCs w:val="17"/>
+        </w:rPr>
+        <w:t xml:space="preserve">   10-12 min</w:t>
+      </w:r>
+    </w:p>
+    <w:p>
+      <w:pPr>
+        <w:spacing w:after="80"/>
+      </w:pPr>
+      <w:r>
+        <w:rPr>
+          <w:color w:val="041E42"/>
+          <w:sz w:val="21"/>
+          <w:szCs w:val="21"/>
+        </w:rPr>
+        <w:t xml:space="preserve">Open by saying two requests aloud about the same piece of work: a vague one ("is it good?") and a specific one ("does this part show what I meant?"). Ask the room which one they could actually answer well, and draw out why: the specific ask tells the other person where to look. Keep it short and spoken; this is just a frame before each learner chooses their own one thing.</w:t>
+      </w:r>
+    </w:p>
+    <w:p>
+      <w:pPr>
+        <w:spacing w:after="20"/>
+      </w:pPr>
+      <w:r>
+        <w:rPr>
+          <w:b/>
+          <w:bCs/>
+          <w:color w:val="8F993E"/>
+          <w:sz w:val="18"/>
+          <w:szCs w:val="18"/>
+        </w:rPr>
+        <w:t xml:space="preserve">Ask:</w:t>
+      </w:r>
+    </w:p>
+    <w:p>
+      <w:pPr>
+        <w:pStyle w:val="ListParagraph"/>
+        <w:numPr>
+          <w:ilvl w:val="0"/>
+          <w:numId w:val="1"/>
+        </w:numPr>
+        <w:spacing w:after="20"/>
+      </w:pPr>
+      <w:r>
+        <w:rPr>
+          <w:color w:val="041E42"/>
+          <w:sz w:val="20"/>
+          <w:szCs w:val="20"/>
+        </w:rPr>
+        <w:t xml:space="preserve">Which is easier to answer well: asking is it good, or asking about one part? Why?</w:t>
+      </w:r>
+    </w:p>
+    <w:p>
+      <w:pPr>
+        <w:pStyle w:val="ListParagraph"/>
+        <w:numPr>
+          <w:ilvl w:val="0"/>
+          <w:numId w:val="1"/>
+        </w:numPr>
+        <w:spacing w:after="20"/>
+      </w:pPr>
+      <w:r>
+        <w:rPr>
+          <w:color w:val="041E42"/>
+          <w:sz w:val="20"/>
+          <w:szCs w:val="20"/>
+        </w:rPr>
+        <w:t xml:space="preserve">What is the one part of your work or goal you most want another person to look at?</w:t>
+      </w:r>
+    </w:p>
+    <w:p>
+      <w:pPr>
+        <w:spacing w:after="20" w:before="40"/>
+      </w:pPr>
+      <w:r>
+        <w:rPr>
+          <w:b/>
+          <w:bCs/>
+          <w:color w:val="BD472A"/>
+          <w:sz w:val="18"/>
+          <w:szCs w:val="18"/>
+        </w:rPr>
+        <w:t xml:space="preserve">Watch out:</w:t>
+      </w:r>
+    </w:p>
+    <w:p>
+      <w:pPr>
+        <w:pStyle w:val="ListParagraph"/>
+        <w:numPr>
+          <w:ilvl w:val="0"/>
+          <w:numId w:val="1"/>
+        </w:numPr>
+        <w:spacing w:after="20"/>
+      </w:pPr>
+      <w:r>
+        <w:rPr>
+          <w:color w:val="041E42"/>
+          <w:sz w:val="20"/>
+          <w:szCs w:val="20"/>
+        </w:rPr>
+        <w:t xml:space="preserve">Learners stay with "is it good?" because it feels safer; gently push each to name one specific thing, since a vague ask nearly always brings back vague advice they cannot use.</w:t>
+      </w:r>
+    </w:p>
+    <w:p>
+      <w:pPr>
+        <w:spacing w:after="40" w:before="20"/>
+      </w:pPr>
+      <w:r>
+        <w:rPr>
+          <w:i/>
+          <w:iCs/>
+          <w:color w:val="6B7280"/>
+          <w:sz w:val="18"/>
+          <w:szCs w:val="18"/>
+        </w:rPr>
+        <w:t xml:space="preserve">If low-resource: No board or slides are needed: two requests said aloud, and the one rule (ask about one thing) repeated in the learners' own language, carry the whole step. No device is used.</w:t>
+      </w:r>
+    </w:p>
+    <w:p>
+      <w:pPr>
+        <w:spacing w:after="40" w:before="140"/>
+      </w:pPr>
+      <w:r>
+        <w:rPr>
+          <w:b/>
+          <w:bCs/>
+          <w:color w:val="004976"/>
+          <w:sz w:val="22"/>
+          <w:szCs w:val="22"/>
+        </w:rPr>
+        <w:t xml:space="preserve">2. Choose your one thing to ask</w:t>
+      </w:r>
+      <w:r>
+        <w:rPr>
+          <w:color w:val="97999B"/>
+          <w:sz w:val="17"/>
+          <w:szCs w:val="17"/>
+        </w:rPr>
+        <w:t xml:space="preserve">   12-14 min</w:t>
+      </w:r>
+    </w:p>
+    <w:p>
+      <w:pPr>
+        <w:spacing w:after="80"/>
+      </w:pPr>
+      <w:r>
+        <w:rPr>
+          <w:color w:val="041E42"/>
+          <w:sz w:val="21"/>
+          <w:szCs w:val="21"/>
+        </w:rPr>
+        <w:t xml:space="preserve">Give quiet time for each learner to settle on one specific thing they want a partner to look at, about a real piece of work or their goal. Walk round and ask, do not tell: what were you trying to do here, and where are you unsure? If a learner wants it marked in the workbook, scribe the one thing beside their drawing. Steer them from wanting only praise towards a real question they do not yet know the answer to.</w:t>
+      </w:r>
+    </w:p>
+    <w:p>
+      <w:pPr>
+        <w:spacing w:after="20"/>
+      </w:pPr>
+      <w:r>
+        <w:rPr>
+          <w:b/>
+          <w:bCs/>
+          <w:color w:val="8F993E"/>
+          <w:sz w:val="18"/>
+          <w:szCs w:val="18"/>
+        </w:rPr>
+        <w:t xml:space="preserve">Ask:</w:t>
+      </w:r>
+    </w:p>
+    <w:p>
+      <w:pPr>
+        <w:pStyle w:val="ListParagraph"/>
+        <w:numPr>
+          <w:ilvl w:val="0"/>
+          <w:numId w:val="1"/>
+        </w:numPr>
+        <w:spacing w:after="20"/>
+      </w:pPr>
+      <w:r>
+        <w:rPr>
+          <w:color w:val="041E42"/>
+          <w:sz w:val="20"/>
+          <w:szCs w:val="20"/>
+        </w:rPr>
+        <w:t xml:space="preserve">What were you trying to do here, and where did it get hard for you?</w:t>
+      </w:r>
+    </w:p>
+    <w:p>
+      <w:pPr>
+        <w:pStyle w:val="ListParagraph"/>
+        <w:numPr>
+          <w:ilvl w:val="0"/>
+          <w:numId w:val="1"/>
+        </w:numPr>
+        <w:spacing w:after="20"/>
+      </w:pPr>
+      <w:r>
+        <w:rPr>
+          <w:color w:val="041E42"/>
+          <w:sz w:val="20"/>
+          <w:szCs w:val="20"/>
+        </w:rPr>
+        <w:t xml:space="preserve">What would you change if a good answer came back? Say it, and I will help you mark it.</w:t>
+      </w:r>
+    </w:p>
+    <w:p>
+      <w:pPr>
+        <w:spacing w:after="20" w:before="40"/>
+      </w:pPr>
+      <w:r>
+        <w:rPr>
+          <w:b/>
+          <w:bCs/>
+          <w:color w:val="BD472A"/>
+          <w:sz w:val="18"/>
+          <w:szCs w:val="18"/>
+        </w:rPr>
+        <w:t xml:space="preserve">Watch out:</w:t>
+      </w:r>
+    </w:p>
+    <w:p>
+      <w:pPr>
+        <w:pStyle w:val="ListParagraph"/>
+        <w:numPr>
+          <w:ilvl w:val="0"/>
+          <w:numId w:val="1"/>
+        </w:numPr>
+        <w:spacing w:after="20"/>
+      </w:pPr>
+      <w:r>
+        <w:rPr>
+          <w:color w:val="041E42"/>
+          <w:sz w:val="20"/>
+          <w:szCs w:val="20"/>
+        </w:rPr>
+        <w:t xml:space="preserve">A learner asks only to be told it is good; say aloud that useful advice names what could be better, and that asking for it is a strength, not an admission of failure.</w:t>
+      </w:r>
+    </w:p>
+    <w:p>
+      <w:pPr>
+        <w:spacing w:after="40" w:before="20"/>
+      </w:pPr>
+      <w:r>
+        <w:rPr>
+          <w:i/>
+          <w:iCs/>
+          <w:color w:val="6B7280"/>
+          <w:sz w:val="18"/>
+          <w:szCs w:val="18"/>
+        </w:rPr>
+        <w:t xml:space="preserve">If low-resource: Nothing needs to be written: the learner says their one thing aloud and holds it in mind, or points to it in the workbook while the facilitator scribes a few words. The asking, not the writing, is the task.</w:t>
+      </w:r>
+    </w:p>
+    <w:p>
+      <w:pPr>
+        <w:spacing w:after="40" w:before="140"/>
+      </w:pPr>
+      <w:r>
+        <w:rPr>
+          <w:b/>
+          <w:bCs/>
+          <w:color w:val="004976"/>
+          <w:sz w:val="22"/>
+          <w:szCs w:val="22"/>
+        </w:rPr>
+        <w:t xml:space="preserve">3. Listen without defending</w:t>
+      </w:r>
+      <w:r>
+        <w:rPr>
+          <w:color w:val="97999B"/>
+          <w:sz w:val="17"/>
+          <w:szCs w:val="17"/>
+        </w:rPr>
+        <w:t xml:space="preserve">   16-18 min</w:t>
+      </w:r>
+    </w:p>
+    <w:p>
+      <w:pPr>
+        <w:spacing w:after="80"/>
+      </w:pPr>
+      <w:r>
+        <w:rPr>
+          <w:color w:val="041E42"/>
+          <w:sz w:val="21"/>
+          <w:szCs w:val="21"/>
+        </w:rPr>
+        <w:t xml:space="preserve">Put learners in same-gender pairs to show their work or say their goal and answer each other's one thing. Coach the listener aloud: listen to understand, ask one question back, and thank your partner before you answer. Name the urge to explain or defend and ask them to let it pass. The giver stays kind and points to one thing that worked and one that could be stronger. This is the heart of the session, so give it the most time.</w:t>
+      </w:r>
+    </w:p>
+    <w:p>
+      <w:pPr>
+        <w:spacing w:after="20"/>
+      </w:pPr>
+      <w:r>
+        <w:rPr>
+          <w:b/>
+          <w:bCs/>
+          <w:color w:val="8F993E"/>
+          <w:sz w:val="18"/>
+          <w:szCs w:val="18"/>
+        </w:rPr>
+        <w:t xml:space="preserve">Ask:</w:t>
+      </w:r>
+    </w:p>
+    <w:p>
+      <w:pPr>
+        <w:pStyle w:val="ListParagraph"/>
+        <w:numPr>
+          <w:ilvl w:val="0"/>
+          <w:numId w:val="1"/>
+        </w:numPr>
+        <w:spacing w:after="20"/>
+      </w:pPr>
+      <w:r>
+        <w:rPr>
+          <w:color w:val="041E42"/>
+          <w:sz w:val="20"/>
+          <w:szCs w:val="20"/>
+        </w:rPr>
+        <w:t xml:space="preserve">What did you hear your partner actually saying, before you decide if you agree?</w:t>
+      </w:r>
+    </w:p>
+    <w:p>
+      <w:pPr>
+        <w:pStyle w:val="ListParagraph"/>
+        <w:numPr>
+          <w:ilvl w:val="0"/>
+          <w:numId w:val="1"/>
+        </w:numPr>
+        <w:spacing w:after="20"/>
+      </w:pPr>
+      <w:r>
+        <w:rPr>
+          <w:color w:val="041E42"/>
+          <w:sz w:val="20"/>
+          <w:szCs w:val="20"/>
+        </w:rPr>
+        <w:t xml:space="preserve">What is one question back that would help you understand their advice better?</w:t>
+      </w:r>
+    </w:p>
+    <w:p>
+      <w:pPr>
+        <w:spacing w:after="20" w:before="40"/>
+      </w:pPr>
+      <w:r>
+        <w:rPr>
+          <w:b/>
+          <w:bCs/>
+          <w:color w:val="BD472A"/>
+          <w:sz w:val="18"/>
+          <w:szCs w:val="18"/>
+        </w:rPr>
+        <w:t xml:space="preserve">Watch out:</w:t>
+      </w:r>
+    </w:p>
+    <w:p>
+      <w:pPr>
+        <w:pStyle w:val="ListParagraph"/>
+        <w:numPr>
+          <w:ilvl w:val="0"/>
+          <w:numId w:val="1"/>
+        </w:numPr>
+        <w:spacing w:after="20"/>
+      </w:pPr>
+      <w:r>
+        <w:rPr>
+          <w:color w:val="041E42"/>
+          <w:sz w:val="20"/>
+          <w:szCs w:val="20"/>
+        </w:rPr>
+        <w:t xml:space="preserve">A learner argues with or explains away every comment; remind them they do not have to accept it yet, only understand it, and that choosing what is useful comes next, not now.</w:t>
+      </w:r>
+    </w:p>
+    <w:p>
+      <w:pPr>
+        <w:spacing w:after="40" w:before="20"/>
+      </w:pPr>
+      <w:r>
+        <w:rPr>
+          <w:i/>
+          <w:iCs/>
+          <w:color w:val="6B7280"/>
+          <w:sz w:val="18"/>
+          <w:szCs w:val="18"/>
+        </w:rPr>
+        <w:t xml:space="preserve">If low-resource: All spoken, no writing: partners talk over the actual work in front of them. If a learner would rather not show their work, they say their goal aloud and ask their one thing about that instead.</w:t>
+      </w:r>
+    </w:p>
+    <w:p>
+      <w:pPr>
+        <w:spacing w:after="40" w:before="140"/>
+      </w:pPr>
+      <w:r>
+        <w:rPr>
+          <w:b/>
+          <w:bCs/>
+          <w:color w:val="004976"/>
+          <w:sz w:val="22"/>
+          <w:szCs w:val="22"/>
+        </w:rPr>
+        <w:t xml:space="preserve">4. Sort the advice and pick one change</w:t>
+      </w:r>
+      <w:r>
+        <w:rPr>
+          <w:color w:val="97999B"/>
+          <w:sz w:val="17"/>
+          <w:szCs w:val="17"/>
+        </w:rPr>
+        <w:t xml:space="preserve">   12-14 min</w:t>
+      </w:r>
+    </w:p>
+    <w:p>
+      <w:pPr>
+        <w:spacing w:after="80"/>
+      </w:pPr>
+      <w:r>
+        <w:rPr>
+          <w:color w:val="041E42"/>
+          <w:sz w:val="21"/>
+          <w:szCs w:val="21"/>
+        </w:rPr>
+        <w:t xml:space="preserve">Now hand the choosing back to the learner. Using three spots (keep, wait, leave), have each learner decide, aloud or by pointing, which advice to keep and act on now, which to wait on, and which does not fit their goal. Then choose one kept piece and name one small change to try, and mark it in the workbook. This is where advice becomes the learner's own tool, not someone else's verdict.</w:t>
+      </w:r>
+    </w:p>
+    <w:p>
+      <w:pPr>
+        <w:spacing w:after="20"/>
+      </w:pPr>
+      <w:r>
+        <w:rPr>
+          <w:b/>
+          <w:bCs/>
+          <w:color w:val="8F993E"/>
+          <w:sz w:val="18"/>
+          <w:szCs w:val="18"/>
+        </w:rPr>
+        <w:t xml:space="preserve">Ask:</w:t>
+      </w:r>
+    </w:p>
+    <w:p>
+      <w:pPr>
+        <w:pStyle w:val="ListParagraph"/>
+        <w:numPr>
+          <w:ilvl w:val="0"/>
+          <w:numId w:val="1"/>
+        </w:numPr>
+        <w:spacing w:after="20"/>
+      </w:pPr>
+      <w:r>
+        <w:rPr>
+          <w:color w:val="041E42"/>
+          <w:sz w:val="20"/>
+          <w:szCs w:val="20"/>
+        </w:rPr>
+        <w:t xml:space="preserve">Which advice fits what you are really trying to do, and which does not?</w:t>
+      </w:r>
+    </w:p>
+    <w:p>
+      <w:pPr>
+        <w:pStyle w:val="ListParagraph"/>
+        <w:numPr>
+          <w:ilvl w:val="0"/>
+          <w:numId w:val="1"/>
+        </w:numPr>
+        <w:spacing w:after="20"/>
+      </w:pPr>
+      <w:r>
+        <w:rPr>
+          <w:color w:val="041E42"/>
+          <w:sz w:val="20"/>
+          <w:szCs w:val="20"/>
+        </w:rPr>
+        <w:t xml:space="preserve">What is the one small change you will try, and when will you try it?</w:t>
+      </w:r>
+    </w:p>
+    <w:p>
+      <w:pPr>
+        <w:spacing w:after="20" w:before="40"/>
+      </w:pPr>
+      <w:r>
+        <w:rPr>
+          <w:b/>
+          <w:bCs/>
+          <w:color w:val="BD472A"/>
+          <w:sz w:val="18"/>
+          <w:szCs w:val="18"/>
+        </w:rPr>
+        <w:t xml:space="preserve">Watch out:</w:t>
+      </w:r>
+    </w:p>
+    <w:p>
+      <w:pPr>
+        <w:pStyle w:val="ListParagraph"/>
+        <w:numPr>
+          <w:ilvl w:val="0"/>
+          <w:numId w:val="1"/>
+        </w:numPr>
+        <w:spacing w:after="20"/>
+      </w:pPr>
+      <w:r>
+        <w:rPr>
+          <w:color w:val="041E42"/>
+          <w:sz w:val="20"/>
+          <w:szCs w:val="20"/>
+        </w:rPr>
+        <w:t xml:space="preserve">A learner tries to act on everything at once; help them choose the one change that matters most, since a single change actually made beats a long list they never touch.</w:t>
+      </w:r>
+    </w:p>
+    <w:p>
+      <w:pPr>
+        <w:spacing w:after="40" w:before="160"/>
+      </w:pPr>
+      <w:r>
+        <w:rPr>
+          <w:b/>
+          <w:bCs/>
+          <w:color w:val="004976"/>
+          <w:spacing w:val="30"/>
+          <w:sz w:val="17"/>
+          <w:szCs w:val="17"/>
+        </w:rPr>
+        <w:t xml:space="preserve">CLOSING</w:t>
+      </w:r>
+    </w:p>
+    <w:p>
+      <w:pPr>
+        <w:spacing w:after="80"/>
+      </w:pPr>
+      <w:r>
+        <w:rPr>
+          <w:color w:val="041E42"/>
+          <w:sz w:val="21"/>
+          <w:szCs w:val="21"/>
+        </w:rPr>
+        <w:t xml:space="preserve">Ask two or three learners to say the one change they will try and the advice that led to it. Draw out that they, not their partner, chose what to keep. Say aloud that asking for help is a loop they can run themselves: one clear question, an open ear, and one small change. Independent task: before the next session, try your one small change, and mark in your workbook whether it helped.</w:t>
+      </w:r>
+    </w:p>
+    <w:tbl>
+      <w:tblPr>
+        <w:tblW w:type="pct" w:w="100%"/>
+        <w:tblBorders>
+          <w:top w:val="none" w:color="FFFFFF" w:sz="0"/>
+          <w:left w:val="none" w:color="FFFFFF" w:sz="0"/>
+          <w:bottom w:val="none" w:color="FFFFFF" w:sz="0"/>
+          <w:right w:val="none" w:color="FFFFFF" w:sz="0"/>
+          <w:insideH w:val="none" w:color="FFFFFF" w:sz="0"/>
+          <w:insideV w:val="none" w:color="FFFFFF" w:sz="0"/>
+        </w:tblBorders>
+      </w:tblPr>
+      <w:tblGrid>
+        <w:gridCol w:w="100"/>
+      </w:tblGrid>
+      <w:tr>
+        <w:tc>
+          <w:tcPr>
+            <w:shd w:fill="E1EEF1" w:color="auto" w:val="clear"/>
+            <w:tcMar>
+              <w:top w:type="dxa" w:w="90"/>
+              <w:left w:type="dxa" w:w="140"/>
+              <w:bottom w:type="dxa" w:w="90"/>
+              <w:right w:type="dxa" w:w="140"/>
+            </w:tcMar>
+          </w:tcPr>
+          <w:p>
+            <w:pPr>
+              <w:spacing w:after="40"/>
+            </w:pPr>
+            <w:r>
+              <w:rPr>
+                <w:b/>
+                <w:bCs/>
+                <w:color w:val="3F8291"/>
+                <w:spacing w:val="30"/>
+                <w:sz w:val="15"/>
+                <w:szCs w:val="15"/>
+              </w:rPr>
+              <w:t xml:space="preserve">INDEPENDENT TASK (30 MIN)</w:t>
+            </w:r>
+          </w:p>
+          <w:p>
+            <w:r>
+              <w:rPr>
+                <w:color w:val="041E42"/>
+                <w:sz w:val="21"/>
+                <w:szCs w:val="21"/>
+              </w:rPr>
+              <w:t xml:space="preserve">Ask one person for feedback: what is one thing I could do better? Then try it.</w:t>
+            </w:r>
+          </w:p>
+        </w:tc>
+      </w:tr>
+    </w:tbl>
+    <w:p>
+      <w:pPr>
+        <w:spacing w:after="80" w:before="40"/>
+      </w:pPr>
+      <w:r>
+        <w:rPr>
+          <w:i/>
+          <w:iCs/>
+          <w:color w:val="6B7280"/>
+          <w:sz w:val="18"/>
+          <w:szCs w:val="18"/>
+        </w:rPr>
+        <w:t xml:space="preserve">Flex: Practising how to ask for and receive feedback stays in-person; asking someone for real is the independent task.</w:t>
+      </w:r>
+    </w:p>
+    <w:p>
+      <w:pPr>
+        <w:spacing w:after="40" w:before="200"/>
+      </w:pPr>
+      <w:r>
+        <w:rPr>
+          <w:b/>
+          <w:bCs/>
+          <w:color w:val="041E42"/>
+          <w:sz w:val="26"/>
+          <w:szCs w:val="26"/>
+        </w:rPr>
+        <w:t xml:space="preserve">Session 3 — Look back at how you have grown</w:t>
+      </w:r>
+    </w:p>
+    <w:p>
+      <w:pPr>
+        <w:spacing w:after="80"/>
+      </w:pPr>
+      <w:r>
+        <w:rPr>
+          <w:b/>
+          <w:bCs/>
+          <w:color w:val="3F8291"/>
+          <w:sz w:val="18"/>
+          <w:szCs w:val="18"/>
+        </w:rPr>
+        <w:t xml:space="preserve">1h in-person · 1h independent</w:t>
+      </w:r>
+    </w:p>
+    <w:tbl>
+      <w:tblPr>
+        <w:tblW w:type="pct" w:w="100%"/>
+        <w:tblBorders>
+          <w:top w:val="none" w:color="FFFFFF" w:sz="0"/>
+          <w:left w:val="none" w:color="FFFFFF" w:sz="0"/>
+          <w:bottom w:val="none" w:color="FFFFFF" w:sz="0"/>
+          <w:right w:val="none" w:color="FFFFFF" w:sz="0"/>
+          <w:insideH w:val="none" w:color="FFFFFF" w:sz="0"/>
+          <w:insideV w:val="none" w:color="FFFFFF" w:sz="0"/>
+        </w:tblBorders>
+      </w:tblPr>
+      <w:tblGrid>
+        <w:gridCol w:w="100"/>
+      </w:tblGrid>
+      <w:tr>
+        <w:tc>
+          <w:tcPr>
+            <w:shd w:fill="FBEFE0" w:color="auto" w:val="clear"/>
+            <w:tcMar>
+              <w:top w:type="dxa" w:w="90"/>
+              <w:left w:type="dxa" w:w="140"/>
+              <w:bottom w:type="dxa" w:w="90"/>
+              <w:right w:type="dxa" w:w="140"/>
+            </w:tcMar>
+          </w:tcPr>
+          <w:p>
+            <w:pPr>
+              <w:spacing w:after="40"/>
+            </w:pPr>
+            <w:r>
+              <w:rPr>
+                <w:b/>
+                <w:bCs/>
+                <w:color w:val="EF9600"/>
+                <w:spacing w:val="30"/>
+                <w:sz w:val="15"/>
+                <w:szCs w:val="15"/>
+              </w:rPr>
+              <w:t xml:space="preserve">THE ONE THING TO GET RIGHT</w:t>
+            </w:r>
+          </w:p>
+          <w:p>
+            <w:r>
+              <w:rPr>
+                <w:color w:val="041E42"/>
+                <w:sz w:val="21"/>
+                <w:szCs w:val="21"/>
+              </w:rPr>
+              <w:t xml:space="preserve">Looking back is where learning becomes visible and where the next goal comes from. The one thing to get right is that learners look at real evidence, their own workbook and goal page, not a vague feeling. Left to a feeling, learners either inflate or, far more often here, dismiss their progress. Your job is to help them see growth they are brushing aside and to be kind but honest about what did not happen and why. Because the room does not read, do it all by turning pages, pointing, and speaking, and keep the focus on learning, never on grading themselves.</w:t>
+            </w:r>
+          </w:p>
+        </w:tc>
+      </w:tr>
+    </w:tbl>
+    <w:p>
+      <w:pPr>
+        <w:spacing w:after="40" w:before="160"/>
+      </w:pPr>
+      <w:r>
+        <w:rPr>
+          <w:b/>
+          <w:bCs/>
+          <w:color w:val="004976"/>
+          <w:spacing w:val="30"/>
+          <w:sz w:val="17"/>
+          <w:szCs w:val="17"/>
+        </w:rPr>
+        <w:t xml:space="preserve">PREPARE</w:t>
+      </w:r>
+    </w:p>
+    <w:p>
+      <w:pPr>
+        <w:pStyle w:val="ListParagraph"/>
+        <w:numPr>
+          <w:ilvl w:val="0"/>
+          <w:numId w:val="1"/>
+        </w:numPr>
+        <w:spacing w:after="40"/>
+      </w:pPr>
+      <w:r>
+        <w:rPr>
+          <w:color w:val="041E42"/>
+          <w:sz w:val="21"/>
+          <w:szCs w:val="21"/>
+        </w:rPr>
+        <w:t xml:space="preserve">The learner's workbook, goal page, and any drawings or work made over the period being looked back on.</w:t>
+      </w:r>
+    </w:p>
+    <w:p>
+      <w:pPr>
+        <w:pStyle w:val="ListParagraph"/>
+        <w:numPr>
+          <w:ilvl w:val="0"/>
+          <w:numId w:val="1"/>
+        </w:numPr>
+        <w:spacing w:after="40"/>
+      </w:pPr>
+      <w:r>
+        <w:rPr>
+          <w:color w:val="041E42"/>
+          <w:sz w:val="21"/>
+          <w:szCs w:val="21"/>
+        </w:rPr>
+        <w:t xml:space="preserve">A short set of spoken reflection prompts you can say in the learners' own language.</w:t>
+      </w:r>
+    </w:p>
+    <w:p>
+      <w:pPr>
+        <w:pStyle w:val="ListParagraph"/>
+        <w:numPr>
+          <w:ilvl w:val="0"/>
+          <w:numId w:val="1"/>
+        </w:numPr>
+        <w:spacing w:after="40"/>
+      </w:pPr>
+      <w:r>
+        <w:rPr>
+          <w:color w:val="041E42"/>
+          <w:sz w:val="21"/>
+          <w:szCs w:val="21"/>
+        </w:rPr>
+        <w:t xml:space="preserve">Coloured pencils and a facilitator pen, to draw the next step and scribe a few words when asked.</w:t>
+      </w:r>
+    </w:p>
+    <w:p>
+      <w:pPr>
+        <w:pStyle w:val="ListParagraph"/>
+        <w:numPr>
+          <w:ilvl w:val="0"/>
+          <w:numId w:val="1"/>
+        </w:numPr>
+        <w:spacing w:after="40"/>
+      </w:pPr>
+      <w:r>
+        <w:rPr>
+          <w:color w:val="041E42"/>
+          <w:sz w:val="21"/>
+          <w:szCs w:val="21"/>
+        </w:rPr>
+        <w:t xml:space="preserve">Sensitivity: some learners will feel they made little progress, or will have had a hard period through displacement or loss. Say clearly that an honest look back is not judging yourself, and that noticing one small step, or naming what got in the way, is real growth. No one must share, and a learner may only draw.</w:t>
+      </w:r>
+    </w:p>
+    <w:p>
+      <w:pPr>
+        <w:spacing w:after="40" w:before="140"/>
+      </w:pPr>
+      <w:r>
+        <w:rPr>
+          <w:b/>
+          <w:bCs/>
+          <w:color w:val="004976"/>
+          <w:sz w:val="22"/>
+          <w:szCs w:val="22"/>
+        </w:rPr>
+        <w:t xml:space="preserve">1. Turn through your workbook</w:t>
+      </w:r>
+      <w:r>
+        <w:rPr>
+          <w:color w:val="97999B"/>
+          <w:sz w:val="17"/>
+          <w:szCs w:val="17"/>
+        </w:rPr>
+        <w:t xml:space="preserve">   12-14 min</w:t>
+      </w:r>
+    </w:p>
+    <w:p>
+      <w:pPr>
+        <w:spacing w:after="80"/>
+      </w:pPr>
+      <w:r>
+        <w:rPr>
+          <w:color w:val="041E42"/>
+          <w:sz w:val="21"/>
+          <w:szCs w:val="21"/>
+        </w:rPr>
+        <w:t xml:space="preserve">Have learners lay open their workbook and turn through it: the goal on the first page, the marks and drawings they have made since. The point is to look back at something real, not a general memory. Give a quiet moment for each learner to find their first goal page and look at it again before they judge how far they have come. Walk round and help any learner who cannot find their goal.</w:t>
+      </w:r>
+    </w:p>
+    <w:p>
+      <w:pPr>
+        <w:spacing w:after="20"/>
+      </w:pPr>
+      <w:r>
+        <w:rPr>
+          <w:b/>
+          <w:bCs/>
+          <w:color w:val="8F993E"/>
+          <w:sz w:val="18"/>
+          <w:szCs w:val="18"/>
+        </w:rPr>
+        <w:t xml:space="preserve">Ask:</w:t>
+      </w:r>
+    </w:p>
+    <w:p>
+      <w:pPr>
+        <w:pStyle w:val="ListParagraph"/>
+        <w:numPr>
+          <w:ilvl w:val="0"/>
+          <w:numId w:val="1"/>
+        </w:numPr>
+        <w:spacing w:after="20"/>
+      </w:pPr>
+      <w:r>
+        <w:rPr>
+          <w:color w:val="041E42"/>
+          <w:sz w:val="20"/>
+          <w:szCs w:val="20"/>
+        </w:rPr>
+        <w:t xml:space="preserve">Turn to your goal page. What were you working towards when you started?</w:t>
+      </w:r>
+    </w:p>
+    <w:p>
+      <w:pPr>
+        <w:pStyle w:val="ListParagraph"/>
+        <w:numPr>
+          <w:ilvl w:val="0"/>
+          <w:numId w:val="1"/>
+        </w:numPr>
+        <w:spacing w:after="20"/>
+      </w:pPr>
+      <w:r>
+        <w:rPr>
+          <w:color w:val="041E42"/>
+          <w:sz w:val="20"/>
+          <w:szCs w:val="20"/>
+        </w:rPr>
+        <w:t xml:space="preserve">Turn through the marks you have made. Which one do you remember making?</w:t>
+      </w:r>
+    </w:p>
+    <w:p>
+      <w:pPr>
+        <w:spacing w:after="20" w:before="40"/>
+      </w:pPr>
+      <w:r>
+        <w:rPr>
+          <w:b/>
+          <w:bCs/>
+          <w:color w:val="BD472A"/>
+          <w:sz w:val="18"/>
+          <w:szCs w:val="18"/>
+        </w:rPr>
+        <w:t xml:space="preserve">Watch out:</w:t>
+      </w:r>
+    </w:p>
+    <w:p>
+      <w:pPr>
+        <w:pStyle w:val="ListParagraph"/>
+        <w:numPr>
+          <w:ilvl w:val="0"/>
+          <w:numId w:val="1"/>
+        </w:numPr>
+        <w:spacing w:after="20"/>
+      </w:pPr>
+      <w:r>
+        <w:rPr>
+          <w:color w:val="041E42"/>
+          <w:sz w:val="20"/>
+          <w:szCs w:val="20"/>
+        </w:rPr>
+        <w:t xml:space="preserve">A learner judges from memory and dismisses their progress; sit beside them and turn the pages with them, since the marks on the page are usually kinder and more accurate than the feeling.</w:t>
+      </w:r>
+    </w:p>
+    <w:p>
+      <w:pPr>
+        <w:spacing w:after="40" w:before="20"/>
+      </w:pPr>
+      <w:r>
+        <w:rPr>
+          <w:i/>
+          <w:iCs/>
+          <w:color w:val="6B7280"/>
+          <w:sz w:val="18"/>
+          <w:szCs w:val="18"/>
+        </w:rPr>
+        <w:t xml:space="preserve">If low-resource: If a learner's workbook is thin or was missed for a while, they say aloud what they set out to do and what they have done since; the look back at the original goal is the part that matters most.</w:t>
+      </w:r>
+    </w:p>
+    <w:p>
+      <w:pPr>
+        <w:spacing w:after="40" w:before="140"/>
+      </w:pPr>
+      <w:r>
+        <w:rPr>
+          <w:b/>
+          <w:bCs/>
+          <w:color w:val="004976"/>
+          <w:sz w:val="22"/>
+          <w:szCs w:val="22"/>
+        </w:rPr>
+        <w:t xml:space="preserve">2. See how far you have come</w:t>
+      </w:r>
+      <w:r>
+        <w:rPr>
+          <w:color w:val="97999B"/>
+          <w:sz w:val="17"/>
+          <w:szCs w:val="17"/>
+        </w:rPr>
+        <w:t xml:space="preserve">   16-18 min</w:t>
+      </w:r>
+    </w:p>
+    <w:p>
+      <w:pPr>
+        <w:spacing w:after="80"/>
+      </w:pPr>
+      <w:r>
+        <w:rPr>
+          <w:color w:val="041E42"/>
+          <w:sz w:val="21"/>
+          <w:szCs w:val="21"/>
+        </w:rPr>
+        <w:t xml:space="preserve">Work through spoken prompts against the workbook: which parts of the goal they have reached, where they made progress even if the goal is not finished, and what helped or got in the way. Say each prompt in the learners' own language and give time to point at the page in answer. Push gently against both inflation and dismissal. A goal half-reached, with real marks along the way, is progress worth naming aloud.</w:t>
+      </w:r>
+    </w:p>
+    <w:p>
+      <w:pPr>
+        <w:spacing w:after="20"/>
+      </w:pPr>
+      <w:r>
+        <w:rPr>
+          <w:b/>
+          <w:bCs/>
+          <w:color w:val="8F993E"/>
+          <w:sz w:val="18"/>
+          <w:szCs w:val="18"/>
+        </w:rPr>
+        <w:t xml:space="preserve">Ask:</w:t>
+      </w:r>
+    </w:p>
+    <w:p>
+      <w:pPr>
+        <w:pStyle w:val="ListParagraph"/>
+        <w:numPr>
+          <w:ilvl w:val="0"/>
+          <w:numId w:val="1"/>
+        </w:numPr>
+        <w:spacing w:after="20"/>
+      </w:pPr>
+      <w:r>
+        <w:rPr>
+          <w:color w:val="041E42"/>
+          <w:sz w:val="20"/>
+          <w:szCs w:val="20"/>
+        </w:rPr>
+        <w:t xml:space="preserve">Point to where you got closer to your goal, even if you have not finished it.</w:t>
+      </w:r>
+    </w:p>
+    <w:p>
+      <w:pPr>
+        <w:pStyle w:val="ListParagraph"/>
+        <w:numPr>
+          <w:ilvl w:val="0"/>
+          <w:numId w:val="1"/>
+        </w:numPr>
+        <w:spacing w:after="20"/>
+      </w:pPr>
+      <w:r>
+        <w:rPr>
+          <w:color w:val="041E42"/>
+          <w:sz w:val="20"/>
+          <w:szCs w:val="20"/>
+        </w:rPr>
+        <w:t xml:space="preserve">What helped you move forward, and what got in your way?</w:t>
+      </w:r>
+    </w:p>
+    <w:p>
+      <w:pPr>
+        <w:spacing w:after="20" w:before="40"/>
+      </w:pPr>
+      <w:r>
+        <w:rPr>
+          <w:b/>
+          <w:bCs/>
+          <w:color w:val="BD472A"/>
+          <w:sz w:val="18"/>
+          <w:szCs w:val="18"/>
+        </w:rPr>
+        <w:t xml:space="preserve">Watch out:</w:t>
+      </w:r>
+    </w:p>
+    <w:p>
+      <w:pPr>
+        <w:pStyle w:val="ListParagraph"/>
+        <w:numPr>
+          <w:ilvl w:val="0"/>
+          <w:numId w:val="1"/>
+        </w:numPr>
+        <w:spacing w:after="20"/>
+      </w:pPr>
+      <w:r>
+        <w:rPr>
+          <w:color w:val="041E42"/>
+          <w:sz w:val="20"/>
+          <w:szCs w:val="20"/>
+        </w:rPr>
+        <w:t xml:space="preserve">A learner sees only what they did not finish; help them count the small steps and the things they learned along the way, which is where most of the growth actually sits, and name one of them aloud for them.</w:t>
+      </w:r>
+    </w:p>
+    <w:p>
+      <w:pPr>
+        <w:spacing w:after="40" w:before="20"/>
+      </w:pPr>
+      <w:r>
+        <w:rPr>
+          <w:i/>
+          <w:iCs/>
+          <w:color w:val="6B7280"/>
+          <w:sz w:val="18"/>
+          <w:szCs w:val="18"/>
+        </w:rPr>
+        <w:t xml:space="preserve">If low-resource: Where looking back risks touching a hard period, let the learner choose a lower-stakes stretch of the book to talk about, and never require anyone to share the details aloud.</w:t>
+      </w:r>
+    </w:p>
+    <w:p>
+      <w:pPr>
+        <w:spacing w:after="40" w:before="140"/>
+      </w:pPr>
+      <w:r>
+        <w:rPr>
+          <w:b/>
+          <w:bCs/>
+          <w:color w:val="004976"/>
+          <w:sz w:val="22"/>
+          <w:szCs w:val="22"/>
+        </w:rPr>
+        <w:t xml:space="preserve">3. Name your growth and your next step</w:t>
+      </w:r>
+      <w:r>
+        <w:rPr>
+          <w:color w:val="97999B"/>
+          <w:sz w:val="17"/>
+          <w:szCs w:val="17"/>
+        </w:rPr>
+        <w:t xml:space="preserve">   16-18 min</w:t>
+      </w:r>
+    </w:p>
+    <w:p>
+      <w:pPr>
+        <w:spacing w:after="80"/>
+      </w:pPr>
+      <w:r>
+        <w:rPr>
+          <w:color w:val="041E42"/>
+          <w:sz w:val="21"/>
+          <w:szCs w:val="21"/>
+        </w:rPr>
+        <w:t xml:space="preserve">Move from what happened to what it means. Ask each learner to name one clear way they have grown as a learner, and to choose one thing to carry forward: a habit that worked, the same goal continued, or a new goal. Have them draw the next step on a fresh workbook page, scribing a word or two if they ask. Then each learner shows one piece of growth to their same-gender group, so progress is witnessed and the room sees how much has moved.</w:t>
+      </w:r>
+    </w:p>
+    <w:p>
+      <w:pPr>
+        <w:spacing w:after="20"/>
+      </w:pPr>
+      <w:r>
+        <w:rPr>
+          <w:b/>
+          <w:bCs/>
+          <w:color w:val="8F993E"/>
+          <w:sz w:val="18"/>
+          <w:szCs w:val="18"/>
+        </w:rPr>
+        <w:t xml:space="preserve">Ask:</w:t>
+      </w:r>
+    </w:p>
+    <w:p>
+      <w:pPr>
+        <w:pStyle w:val="ListParagraph"/>
+        <w:numPr>
+          <w:ilvl w:val="0"/>
+          <w:numId w:val="1"/>
+        </w:numPr>
+        <w:spacing w:after="20"/>
+      </w:pPr>
+      <w:r>
+        <w:rPr>
+          <w:color w:val="041E42"/>
+          <w:sz w:val="20"/>
+          <w:szCs w:val="20"/>
+        </w:rPr>
+        <w:t xml:space="preserve">What is one way you have grown as a learner in this time? Say it or show me the page.</w:t>
+      </w:r>
+    </w:p>
+    <w:p>
+      <w:pPr>
+        <w:pStyle w:val="ListParagraph"/>
+        <w:numPr>
+          <w:ilvl w:val="0"/>
+          <w:numId w:val="1"/>
+        </w:numPr>
+        <w:spacing w:after="20"/>
+      </w:pPr>
+      <w:r>
+        <w:rPr>
+          <w:color w:val="041E42"/>
+          <w:sz w:val="20"/>
+          <w:szCs w:val="20"/>
+        </w:rPr>
+        <w:t xml:space="preserve">What is your next goal, or the one thing you will carry forward? Draw it, and I will help you mark it.</w:t>
+      </w:r>
+    </w:p>
+    <w:p>
+      <w:pPr>
+        <w:spacing w:after="20" w:before="40"/>
+      </w:pPr>
+      <w:r>
+        <w:rPr>
+          <w:b/>
+          <w:bCs/>
+          <w:color w:val="BD472A"/>
+          <w:sz w:val="18"/>
+          <w:szCs w:val="18"/>
+        </w:rPr>
+        <w:t xml:space="preserve">Watch out:</w:t>
+      </w:r>
+    </w:p>
+    <w:p>
+      <w:pPr>
+        <w:pStyle w:val="ListParagraph"/>
+        <w:numPr>
+          <w:ilvl w:val="0"/>
+          <w:numId w:val="1"/>
+        </w:numPr>
+        <w:spacing w:after="20"/>
+      </w:pPr>
+      <w:r>
+        <w:rPr>
+          <w:color w:val="041E42"/>
+          <w:sz w:val="20"/>
+          <w:szCs w:val="20"/>
+        </w:rPr>
+        <w:t xml:space="preserve">The look back ends without a forward step; make sure every learner leaves with one concrete thing drawn to carry forward, so reflection feeds the next cycle rather than closing a door.</w:t>
+      </w:r>
+    </w:p>
+    <w:p>
+      <w:pPr>
+        <w:spacing w:after="40" w:before="20"/>
+      </w:pPr>
+      <w:r>
+        <w:rPr>
+          <w:i/>
+          <w:iCs/>
+          <w:color w:val="6B7280"/>
+          <w:sz w:val="18"/>
+          <w:szCs w:val="18"/>
+        </w:rPr>
+        <w:t xml:space="preserve">If low-resource: A learner who does not want to speak may hold up a drawing instead of saying anything, and that counts fully as sharing one piece of growth.</w:t>
+      </w:r>
+    </w:p>
+    <w:p>
+      <w:pPr>
+        <w:spacing w:after="40" w:before="160"/>
+      </w:pPr>
+      <w:r>
+        <w:rPr>
+          <w:b/>
+          <w:bCs/>
+          <w:color w:val="004976"/>
+          <w:spacing w:val="30"/>
+          <w:sz w:val="17"/>
+          <w:szCs w:val="17"/>
+        </w:rPr>
+        <w:t xml:space="preserve">CLOSING</w:t>
+      </w:r>
+    </w:p>
+    <w:p>
+      <w:pPr>
+        <w:spacing w:after="80"/>
+      </w:pPr>
+      <w:r>
+        <w:rPr>
+          <w:color w:val="041E42"/>
+          <w:sz w:val="21"/>
+          <w:szCs w:val="21"/>
+        </w:rPr>
+        <w:t xml:space="preserve">Ask several learners to show one piece of growth and one thing they will carry forward, by speaking or by holding up the page. Draw out how much the room has changed since the start. Say aloud that this look back, and the next goal it produced, go back into the workbook: growth is a cycle they now know how to run themselves. Independent task: before the next session, make one mark in your workbook about the next step you have chosen.</w:t>
+      </w:r>
+    </w:p>
+    <w:tbl>
+      <w:tblPr>
+        <w:tblW w:type="pct" w:w="100%"/>
+        <w:tblBorders>
+          <w:top w:val="none" w:color="FFFFFF" w:sz="0"/>
+          <w:left w:val="none" w:color="FFFFFF" w:sz="0"/>
+          <w:bottom w:val="none" w:color="FFFFFF" w:sz="0"/>
+          <w:right w:val="none" w:color="FFFFFF" w:sz="0"/>
+          <w:insideH w:val="none" w:color="FFFFFF" w:sz="0"/>
+          <w:insideV w:val="none" w:color="FFFFFF" w:sz="0"/>
+        </w:tblBorders>
+      </w:tblPr>
+      <w:tblGrid>
+        <w:gridCol w:w="100"/>
+      </w:tblGrid>
+      <w:tr>
+        <w:tc>
+          <w:tcPr>
+            <w:shd w:fill="E1EEF1" w:color="auto" w:val="clear"/>
+            <w:tcMar>
+              <w:top w:type="dxa" w:w="90"/>
+              <w:left w:type="dxa" w:w="140"/>
+              <w:bottom w:type="dxa" w:w="90"/>
+              <w:right w:type="dxa" w:w="140"/>
+            </w:tcMar>
+          </w:tcPr>
+          <w:p>
+            <w:pPr>
+              <w:spacing w:after="40"/>
+            </w:pPr>
+            <w:r>
+              <w:rPr>
+                <w:b/>
+                <w:bCs/>
+                <w:color w:val="3F8291"/>
+                <w:spacing w:val="30"/>
+                <w:sz w:val="15"/>
+                <w:szCs w:val="15"/>
+              </w:rPr>
+              <w:t xml:space="preserve">INDEPENDENT TASK (1H)</w:t>
+            </w:r>
+          </w:p>
+          <w:p>
+            <w:r>
+              <w:rPr>
+                <w:color w:val="041E42"/>
+                <w:sz w:val="21"/>
+                <w:szCs w:val="21"/>
+              </w:rPr>
+              <w:t xml:space="preserve">Look through your learning book and notice one way you have grown; be ready to share it.</w:t>
+            </w:r>
+          </w:p>
+        </w:tc>
+      </w:tr>
+    </w:tbl>
+    <w:p>
+      <w:pPr>
+        <w:spacing w:after="80" w:before="40"/>
+      </w:pPr>
+      <w:r>
+        <w:rPr>
+          <w:i/>
+          <w:iCs/>
+          <w:color w:val="6B7280"/>
+          <w:sz w:val="18"/>
+          <w:szCs w:val="18"/>
+        </w:rPr>
+        <w:t xml:space="preserve">Flex: The guided look back through the workbook stays in-person; noticing and preparing to share a growth is the independent reflection.</w:t>
       </w:r>
     </w:p>
     <w:sectPr>

</xml_diff>

<commit_message>
refactor: restructure AIL unit as a standalone 50-hour hours-based plan (not weeks)
- Unit model changes from weeks to hours: phases (orientation, the four
  objectives, consolidation) containing blocks with facilitatedHours /
  independentHours, plus connective blocks (orientation, goal-pursuit practice,
  showcase) that carry a description instead of a material. Totals validated to
  30h in-person + 20h independent = 50h.
- Times are generous (~1.5-2x a literate-group estimate) for this oral/visual,
  translated, largely pre-literate cohort; AIL is treated as a standalone
  component running one full self-directed-learning cycle on a real goal.
- Unit page and the three editable downloads (facilitator plan, workbook,
  slides) regenerated for the hours/phases structure.

Co-Authored-By: Claude Opus 4.8 <noreply@anthropic.com>
</commit_message>
<xml_diff>
--- a/public/downloads/agency-in-learning-facilitator-unit-plan.docx
+++ b/public/downloads/agency-in-learning-facilitator-unit-plan.docx
@@ -98,7 +98,7 @@
           <w:sz w:val="21"/>
           <w:szCs w:val="21"/>
         </w:rPr>
-        <w:t xml:space="preserve">A fully offline, oral and visual first scheme of work. The plan and the facilitator guidance sit together, so there is nothing to cross-reference during a session. Delivered in the language you use with learners, from this English text.</w:t>
+        <w:t xml:space="preserve">The full 50-hour plan for delivering the Agency in Learning component fully offline in the Cox's Bazar camps, as a standalone course. It is set out in hours, not weeks, so you can fit it into your own timetable over a minimum of 10 weeks. Learners run one full cycle of self-directed learning on a real goal of their own: understanding themselves, setting a goal, planning and taking steps, and tracking, using feedback, and reflecting on their growth. Times are deliberately generous, because oral and visual delivery with drawing and translation takes longer than it first appears.</w:t>
       </w:r>
     </w:p>
     <w:tbl>
@@ -140,7 +140,7 @@
                 <w:sz w:val="15"/>
                 <w:szCs w:val="15"/>
               </w:rPr>
-              <w:t xml:space="preserve">WEEKLY BUDGET</w:t>
+              <w:t xml:space="preserve">THE WHOLE COMPONENT</w:t>
             </w:r>
           </w:p>
           <w:p>
@@ -150,7 +150,7 @@
                 <w:sz w:val="21"/>
                 <w:szCs w:val="21"/>
               </w:rPr>
-              <w:t xml:space="preserve">3h in-person + 2h independent, across a minimum of 10 weeks. 4 weeks detailed here.</w:t>
+              <w:t xml:space="preserve">50 hours: 30h in-person + 20h independent. Set out in hours, not weeks, so you can fit it to your own timetable over a minimum of 10 weeks.</w:t>
             </w:r>
           </w:p>
         </w:tc>
@@ -191,22 +191,7 @@
           <w:sz w:val="40"/>
           <w:szCs w:val="40"/>
         </w:rPr>
-        <w:t xml:space="preserve">Week 1 — Understand yourself as a learner</w:t>
-      </w:r>
-    </w:p>
-    <w:p>
-      <w:pPr>
-        <w:spacing w:after="80"/>
-      </w:pPr>
-      <w:r>
-        <w:rPr>
-          <w:i/>
-          <w:iCs/>
-          <w:color w:val="6B7280"/>
-          <w:sz w:val="19"/>
-          <w:szCs w:val="19"/>
-        </w:rPr>
-        <w:t xml:space="preserve">Objective 1: Understand yourself as a learner as the basis for setting goals.</w:t>
+        <w:t xml:space="preserve">Phase 1 — Getting started</w:t>
       </w:r>
     </w:p>
     <w:tbl>
@@ -248,7 +233,7 @@
                 <w:sz w:val="15"/>
                 <w:szCs w:val="15"/>
               </w:rPr>
-              <w:t xml:space="preserve">OUTCOME OF THE WEEK</w:t>
+              <w:t xml:space="preserve">FOCUS OF THIS PHASE</w:t>
             </w:r>
           </w:p>
           <w:p>
@@ -258,7 +243,7 @@
                 <w:sz w:val="21"/>
                 <w:szCs w:val="21"/>
               </w:rPr>
-              <w:t xml:space="preserve">Each learner starts their Learner Profile: proof that their ability can grow, a picture of their strengths and the areas they want to grow, and an honest sense of how they learn best. This is the starting point their first learning goals (Week 2) will be held up against.</w:t>
+              <w:t xml:space="preserve">Build a safe, warm learning space and set up the learning book that runs through the whole course. Learners meet the big idea: here, a lot is chosen for you, but your own learning is yours to direct.</w:t>
             </w:r>
           </w:p>
         </w:tc>
@@ -274,12 +259,12 @@
           <w:sz w:val="19"/>
           <w:szCs w:val="19"/>
         </w:rPr>
-        <w:t xml:space="preserve">This week: 3h in-person · 2h independent, across 3 sessions.</w:t>
-      </w:r>
-    </w:p>
-    <w:p>
-      <w:pPr>
-        <w:spacing w:after="40" w:before="200"/>
+        <w:t xml:space="preserve">3h in-person · 30 min independent, across 2 blocks.</w:t>
+      </w:r>
+    </w:p>
+    <w:p>
+      <w:pPr>
+        <w:spacing w:after="20" w:before="200"/>
       </w:pPr>
       <w:r>
         <w:rPr>
@@ -289,7 +274,7 @@
           <w:sz w:val="26"/>
           <w:szCs w:val="26"/>
         </w:rPr>
-        <w:t xml:space="preserve">Session 1 — You can grow</w:t>
+        <w:t xml:space="preserve">Welcome and our learning space</w:t>
       </w:r>
     </w:p>
     <w:p>
@@ -300,11 +285,990 @@
         <w:rPr>
           <w:b/>
           <w:bCs/>
+          <w:color w:val="8A4E73"/>
+          <w:spacing w:val="20"/>
+          <w:sz w:val="15"/>
+          <w:szCs w:val="15"/>
+        </w:rPr>
+        <w:t xml:space="preserve">ORIENTATION   </w:t>
+      </w:r>
+      <w:r>
+        <w:rPr>
+          <w:b/>
+          <w:bCs/>
           <w:color w:val="3F8291"/>
           <w:sz w:val="18"/>
           <w:szCs w:val="18"/>
         </w:rPr>
-        <w:t xml:space="preserve">1h in-person · 30 min independent</w:t>
+        <w:t xml:space="preserve">1.5h in-person</w:t>
+      </w:r>
+    </w:p>
+    <w:p>
+      <w:pPr>
+        <w:spacing w:after="80"/>
+      </w:pPr>
+      <w:r>
+        <w:rPr>
+          <w:color w:val="041E42"/>
+          <w:sz w:val="21"/>
+          <w:szCs w:val="21"/>
+        </w:rPr>
+        <w:t xml:space="preserve">Open the course. Build a safe, welcoming space: names, a simple agreement about how the group treats each other, and reassurance that no one has to read, write, or share anything they would rather keep private. Introduce the big idea in your own words: many things here are decided by others, but what you learn is something you can choose, and this course is about taking hold of your own learning. Keep it warm, oral, and unhurried.</w:t>
+      </w:r>
+    </w:p>
+    <w:p>
+      <w:pPr>
+        <w:spacing w:after="20" w:before="200"/>
+      </w:pPr>
+      <w:r>
+        <w:rPr>
+          <w:b/>
+          <w:bCs/>
+          <w:color w:val="041E42"/>
+          <w:sz w:val="26"/>
+          <w:szCs w:val="26"/>
+        </w:rPr>
+        <w:t xml:space="preserve">Set up your learning book</w:t>
+      </w:r>
+    </w:p>
+    <w:p>
+      <w:pPr>
+        <w:spacing w:after="80"/>
+      </w:pPr>
+      <w:r>
+        <w:rPr>
+          <w:b/>
+          <w:bCs/>
+          <w:color w:val="8A4E73"/>
+          <w:spacing w:val="20"/>
+          <w:sz w:val="15"/>
+          <w:szCs w:val="15"/>
+        </w:rPr>
+        <w:t xml:space="preserve">ACTIVITY   </w:t>
+      </w:r>
+      <w:r>
+        <w:rPr>
+          <w:b/>
+          <w:bCs/>
+          <w:color w:val="3F8291"/>
+          <w:sz w:val="18"/>
+          <w:szCs w:val="18"/>
+        </w:rPr>
+        <w:t xml:space="preserve">1.5h in-person · 30 min independent</w:t>
+      </w:r>
+    </w:p>
+    <w:tbl>
+      <w:tblPr>
+        <w:tblW w:type="pct" w:w="100%"/>
+        <w:tblBorders>
+          <w:top w:val="none" w:color="FFFFFF" w:sz="0"/>
+          <w:left w:val="none" w:color="FFFFFF" w:sz="0"/>
+          <w:bottom w:val="none" w:color="FFFFFF" w:sz="0"/>
+          <w:right w:val="none" w:color="FFFFFF" w:sz="0"/>
+          <w:insideH w:val="none" w:color="FFFFFF" w:sz="0"/>
+          <w:insideV w:val="none" w:color="FFFFFF" w:sz="0"/>
+        </w:tblBorders>
+      </w:tblPr>
+      <w:tblGrid>
+        <w:gridCol w:w="100"/>
+      </w:tblGrid>
+      <w:tr>
+        <w:tc>
+          <w:tcPr>
+            <w:shd w:fill="FBEFE0" w:color="auto" w:val="clear"/>
+            <w:tcMar>
+              <w:top w:type="dxa" w:w="90"/>
+              <w:left w:type="dxa" w:w="140"/>
+              <w:bottom w:type="dxa" w:w="90"/>
+              <w:right w:type="dxa" w:w="140"/>
+            </w:tcMar>
+          </w:tcPr>
+          <w:p>
+            <w:pPr>
+              <w:spacing w:after="40"/>
+            </w:pPr>
+            <w:r>
+              <w:rPr>
+                <w:b/>
+                <w:bCs/>
+                <w:color w:val="EF9600"/>
+                <w:spacing w:val="30"/>
+                <w:sz w:val="15"/>
+                <w:szCs w:val="15"/>
+              </w:rPr>
+              <w:t xml:space="preserve">THE ONE THING TO GET RIGHT</w:t>
+            </w:r>
+          </w:p>
+          <w:p>
+            <w:r>
+              <w:rPr>
+                <w:color w:val="041E42"/>
+                <w:sz w:val="21"/>
+                <w:szCs w:val="21"/>
+              </w:rPr>
+              <w:t xml:space="preserve">This workbook is the spine the other Agency in Learning activities draw and mark into, so the one thing to get right is that it is easy and habitual, not a chore. Because most learners do not read or write, an entry is a drawing, a mark, a face, or a few words the facilitator scribes when asked, never a demand to write. A book a learner marks once a session beats a neat one they abandon. Say aloud, often, that there is no right way to keep it and one small drawing is enough, so no learner freezes at a blank page or hides an untidy one.</w:t>
+            </w:r>
+          </w:p>
+        </w:tc>
+      </w:tr>
+    </w:tbl>
+    <w:p>
+      <w:pPr>
+        <w:spacing w:after="40" w:before="160"/>
+      </w:pPr>
+      <w:r>
+        <w:rPr>
+          <w:b/>
+          <w:bCs/>
+          <w:color w:val="004976"/>
+          <w:spacing w:val="30"/>
+          <w:sz w:val="17"/>
+          <w:szCs w:val="17"/>
+        </w:rPr>
+        <w:t xml:space="preserve">PREPARE</w:t>
+      </w:r>
+    </w:p>
+    <w:p>
+      <w:pPr>
+        <w:pStyle w:val="ListParagraph"/>
+        <w:numPr>
+          <w:ilvl w:val="0"/>
+          <w:numId w:val="1"/>
+        </w:numPr>
+        <w:spacing w:after="40"/>
+      </w:pPr>
+      <w:r>
+        <w:rPr>
+          <w:color w:val="041E42"/>
+          <w:sz w:val="21"/>
+          <w:szCs w:val="21"/>
+        </w:rPr>
+        <w:t xml:space="preserve">The student workbook, one per learner, with blank picture pages and a place for their goal.</w:t>
+      </w:r>
+    </w:p>
+    <w:p>
+      <w:pPr>
+        <w:pStyle w:val="ListParagraph"/>
+        <w:numPr>
+          <w:ilvl w:val="0"/>
+          <w:numId w:val="1"/>
+        </w:numPr>
+        <w:spacing w:after="40"/>
+      </w:pPr>
+      <w:r>
+        <w:rPr>
+          <w:color w:val="041E42"/>
+          <w:sz w:val="21"/>
+          <w:szCs w:val="21"/>
+        </w:rPr>
+        <w:t xml:space="preserve">Coloured pencils or crayons the whole group can share, and a facilitator pen for scribing a few words when asked.</w:t>
+      </w:r>
+    </w:p>
+    <w:p>
+      <w:pPr>
+        <w:pStyle w:val="ListParagraph"/>
+        <w:numPr>
+          <w:ilvl w:val="0"/>
+          <w:numId w:val="1"/>
+        </w:numPr>
+        <w:spacing w:after="40"/>
+      </w:pPr>
+      <w:r>
+        <w:rPr>
+          <w:color w:val="041E42"/>
+          <w:sz w:val="21"/>
+          <w:szCs w:val="21"/>
+        </w:rPr>
+        <w:t xml:space="preserve">Your own simple example mark (one drawing plus one word), to show that a small mark is a full entry.</w:t>
+      </w:r>
+    </w:p>
+    <w:p>
+      <w:pPr>
+        <w:pStyle w:val="ListParagraph"/>
+        <w:numPr>
+          <w:ilvl w:val="0"/>
+          <w:numId w:val="1"/>
+        </w:numPr>
+        <w:spacing w:after="40"/>
+      </w:pPr>
+      <w:r>
+        <w:rPr>
+          <w:color w:val="041E42"/>
+          <w:sz w:val="21"/>
+          <w:szCs w:val="21"/>
+        </w:rPr>
+        <w:t xml:space="preserve">Sensitivity: a workbook can hold private things about home and family. Say clearly no one else reads it unless the learner chooses, and a learner may keep any page just for themselves.</w:t>
+      </w:r>
+    </w:p>
+    <w:p>
+      <w:pPr>
+        <w:spacing w:after="40" w:before="140"/>
+      </w:pPr>
+      <w:r>
+        <w:rPr>
+          <w:b/>
+          <w:bCs/>
+          <w:color w:val="004976"/>
+          <w:sz w:val="22"/>
+          <w:szCs w:val="22"/>
+        </w:rPr>
+        <w:t xml:space="preserve">1. Set up a book you can find and keep</w:t>
+      </w:r>
+      <w:r>
+        <w:rPr>
+          <w:color w:val="97999B"/>
+          <w:sz w:val="17"/>
+          <w:szCs w:val="17"/>
+        </w:rPr>
+        <w:t xml:space="preserve">   14-16 min</w:t>
+      </w:r>
+    </w:p>
+    <w:p>
+      <w:pPr>
+        <w:spacing w:after="80"/>
+      </w:pPr>
+      <w:r>
+        <w:rPr>
+          <w:color w:val="041E42"/>
+          <w:sz w:val="21"/>
+          <w:szCs w:val="21"/>
+        </w:rPr>
+        <w:t xml:space="preserve">Say aloud what the book is for: a private place where a learner keeps pictures of what they are learning across the whole programme, so they can see themselves grow. Hand out the workbooks and let each learner mark the front (their name, a drawing, or a mark only they know) so they can always find their own. Walk round and check every learner can recognise their book. The point is ownership, not neatness.</w:t>
+      </w:r>
+    </w:p>
+    <w:p>
+      <w:pPr>
+        <w:spacing w:after="20"/>
+      </w:pPr>
+      <w:r>
+        <w:rPr>
+          <w:b/>
+          <w:bCs/>
+          <w:color w:val="8F993E"/>
+          <w:sz w:val="18"/>
+          <w:szCs w:val="18"/>
+        </w:rPr>
+        <w:t xml:space="preserve">Ask:</w:t>
+      </w:r>
+    </w:p>
+    <w:p>
+      <w:pPr>
+        <w:pStyle w:val="ListParagraph"/>
+        <w:numPr>
+          <w:ilvl w:val="0"/>
+          <w:numId w:val="1"/>
+        </w:numPr>
+        <w:spacing w:after="20"/>
+      </w:pPr>
+      <w:r>
+        <w:rPr>
+          <w:color w:val="041E42"/>
+          <w:sz w:val="20"/>
+          <w:szCs w:val="20"/>
+        </w:rPr>
+        <w:t xml:space="preserve">Whose book is this, and how will you know it is yours when they are all stacked together?</w:t>
+      </w:r>
+    </w:p>
+    <w:p>
+      <w:pPr>
+        <w:pStyle w:val="ListParagraph"/>
+        <w:numPr>
+          <w:ilvl w:val="0"/>
+          <w:numId w:val="1"/>
+        </w:numPr>
+        <w:spacing w:after="20"/>
+      </w:pPr>
+      <w:r>
+        <w:rPr>
+          <w:color w:val="041E42"/>
+          <w:sz w:val="20"/>
+          <w:szCs w:val="20"/>
+        </w:rPr>
+        <w:t xml:space="preserve">What small mark or drawing could you put on the front so you find it fast?</w:t>
+      </w:r>
+    </w:p>
+    <w:p>
+      <w:pPr>
+        <w:spacing w:after="20" w:before="40"/>
+      </w:pPr>
+      <w:r>
+        <w:rPr>
+          <w:b/>
+          <w:bCs/>
+          <w:color w:val="BD472A"/>
+          <w:sz w:val="18"/>
+          <w:szCs w:val="18"/>
+        </w:rPr>
+        <w:t xml:space="preserve">Watch out:</w:t>
+      </w:r>
+    </w:p>
+    <w:p>
+      <w:pPr>
+        <w:pStyle w:val="ListParagraph"/>
+        <w:numPr>
+          <w:ilvl w:val="0"/>
+          <w:numId w:val="1"/>
+        </w:numPr>
+        <w:spacing w:after="20"/>
+      </w:pPr>
+      <w:r>
+        <w:rPr>
+          <w:color w:val="041E42"/>
+          <w:sz w:val="20"/>
+          <w:szCs w:val="20"/>
+        </w:rPr>
+        <w:t xml:space="preserve">A learner is anxious because they cannot write their name; offer to scribe it, or let a drawing or thumbprint be their mark, so no one is shamed at the very first step.</w:t>
+      </w:r>
+    </w:p>
+    <w:p>
+      <w:pPr>
+        <w:spacing w:after="40" w:before="20"/>
+      </w:pPr>
+      <w:r>
+        <w:rPr>
+          <w:i/>
+          <w:iCs/>
+          <w:color w:val="6B7280"/>
+          <w:sz w:val="18"/>
+          <w:szCs w:val="18"/>
+        </w:rPr>
+        <w:t xml:space="preserve">If low-resource: No printed book is needed if supply is short: a few stapled sheets or the back of a shared notebook works. The book being the learner's own, and findable again, matters far more than what it is made of.</w:t>
+      </w:r>
+    </w:p>
+    <w:p>
+      <w:pPr>
+        <w:spacing w:after="40" w:before="140"/>
+      </w:pPr>
+      <w:r>
+        <w:rPr>
+          <w:b/>
+          <w:bCs/>
+          <w:color w:val="004976"/>
+          <w:sz w:val="22"/>
+          <w:szCs w:val="22"/>
+        </w:rPr>
+        <w:t xml:space="preserve">2. Put your goal on the first page</w:t>
+      </w:r>
+      <w:r>
+        <w:rPr>
+          <w:color w:val="97999B"/>
+          <w:sz w:val="17"/>
+          <w:szCs w:val="17"/>
+        </w:rPr>
+        <w:t xml:space="preserve">   14-16 min</w:t>
+      </w:r>
+    </w:p>
+    <w:p>
+      <w:pPr>
+        <w:spacing w:after="80"/>
+      </w:pPr>
+      <w:r>
+        <w:rPr>
+          <w:color w:val="041E42"/>
+          <w:sz w:val="21"/>
+          <w:szCs w:val="21"/>
+        </w:rPr>
+        <w:t xml:space="preserve">Have each learner draw or mark their learning goal on the first page: the thing they are working towards, as a picture. If a learner wants a word or two added, scribe it for them beside the drawing. Anchoring the book to a real goal is what makes later marks meaningful, because the learner has something concrete to track against, not a blank page. Keep it to one goal so the page stays light.</w:t>
+      </w:r>
+    </w:p>
+    <w:p>
+      <w:pPr>
+        <w:spacing w:after="20"/>
+      </w:pPr>
+      <w:r>
+        <w:rPr>
+          <w:b/>
+          <w:bCs/>
+          <w:color w:val="8F993E"/>
+          <w:sz w:val="18"/>
+          <w:szCs w:val="18"/>
+        </w:rPr>
+        <w:t xml:space="preserve">Ask:</w:t>
+      </w:r>
+    </w:p>
+    <w:p>
+      <w:pPr>
+        <w:pStyle w:val="ListParagraph"/>
+        <w:numPr>
+          <w:ilvl w:val="0"/>
+          <w:numId w:val="1"/>
+        </w:numPr>
+        <w:spacing w:after="20"/>
+      </w:pPr>
+      <w:r>
+        <w:rPr>
+          <w:color w:val="041E42"/>
+          <w:sz w:val="20"/>
+          <w:szCs w:val="20"/>
+        </w:rPr>
+        <w:t xml:space="preserve">What are you working towards? Draw it, or show me and I will help you mark it.</w:t>
+      </w:r>
+    </w:p>
+    <w:p>
+      <w:pPr>
+        <w:pStyle w:val="ListParagraph"/>
+        <w:numPr>
+          <w:ilvl w:val="0"/>
+          <w:numId w:val="1"/>
+        </w:numPr>
+        <w:spacing w:after="20"/>
+      </w:pPr>
+      <w:r>
+        <w:rPr>
+          <w:color w:val="041E42"/>
+          <w:sz w:val="20"/>
+          <w:szCs w:val="20"/>
+        </w:rPr>
+        <w:t xml:space="preserve">When you turn to this page next time, what will remind you what you were aiming for?</w:t>
+      </w:r>
+    </w:p>
+    <w:p>
+      <w:pPr>
+        <w:spacing w:after="20" w:before="40"/>
+      </w:pPr>
+      <w:r>
+        <w:rPr>
+          <w:b/>
+          <w:bCs/>
+          <w:color w:val="BD472A"/>
+          <w:sz w:val="18"/>
+          <w:szCs w:val="18"/>
+        </w:rPr>
+        <w:t xml:space="preserve">Watch out:</w:t>
+      </w:r>
+    </w:p>
+    <w:p>
+      <w:pPr>
+        <w:pStyle w:val="ListParagraph"/>
+        <w:numPr>
+          <w:ilvl w:val="0"/>
+          <w:numId w:val="1"/>
+        </w:numPr>
+        <w:spacing w:after="20"/>
+      </w:pPr>
+      <w:r>
+        <w:rPr>
+          <w:color w:val="041E42"/>
+          <w:sz w:val="20"/>
+          <w:szCs w:val="20"/>
+        </w:rPr>
+        <w:t xml:space="preserve">A learner copies a neighbour's goal picture because they are unsure; kneel beside them and ask what they themselves want, then help them mark their own, so the book starts from their real goal.</w:t>
+      </w:r>
+    </w:p>
+    <w:p>
+      <w:pPr>
+        <w:spacing w:after="40" w:before="20"/>
+      </w:pPr>
+      <w:r>
+        <w:rPr>
+          <w:i/>
+          <w:iCs/>
+          <w:color w:val="6B7280"/>
+          <w:sz w:val="18"/>
+          <w:szCs w:val="18"/>
+        </w:rPr>
+        <w:t xml:space="preserve">If low-resource: If a learner has not set a goal yet, they draw one thing they want to get better at. A rough picture is plenty; the book can hold a clearer goal later without being restarted.</w:t>
+      </w:r>
+    </w:p>
+    <w:p>
+      <w:pPr>
+        <w:spacing w:after="40" w:before="140"/>
+      </w:pPr>
+      <w:r>
+        <w:rPr>
+          <w:b/>
+          <w:bCs/>
+          <w:color w:val="004976"/>
+          <w:sz w:val="22"/>
+          <w:szCs w:val="22"/>
+        </w:rPr>
+        <w:t xml:space="preserve">3. Make one small mark live</w:t>
+      </w:r>
+      <w:r>
+        <w:rPr>
+          <w:color w:val="97999B"/>
+          <w:sz w:val="17"/>
+          <w:szCs w:val="17"/>
+        </w:rPr>
+        <w:t xml:space="preserve">   14-16 min</w:t>
+      </w:r>
+    </w:p>
+    <w:p>
+      <w:pPr>
+        <w:spacing w:after="80"/>
+      </w:pPr>
+      <w:r>
+        <w:rPr>
+          <w:color w:val="041E42"/>
+          <w:sz w:val="21"/>
+          <w:szCs w:val="21"/>
+        </w:rPr>
+        <w:t xml:space="preserve">Break the empty page at once. Show your own example (one drawing and one word), then give quiet time for each learner to make one small mark about today: something they did, or a face for how the learning felt. Offer to scribe a few words for any learner who points and tells you. The point is to prove a mark can be quick and honest, so the book never feels like a task a learner has to steel themselves for.</w:t>
+      </w:r>
+    </w:p>
+    <w:p>
+      <w:pPr>
+        <w:spacing w:after="20"/>
+      </w:pPr>
+      <w:r>
+        <w:rPr>
+          <w:b/>
+          <w:bCs/>
+          <w:color w:val="8F993E"/>
+          <w:sz w:val="18"/>
+          <w:szCs w:val="18"/>
+        </w:rPr>
+        <w:t xml:space="preserve">Ask:</w:t>
+      </w:r>
+    </w:p>
+    <w:p>
+      <w:pPr>
+        <w:pStyle w:val="ListParagraph"/>
+        <w:numPr>
+          <w:ilvl w:val="0"/>
+          <w:numId w:val="1"/>
+        </w:numPr>
+        <w:spacing w:after="20"/>
+      </w:pPr>
+      <w:r>
+        <w:rPr>
+          <w:color w:val="041E42"/>
+          <w:sz w:val="20"/>
+          <w:szCs w:val="20"/>
+        </w:rPr>
+        <w:t xml:space="preserve">What is one thing you did today towards your goal? Draw it, however small.</w:t>
+      </w:r>
+    </w:p>
+    <w:p>
+      <w:pPr>
+        <w:pStyle w:val="ListParagraph"/>
+        <w:numPr>
+          <w:ilvl w:val="0"/>
+          <w:numId w:val="1"/>
+        </w:numPr>
+        <w:spacing w:after="20"/>
+      </w:pPr>
+      <w:r>
+        <w:rPr>
+          <w:color w:val="041E42"/>
+          <w:sz w:val="20"/>
+          <w:szCs w:val="20"/>
+        </w:rPr>
+        <w:t xml:space="preserve">How did today feel? Point to a face, or make a mark for it, and I will add a word if you like.</w:t>
+      </w:r>
+    </w:p>
+    <w:p>
+      <w:pPr>
+        <w:spacing w:after="20" w:before="40"/>
+      </w:pPr>
+      <w:r>
+        <w:rPr>
+          <w:b/>
+          <w:bCs/>
+          <w:color w:val="BD472A"/>
+          <w:sz w:val="18"/>
+          <w:szCs w:val="18"/>
+        </w:rPr>
+        <w:t xml:space="preserve">Watch out:</w:t>
+      </w:r>
+    </w:p>
+    <w:p>
+      <w:pPr>
+        <w:pStyle w:val="ListParagraph"/>
+        <w:numPr>
+          <w:ilvl w:val="0"/>
+          <w:numId w:val="1"/>
+        </w:numPr>
+        <w:spacing w:after="20"/>
+      </w:pPr>
+      <w:r>
+        <w:rPr>
+          <w:color w:val="041E42"/>
+          <w:sz w:val="20"/>
+          <w:szCs w:val="20"/>
+        </w:rPr>
+        <w:t xml:space="preserve">A learner freezes because they think the mark must be big or beautiful; say aloud that one small drawing is a full entry, and show just how quick and rough yours was.</w:t>
+      </w:r>
+    </w:p>
+    <w:p>
+      <w:pPr>
+        <w:spacing w:after="40" w:before="20"/>
+      </w:pPr>
+      <w:r>
+        <w:rPr>
+          <w:i/>
+          <w:iCs/>
+          <w:color w:val="6B7280"/>
+          <w:sz w:val="18"/>
+          <w:szCs w:val="18"/>
+        </w:rPr>
+        <w:t xml:space="preserve">If low-resource: If time is very short, one face or one mark against one prompt is a complete entry. One real mark made in the room is worth more than a fuller page promised for later.</w:t>
+      </w:r>
+    </w:p>
+    <w:p>
+      <w:pPr>
+        <w:spacing w:after="40" w:before="140"/>
+      </w:pPr>
+      <w:r>
+        <w:rPr>
+          <w:b/>
+          <w:bCs/>
+          <w:color w:val="004976"/>
+          <w:sz w:val="22"/>
+          <w:szCs w:val="22"/>
+        </w:rPr>
+        <w:t xml:space="preserve">4. Agree one moment each session</w:t>
+      </w:r>
+      <w:r>
+        <w:rPr>
+          <w:color w:val="97999B"/>
+          <w:sz w:val="17"/>
+          <w:szCs w:val="17"/>
+        </w:rPr>
+        <w:t xml:space="preserve">   12-14 min</w:t>
+      </w:r>
+    </w:p>
+    <w:p>
+      <w:pPr>
+        <w:spacing w:after="80"/>
+      </w:pPr>
+      <w:r>
+        <w:rPr>
+          <w:color w:val="041E42"/>
+          <w:sz w:val="21"/>
+          <w:szCs w:val="21"/>
+        </w:rPr>
+        <w:t xml:space="preserve">Turn the one mark into a habit. Agree together a fixed moment for marking the book (the last few minutes of each session, before anyone leaves), so it does not depend on remembering. Say clearly what counts as done: one drawing or one mark. Tell learners the book will be opened again in the goal-setting, feedback, and reflection sessions, so they know it is going somewhere.</w:t>
+      </w:r>
+    </w:p>
+    <w:p>
+      <w:pPr>
+        <w:spacing w:after="20"/>
+      </w:pPr>
+      <w:r>
+        <w:rPr>
+          <w:b/>
+          <w:bCs/>
+          <w:color w:val="8F993E"/>
+          <w:sz w:val="18"/>
+          <w:szCs w:val="18"/>
+        </w:rPr>
+        <w:t xml:space="preserve">Ask:</w:t>
+      </w:r>
+    </w:p>
+    <w:p>
+      <w:pPr>
+        <w:pStyle w:val="ListParagraph"/>
+        <w:numPr>
+          <w:ilvl w:val="0"/>
+          <w:numId w:val="1"/>
+        </w:numPr>
+        <w:spacing w:after="20"/>
+      </w:pPr>
+      <w:r>
+        <w:rPr>
+          <w:color w:val="041E42"/>
+          <w:sz w:val="20"/>
+          <w:szCs w:val="20"/>
+        </w:rPr>
+        <w:t xml:space="preserve">When exactly will we mark our books each time, so no one has to remember on their own?</w:t>
+      </w:r>
+    </w:p>
+    <w:p>
+      <w:pPr>
+        <w:pStyle w:val="ListParagraph"/>
+        <w:numPr>
+          <w:ilvl w:val="0"/>
+          <w:numId w:val="1"/>
+        </w:numPr>
+        <w:spacing w:after="20"/>
+      </w:pPr>
+      <w:r>
+        <w:rPr>
+          <w:color w:val="041E42"/>
+          <w:sz w:val="20"/>
+          <w:szCs w:val="20"/>
+        </w:rPr>
+        <w:t xml:space="preserve">What is the smallest mark that still counts as done for the day?</w:t>
+      </w:r>
+    </w:p>
+    <w:p>
+      <w:pPr>
+        <w:spacing w:after="20" w:before="40"/>
+      </w:pPr>
+      <w:r>
+        <w:rPr>
+          <w:b/>
+          <w:bCs/>
+          <w:color w:val="BD472A"/>
+          <w:sz w:val="18"/>
+          <w:szCs w:val="18"/>
+        </w:rPr>
+        <w:t xml:space="preserve">Watch out:</w:t>
+      </w:r>
+    </w:p>
+    <w:p>
+      <w:pPr>
+        <w:pStyle w:val="ListParagraph"/>
+        <w:numPr>
+          <w:ilvl w:val="0"/>
+          <w:numId w:val="1"/>
+        </w:numPr>
+        <w:spacing w:after="20"/>
+      </w:pPr>
+      <w:r>
+        <w:rPr>
+          <w:color w:val="041E42"/>
+          <w:sz w:val="20"/>
+          <w:szCs w:val="20"/>
+        </w:rPr>
+        <w:t xml:space="preserve">The group agrees an over-ambitious routine (a full drawing every day at home) that will collapse; steer them to one small mark at a fixed moment in the room, and say it can grow later if it works.</w:t>
+      </w:r>
+    </w:p>
+    <w:p>
+      <w:pPr>
+        <w:spacing w:after="40" w:before="160"/>
+      </w:pPr>
+      <w:r>
+        <w:rPr>
+          <w:b/>
+          <w:bCs/>
+          <w:color w:val="004976"/>
+          <w:spacing w:val="30"/>
+          <w:sz w:val="17"/>
+          <w:szCs w:val="17"/>
+        </w:rPr>
+        <w:t xml:space="preserve">CLOSING</w:t>
+      </w:r>
+    </w:p>
+    <w:p>
+      <w:pPr>
+        <w:spacing w:after="80"/>
+      </w:pPr>
+      <w:r>
+        <w:rPr>
+          <w:color w:val="041E42"/>
+          <w:sz w:val="21"/>
+          <w:szCs w:val="21"/>
+        </w:rPr>
+        <w:t xml:space="preserve">Ask two or three learners to hold up their book and show the front they made and their goal page, not the private marks inside, which stay theirs. Say aloud that this book is a living thing the other sessions will build on: goals go in it, small marks are made in it each time, and growth is looked back on from it. A kept book is how a learner watches their own learning move. Independent task: before the next session, make one small mark or drawing in your book about something you learned or did.</w:t>
+      </w:r>
+    </w:p>
+    <w:tbl>
+      <w:tblPr>
+        <w:tblW w:type="pct" w:w="100%"/>
+        <w:tblBorders>
+          <w:top w:val="none" w:color="FFFFFF" w:sz="0"/>
+          <w:left w:val="none" w:color="FFFFFF" w:sz="0"/>
+          <w:bottom w:val="none" w:color="FFFFFF" w:sz="0"/>
+          <w:right w:val="none" w:color="FFFFFF" w:sz="0"/>
+          <w:insideH w:val="none" w:color="FFFFFF" w:sz="0"/>
+          <w:insideV w:val="none" w:color="FFFFFF" w:sz="0"/>
+        </w:tblBorders>
+      </w:tblPr>
+      <w:tblGrid>
+        <w:gridCol w:w="100"/>
+      </w:tblGrid>
+      <w:tr>
+        <w:tc>
+          <w:tcPr>
+            <w:shd w:fill="E1EEF1" w:color="auto" w:val="clear"/>
+            <w:tcMar>
+              <w:top w:type="dxa" w:w="90"/>
+              <w:left w:type="dxa" w:w="140"/>
+              <w:bottom w:type="dxa" w:w="90"/>
+              <w:right w:type="dxa" w:w="140"/>
+            </w:tcMar>
+          </w:tcPr>
+          <w:p>
+            <w:pPr>
+              <w:spacing w:after="40"/>
+            </w:pPr>
+            <w:r>
+              <w:rPr>
+                <w:b/>
+                <w:bCs/>
+                <w:color w:val="3F8291"/>
+                <w:spacing w:val="30"/>
+                <w:sz w:val="15"/>
+                <w:szCs w:val="15"/>
+              </w:rPr>
+              <w:t xml:space="preserve">INDEPENDENT TASK (30 MIN)</w:t>
+            </w:r>
+          </w:p>
+          <w:p>
+            <w:r>
+              <w:rPr>
+                <w:color w:val="041E42"/>
+                <w:sz w:val="21"/>
+                <w:szCs w:val="21"/>
+              </w:rPr>
+              <w:t xml:space="preserve">Make one small mark or drawing in your learning book before the next session.</w:t>
+            </w:r>
+          </w:p>
+        </w:tc>
+      </w:tr>
+    </w:tbl>
+    <w:p>
+      <w:pPr>
+        <w:spacing w:after="80" w:before="40"/>
+      </w:pPr>
+      <w:r>
+        <w:rPr>
+          <w:i/>
+          <w:iCs/>
+          <w:color w:val="6B7280"/>
+          <w:sz w:val="18"/>
+          <w:szCs w:val="18"/>
+        </w:rPr>
+        <w:t xml:space="preserve">Note: Set up early so the book runs through the whole course: learners draw and mark into it in every phase, and it becomes the record of their growth.</w:t>
+      </w:r>
+    </w:p>
+    <w:p>
+      <w:r>
+        <w:br w:type="page"/>
+      </w:r>
+    </w:p>
+    <w:p>
+      <w:pPr>
+        <w:pBdr>
+          <w:bottom w:val="single" w:color="8F993E" w:sz="12" w:space="6"/>
+        </w:pBdr>
+        <w:spacing w:after="60" w:before="240"/>
+      </w:pPr>
+      <w:r>
+        <w:rPr>
+          <w:b/>
+          <w:bCs/>
+          <w:color w:val="004976"/>
+          <w:sz w:val="40"/>
+          <w:szCs w:val="40"/>
+        </w:rPr>
+        <w:t xml:space="preserve">Phase 2 — Understand yourself as a learner</w:t>
+      </w:r>
+    </w:p>
+    <w:p>
+      <w:pPr>
+        <w:spacing w:after="80"/>
+      </w:pPr>
+      <w:r>
+        <w:rPr>
+          <w:i/>
+          <w:iCs/>
+          <w:color w:val="6B7280"/>
+          <w:sz w:val="19"/>
+          <w:szCs w:val="19"/>
+        </w:rPr>
+        <w:t xml:space="preserve">Objective 1: Understand yourself as a learner as the basis for setting goals.</w:t>
+      </w:r>
+    </w:p>
+    <w:tbl>
+      <w:tblPr>
+        <w:tblW w:type="pct" w:w="100%"/>
+        <w:tblBorders>
+          <w:top w:val="none" w:color="FFFFFF" w:sz="0"/>
+          <w:left w:val="none" w:color="FFFFFF" w:sz="0"/>
+          <w:bottom w:val="none" w:color="FFFFFF" w:sz="0"/>
+          <w:right w:val="none" w:color="FFFFFF" w:sz="0"/>
+          <w:insideH w:val="none" w:color="FFFFFF" w:sz="0"/>
+          <w:insideV w:val="none" w:color="FFFFFF" w:sz="0"/>
+        </w:tblBorders>
+      </w:tblPr>
+      <w:tblGrid>
+        <w:gridCol w:w="100"/>
+      </w:tblGrid>
+      <w:tr>
+        <w:tc>
+          <w:tcPr>
+            <w:shd w:fill="FCEFC9" w:color="auto" w:val="clear"/>
+            <w:tcMar>
+              <w:top w:type="dxa" w:w="90"/>
+              <w:left w:type="dxa" w:w="140"/>
+              <w:bottom w:type="dxa" w:w="90"/>
+              <w:right w:type="dxa" w:w="140"/>
+            </w:tcMar>
+          </w:tcPr>
+          <w:p>
+            <w:pPr>
+              <w:spacing w:after="40"/>
+            </w:pPr>
+            <w:r>
+              <w:rPr>
+                <w:b/>
+                <w:bCs/>
+                <w:color w:val="EF9600"/>
+                <w:spacing w:val="30"/>
+                <w:sz w:val="15"/>
+                <w:szCs w:val="15"/>
+              </w:rPr>
+              <w:t xml:space="preserve">FOCUS OF THIS PHASE</w:t>
+            </w:r>
+          </w:p>
+          <w:p>
+            <w:r>
+              <w:rPr>
+                <w:color w:val="041E42"/>
+                <w:sz w:val="21"/>
+                <w:szCs w:val="21"/>
+              </w:rPr>
+              <w:t xml:space="preserve">Learners build a Learner Profile: proof that their ability can grow, a picture of their strengths and the areas they want to grow, and an honest sense of how they learn best. It is the starting point their goal is built from.</w:t>
+            </w:r>
+          </w:p>
+        </w:tc>
+      </w:tr>
+    </w:tbl>
+    <w:p>
+      <w:pPr>
+        <w:spacing w:after="120" w:before="80"/>
+      </w:pPr>
+      <w:r>
+        <w:rPr>
+          <w:color w:val="97999B"/>
+          <w:sz w:val="19"/>
+          <w:szCs w:val="19"/>
+        </w:rPr>
+        <w:t xml:space="preserve">6h in-person · 3h independent, across 3 blocks.</w:t>
+      </w:r>
+    </w:p>
+    <w:p>
+      <w:pPr>
+        <w:spacing w:after="20" w:before="200"/>
+      </w:pPr>
+      <w:r>
+        <w:rPr>
+          <w:b/>
+          <w:bCs/>
+          <w:color w:val="041E42"/>
+          <w:sz w:val="26"/>
+          <w:szCs w:val="26"/>
+        </w:rPr>
+        <w:t xml:space="preserve">You can grow</w:t>
+      </w:r>
+    </w:p>
+    <w:p>
+      <w:pPr>
+        <w:spacing w:after="80"/>
+      </w:pPr>
+      <w:r>
+        <w:rPr>
+          <w:b/>
+          <w:bCs/>
+          <w:color w:val="8A4E73"/>
+          <w:spacing w:val="20"/>
+          <w:sz w:val="15"/>
+          <w:szCs w:val="15"/>
+        </w:rPr>
+        <w:t xml:space="preserve">ACTIVITY   </w:t>
+      </w:r>
+      <w:r>
+        <w:rPr>
+          <w:b/>
+          <w:bCs/>
+          <w:color w:val="3F8291"/>
+          <w:sz w:val="18"/>
+          <w:szCs w:val="18"/>
+        </w:rPr>
+        <w:t xml:space="preserve">2h in-person · 1h independent</w:t>
       </w:r>
     </w:p>
     <w:tbl>
@@ -1028,7 +1992,7 @@
                 <w:sz w:val="15"/>
                 <w:szCs w:val="15"/>
               </w:rPr>
-              <w:t xml:space="preserve">INDEPENDENT TASK (30 MIN)</w:t>
+              <w:t xml:space="preserve">INDEPENDENT TASK (1H)</w:t>
             </w:r>
           </w:p>
           <w:p>
@@ -1046,22 +2010,7 @@
     </w:tbl>
     <w:p>
       <w:pPr>
-        <w:spacing w:after="80" w:before="40"/>
-      </w:pPr>
-      <w:r>
-        <w:rPr>
-          <w:i/>
-          <w:iCs/>
-          <w:color w:val="6B7280"/>
-          <w:sz w:val="18"/>
-          <w:szCs w:val="18"/>
-        </w:rPr>
-        <w:t xml:space="preserve">Flex: If contact time is short, the drawing (remembering a time you grew) and the "not yet" step can be set as independent work from the workbook; keep the opening frame and the closing share in-person.</w:t>
-      </w:r>
-    </w:p>
-    <w:p>
-      <w:pPr>
-        <w:spacing w:after="40" w:before="200"/>
+        <w:spacing w:after="20" w:before="200"/>
       </w:pPr>
       <w:r>
         <w:rPr>
@@ -1071,7 +2020,7 @@
           <w:sz w:val="26"/>
           <w:szCs w:val="26"/>
         </w:rPr>
-        <w:t xml:space="preserve">Session 2 — What I am good at, what I want to grow</w:t>
+        <w:t xml:space="preserve">What I am good at, what I want to grow</w:t>
       </w:r>
     </w:p>
     <w:p>
@@ -1082,11 +2031,22 @@
         <w:rPr>
           <w:b/>
           <w:bCs/>
+          <w:color w:val="8A4E73"/>
+          <w:spacing w:val="20"/>
+          <w:sz w:val="15"/>
+          <w:szCs w:val="15"/>
+        </w:rPr>
+        <w:t xml:space="preserve">ACTIVITY   </w:t>
+      </w:r>
+      <w:r>
+        <w:rPr>
+          <w:b/>
+          <w:bCs/>
           <w:color w:val="3F8291"/>
           <w:sz w:val="18"/>
           <w:szCs w:val="18"/>
         </w:rPr>
-        <w:t xml:space="preserve">1h in-person · 30 min independent</w:t>
+        <w:t xml:space="preserve">2h in-person · 1h independent</w:t>
       </w:r>
     </w:p>
     <w:tbl>
@@ -1810,7 +2770,7 @@
                 <w:sz w:val="15"/>
                 <w:szCs w:val="15"/>
               </w:rPr>
-              <w:t xml:space="preserve">INDEPENDENT TASK (30 MIN)</w:t>
+              <w:t xml:space="preserve">INDEPENDENT TASK (1H)</w:t>
             </w:r>
           </w:p>
           <w:p>
@@ -1820,7 +2780,7 @@
                 <w:sz w:val="21"/>
                 <w:szCs w:val="21"/>
               </w:rPr>
-              <w:t xml:space="preserve">Ask one or two people who know you well what you are good at as a learner, and mark it on your workbook page.</w:t>
+              <w:t xml:space="preserve">Ask one or two people who know you well what you are good at as a learner, and mark it in your book.</w:t>
             </w:r>
           </w:p>
         </w:tc>
@@ -1828,22 +2788,7 @@
     </w:tbl>
     <w:p>
       <w:pPr>
-        <w:spacing w:after="80" w:before="40"/>
-      </w:pPr>
-      <w:r>
-        <w:rPr>
-          <w:i/>
-          <w:iCs/>
-          <w:color w:val="6B7280"/>
-          <w:sz w:val="18"/>
-          <w:szCs w:val="18"/>
-        </w:rPr>
-        <w:t xml:space="preserve">Flex: The peer round must stay in-person, it is the engine of the activity; the private mapping of strengths and areas can move to independent work if needed.</w:t>
-      </w:r>
-    </w:p>
-    <w:p>
-      <w:pPr>
-        <w:spacing w:after="40" w:before="200"/>
+        <w:spacing w:after="20" w:before="200"/>
       </w:pPr>
       <w:r>
         <w:rPr>
@@ -1853,7 +2798,7 @@
           <w:sz w:val="26"/>
           <w:szCs w:val="26"/>
         </w:rPr>
-        <w:t xml:space="preserve">Session 3 — How I learn best</w:t>
+        <w:t xml:space="preserve">How I learn best</w:t>
       </w:r>
     </w:p>
     <w:p>
@@ -1864,11 +2809,22 @@
         <w:rPr>
           <w:b/>
           <w:bCs/>
+          <w:color w:val="8A4E73"/>
+          <w:spacing w:val="20"/>
+          <w:sz w:val="15"/>
+          <w:szCs w:val="15"/>
+        </w:rPr>
+        <w:t xml:space="preserve">ACTIVITY   </w:t>
+      </w:r>
+      <w:r>
+        <w:rPr>
+          <w:b/>
+          <w:bCs/>
           <w:color w:val="3F8291"/>
           <w:sz w:val="18"/>
           <w:szCs w:val="18"/>
         </w:rPr>
-        <w:t xml:space="preserve">1h in-person · 1h independent</w:t>
+        <w:t xml:space="preserve">2h in-person · 1h independent</w:t>
       </w:r>
     </w:p>
     <w:tbl>
@@ -2599,28 +3555,13 @@
                 <w:sz w:val="21"/>
                 <w:szCs w:val="21"/>
               </w:rPr>
-              <w:t xml:space="preserve">Over the next two days, notice when and where you focus best, and mark it on your workbook picture-clock.</w:t>
+              <w:t xml:space="preserve">Over the next few days, notice when and where you focus best, and mark it on your workbook picture-clock.</w:t>
             </w:r>
           </w:p>
         </w:tc>
       </w:tr>
     </w:tbl>
     <w:p>
-      <w:pPr>
-        <w:spacing w:after="80" w:before="40"/>
-      </w:pPr>
-      <w:r>
-        <w:rPr>
-          <w:i/>
-          <w:iCs/>
-          <w:color w:val="6B7280"/>
-          <w:sz w:val="18"/>
-          <w:szCs w:val="18"/>
-        </w:rPr>
-        <w:t xml:space="preserve">Flex: The two-day noticing task is independent by design and doubles as the week's independent learning practice; the reflection and the compare-with-a-partner step stay in-person.</w:t>
-      </w:r>
-    </w:p>
-    <w:p>
       <w:r>
         <w:br w:type="page"/>
       </w:r>
@@ -2640,7 +3581,7 @@
           <w:sz w:val="40"/>
           <w:szCs w:val="40"/>
         </w:rPr>
-        <w:t xml:space="preserve">Week 2 — Set clear, meaningful learning goals</w:t>
+        <w:t xml:space="preserve">Phase 3 — Set clear, meaningful learning goals</w:t>
       </w:r>
     </w:p>
     <w:p>
@@ -2697,7 +3638,7 @@
                 <w:sz w:val="15"/>
                 <w:szCs w:val="15"/>
               </w:rPr>
-              <w:t xml:space="preserve">OUTCOME OF THE WEEK</w:t>
+              <w:t xml:space="preserve">FOCUS OF THIS PHASE</w:t>
             </w:r>
           </w:p>
           <w:p>
@@ -2707,7 +3648,7 @@
                 <w:sz w:val="21"/>
                 <w:szCs w:val="21"/>
               </w:rPr>
-              <w:t xml:space="preserve">Each learner leaves with one small, clear learning goal they care about, broken into a short ladder of steps, and a first step taken during the week. This goal, built from Week 1's Learner Profile, is what the planning work in Week 3 will move forward.</w:t>
+              <w:t xml:space="preserve">Learners turn their Learner Profile into one small, clear learning goal they care about, broken into a short ladder of steps, and take a first step.</w:t>
             </w:r>
           </w:p>
         </w:tc>
@@ -2723,12 +3664,12 @@
           <w:sz w:val="19"/>
           <w:szCs w:val="19"/>
         </w:rPr>
-        <w:t xml:space="preserve">This week: 3h in-person · 2h independent, across 3 sessions.</w:t>
-      </w:r>
-    </w:p>
-    <w:p>
-      <w:pPr>
-        <w:spacing w:after="40" w:before="200"/>
+        <w:t xml:space="preserve">6h in-person · 3h independent, across 3 blocks.</w:t>
+      </w:r>
+    </w:p>
+    <w:p>
+      <w:pPr>
+        <w:spacing w:after="20" w:before="200"/>
       </w:pPr>
       <w:r>
         <w:rPr>
@@ -2738,7 +3679,7 @@
           <w:sz w:val="26"/>
           <w:szCs w:val="26"/>
         </w:rPr>
-        <w:t xml:space="preserve">Session 1 — What makes a good goal</w:t>
+        <w:t xml:space="preserve">What makes a good goal</w:t>
       </w:r>
     </w:p>
     <w:p>
@@ -2749,11 +3690,22 @@
         <w:rPr>
           <w:b/>
           <w:bCs/>
+          <w:color w:val="8A4E73"/>
+          <w:spacing w:val="20"/>
+          <w:sz w:val="15"/>
+          <w:szCs w:val="15"/>
+        </w:rPr>
+        <w:t xml:space="preserve">ACTIVITY   </w:t>
+      </w:r>
+      <w:r>
+        <w:rPr>
+          <w:b/>
+          <w:bCs/>
           <w:color w:val="3F8291"/>
           <w:sz w:val="18"/>
           <w:szCs w:val="18"/>
         </w:rPr>
-        <w:t xml:space="preserve">1h in-person · 30 min independent</w:t>
+        <w:t xml:space="preserve">2h in-person · 30 min independent</w:t>
       </w:r>
     </w:p>
     <w:tbl>
@@ -3462,22 +4414,7 @@
     </w:tbl>
     <w:p>
       <w:pPr>
-        <w:spacing w:after="80" w:before="40"/>
-      </w:pPr>
-      <w:r>
-        <w:rPr>
-          <w:i/>
-          <w:iCs/>
-          <w:color w:val="6B7280"/>
-          <w:sz w:val="18"/>
-          <w:szCs w:val="18"/>
-        </w:rPr>
-        <w:t xml:space="preserve">Flex: The judging and fixing of example goals is best done in-person, where disagreement sharpens the tests; testing your own goal can move to independent work if contact time is short.</w:t>
-      </w:r>
-    </w:p>
-    <w:p>
-      <w:pPr>
-        <w:spacing w:after="40" w:before="200"/>
+        <w:spacing w:after="20" w:before="200"/>
       </w:pPr>
       <w:r>
         <w:rPr>
@@ -3487,7 +4424,7 @@
           <w:sz w:val="26"/>
           <w:szCs w:val="26"/>
         </w:rPr>
-        <w:t xml:space="preserve">Session 2 — Choose and draw your goal</w:t>
+        <w:t xml:space="preserve">Choose and draw your goal</w:t>
       </w:r>
     </w:p>
     <w:p>
@@ -3498,11 +4435,22 @@
         <w:rPr>
           <w:b/>
           <w:bCs/>
+          <w:color w:val="8A4E73"/>
+          <w:spacing w:val="20"/>
+          <w:sz w:val="15"/>
+          <w:szCs w:val="15"/>
+        </w:rPr>
+        <w:t xml:space="preserve">ACTIVITY   </w:t>
+      </w:r>
+      <w:r>
+        <w:rPr>
+          <w:b/>
+          <w:bCs/>
           <w:color w:val="3F8291"/>
           <w:sz w:val="18"/>
           <w:szCs w:val="18"/>
         </w:rPr>
-        <w:t xml:space="preserve">1h in-person · 30 min independent</w:t>
+        <w:t xml:space="preserve">2h in-person · 1h independent</w:t>
       </w:r>
     </w:p>
     <w:tbl>
@@ -4241,7 +5189,7 @@
                 <w:sz w:val="15"/>
                 <w:szCs w:val="15"/>
               </w:rPr>
-              <w:t xml:space="preserve">INDEPENDENT TASK (30 MIN)</w:t>
+              <w:t xml:space="preserve">INDEPENDENT TASK (1H)</w:t>
             </w:r>
           </w:p>
           <w:p>
@@ -4259,22 +5207,7 @@
     </w:tbl>
     <w:p>
       <w:pPr>
-        <w:spacing w:after="80" w:before="40"/>
-      </w:pPr>
-      <w:r>
-        <w:rPr>
-          <w:i/>
-          <w:iCs/>
-          <w:color w:val="6B7280"/>
-          <w:sz w:val="18"/>
-          <w:szCs w:val="18"/>
-        </w:rPr>
-        <w:t xml:space="preserve">Flex: The saying-it-to-a-partner step must stay in-person; choosing and drawing the goal can be set as independent work from the workbook goal page.</w:t>
-      </w:r>
-    </w:p>
-    <w:p>
-      <w:pPr>
-        <w:spacing w:after="40" w:before="200"/>
+        <w:spacing w:after="20" w:before="200"/>
       </w:pPr>
       <w:r>
         <w:rPr>
@@ -4284,7 +5217,7 @@
           <w:sz w:val="26"/>
           <w:szCs w:val="26"/>
         </w:rPr>
-        <w:t xml:space="preserve">Session 3 — Your steps, and your first step</w:t>
+        <w:t xml:space="preserve">Your steps, and your first step</w:t>
       </w:r>
     </w:p>
     <w:p>
@@ -4295,11 +5228,22 @@
         <w:rPr>
           <w:b/>
           <w:bCs/>
+          <w:color w:val="8A4E73"/>
+          <w:spacing w:val="20"/>
+          <w:sz w:val="15"/>
+          <w:szCs w:val="15"/>
+        </w:rPr>
+        <w:t xml:space="preserve">ACTIVITY   </w:t>
+      </w:r>
+      <w:r>
+        <w:rPr>
+          <w:b/>
+          <w:bCs/>
           <w:color w:val="3F8291"/>
           <w:sz w:val="18"/>
           <w:szCs w:val="18"/>
         </w:rPr>
-        <w:t xml:space="preserve">1h in-person · 1h independent</w:t>
+        <w:t xml:space="preserve">2h in-person · 1.5h independent</w:t>
       </w:r>
     </w:p>
     <w:tbl>
@@ -5005,7 +5949,7 @@
                 <w:sz w:val="15"/>
                 <w:szCs w:val="15"/>
               </w:rPr>
-              <w:t xml:space="preserve">INDEPENDENT TASK (1H)</w:t>
+              <w:t xml:space="preserve">INDEPENDENT TASK (1.5H)</w:t>
             </w:r>
           </w:p>
           <w:p>
@@ -5015,28 +5959,13 @@
                 <w:sz w:val="21"/>
                 <w:szCs w:val="21"/>
               </w:rPr>
-              <w:t xml:space="preserve">Take your first step this week, and be ready to say what happened next session.</w:t>
+              <w:t xml:space="preserve">Take your first step, and be ready to say what happened.</w:t>
             </w:r>
           </w:p>
         </w:tc>
       </w:tr>
     </w:tbl>
     <w:p>
-      <w:pPr>
-        <w:spacing w:after="80" w:before="40"/>
-      </w:pPr>
-      <w:r>
-        <w:rPr>
-          <w:i/>
-          <w:iCs/>
-          <w:color w:val="6B7280"/>
-          <w:sz w:val="18"/>
-          <w:szCs w:val="18"/>
-        </w:rPr>
-        <w:t xml:space="preserve">Flex: Taking the first step is independent by design and is the week's core independent practice; building the ladder and committing aloud stay in-person.</w:t>
-      </w:r>
-    </w:p>
-    <w:p>
       <w:r>
         <w:br w:type="page"/>
       </w:r>
@@ -5056,7 +5985,7 @@
           <w:sz w:val="40"/>
           <w:szCs w:val="40"/>
         </w:rPr>
-        <w:t xml:space="preserve">Week 3 — Plan and take deliberate steps</w:t>
+        <w:t xml:space="preserve">Phase 4 — Plan and take deliberate steps</w:t>
       </w:r>
     </w:p>
     <w:p>
@@ -5113,7 +6042,7 @@
                 <w:sz w:val="15"/>
                 <w:szCs w:val="15"/>
               </w:rPr>
-              <w:t xml:space="preserve">OUTCOME OF THE WEEK</w:t>
+              <w:t xml:space="preserve">FOCUS OF THIS PHASE</w:t>
             </w:r>
           </w:p>
           <w:p>
@@ -5123,7 +6052,7 @@
                 <w:sz w:val="21"/>
                 <w:szCs w:val="21"/>
               </w:rPr>
-              <w:t xml:space="preserve">Each learner turns their goal into a small action plan, protects a little time to work on it, and knows where to find the help and resources they need, so a goal becomes deliberate, sustained steps rather than intention alone.</w:t>
+              <w:t xml:space="preserve">Learners turn their goal into a small action plan, protect a little time for it, and find the help and resources they need, then begin pursuing the goal for real between sessions.</w:t>
             </w:r>
           </w:p>
         </w:tc>
@@ -5139,12 +6068,12 @@
           <w:sz w:val="19"/>
           <w:szCs w:val="19"/>
         </w:rPr>
-        <w:t xml:space="preserve">This week: 3h in-person · 2h independent, across 3 sessions.</w:t>
-      </w:r>
-    </w:p>
-    <w:p>
-      <w:pPr>
-        <w:spacing w:after="40" w:before="200"/>
+        <w:t xml:space="preserve">7h in-person · 6h independent, across 4 blocks.</w:t>
+      </w:r>
+    </w:p>
+    <w:p>
+      <w:pPr>
+        <w:spacing w:after="20" w:before="200"/>
       </w:pPr>
       <w:r>
         <w:rPr>
@@ -5154,7 +6083,7 @@
           <w:sz w:val="26"/>
           <w:szCs w:val="26"/>
         </w:rPr>
-        <w:t xml:space="preserve">Session 1 — Make an action plan</w:t>
+        <w:t xml:space="preserve">Make an action plan</w:t>
       </w:r>
     </w:p>
     <w:p>
@@ -5165,11 +6094,22 @@
         <w:rPr>
           <w:b/>
           <w:bCs/>
+          <w:color w:val="8A4E73"/>
+          <w:spacing w:val="20"/>
+          <w:sz w:val="15"/>
+          <w:szCs w:val="15"/>
+        </w:rPr>
+        <w:t xml:space="preserve">ACTIVITY   </w:t>
+      </w:r>
+      <w:r>
+        <w:rPr>
+          <w:b/>
+          <w:bCs/>
           <w:color w:val="3F8291"/>
           <w:sz w:val="18"/>
           <w:szCs w:val="18"/>
         </w:rPr>
-        <w:t xml:space="preserve">1h in-person · 30 min independent</w:t>
+        <w:t xml:space="preserve">2h in-person · 1h independent</w:t>
       </w:r>
     </w:p>
     <w:tbl>
@@ -5995,7 +6935,7 @@
                 <w:sz w:val="15"/>
                 <w:szCs w:val="15"/>
               </w:rPr>
-              <w:t xml:space="preserve">INDEPENDENT TASK (30 MIN)</w:t>
+              <w:t xml:space="preserve">INDEPENDENT TASK (1H)</w:t>
             </w:r>
           </w:p>
           <w:p>
@@ -6005,7 +6945,7 @@
                 <w:sz w:val="21"/>
                 <w:szCs w:val="21"/>
               </w:rPr>
-              <w:t xml:space="preserve">Take one step from your plan this week, and notice what helped or got in the way.</w:t>
+              <w:t xml:space="preserve">Take one step from your plan, and notice what helped or got in the way.</w:t>
             </w:r>
           </w:p>
         </w:tc>
@@ -6013,22 +6953,7 @@
     </w:tbl>
     <w:p>
       <w:pPr>
-        <w:spacing w:after="80" w:before="40"/>
-      </w:pPr>
-      <w:r>
-        <w:rPr>
-          <w:i/>
-          <w:iCs/>
-          <w:color w:val="6B7280"/>
-          <w:sz w:val="18"/>
-          <w:szCs w:val="18"/>
-        </w:rPr>
-        <w:t xml:space="preserve">Flex: Drawing the plan can be set as independent work from the workbook; the modelling and the partner check stay in-person.</w:t>
-      </w:r>
-    </w:p>
-    <w:p>
-      <w:pPr>
-        <w:spacing w:after="40" w:before="200"/>
+        <w:spacing w:after="20" w:before="200"/>
       </w:pPr>
       <w:r>
         <w:rPr>
@@ -6038,7 +6963,7 @@
           <w:sz w:val="26"/>
           <w:szCs w:val="26"/>
         </w:rPr>
-        <w:t xml:space="preserve">Session 2 — Manage your time and what matters</w:t>
+        <w:t xml:space="preserve">Manage your time and what matters</w:t>
       </w:r>
     </w:p>
     <w:p>
@@ -6049,11 +6974,22 @@
         <w:rPr>
           <w:b/>
           <w:bCs/>
+          <w:color w:val="8A4E73"/>
+          <w:spacing w:val="20"/>
+          <w:sz w:val="15"/>
+          <w:szCs w:val="15"/>
+        </w:rPr>
+        <w:t xml:space="preserve">ACTIVITY   </w:t>
+      </w:r>
+      <w:r>
+        <w:rPr>
+          <w:b/>
+          <w:bCs/>
           <w:color w:val="3F8291"/>
           <w:sz w:val="18"/>
           <w:szCs w:val="18"/>
         </w:rPr>
-        <w:t xml:space="preserve">1h in-person · 30 min independent</w:t>
+        <w:t xml:space="preserve">2h in-person · 1h independent</w:t>
       </w:r>
     </w:p>
     <w:tbl>
@@ -6726,7 +7662,7 @@
                 <w:sz w:val="15"/>
                 <w:szCs w:val="15"/>
               </w:rPr>
-              <w:t xml:space="preserve">INDEPENDENT TASK (30 MIN)</w:t>
+              <w:t xml:space="preserve">INDEPENDENT TASK (1H)</w:t>
             </w:r>
           </w:p>
           <w:p>
@@ -6744,22 +7680,7 @@
     </w:tbl>
     <w:p>
       <w:pPr>
-        <w:spacing w:after="80" w:before="40"/>
-      </w:pPr>
-      <w:r>
-        <w:rPr>
-          <w:i/>
-          <w:iCs/>
-          <w:color w:val="6B7280"/>
-          <w:sz w:val="18"/>
-          <w:szCs w:val="18"/>
-        </w:rPr>
-        <w:t xml:space="preserve">Flex: The sorting of what matters most is best done in-person; trying the routine is the independent practice.</w:t>
-      </w:r>
-    </w:p>
-    <w:p>
-      <w:pPr>
-        <w:spacing w:after="40" w:before="200"/>
+        <w:spacing w:after="20" w:before="200"/>
       </w:pPr>
       <w:r>
         <w:rPr>
@@ -6769,7 +7690,7 @@
           <w:sz w:val="26"/>
           <w:szCs w:val="26"/>
         </w:rPr>
-        <w:t xml:space="preserve">Session 3 — Find help and resources</w:t>
+        <w:t xml:space="preserve">Find help and resources</w:t>
       </w:r>
     </w:p>
     <w:p>
@@ -6780,11 +7701,22 @@
         <w:rPr>
           <w:b/>
           <w:bCs/>
+          <w:color w:val="8A4E73"/>
+          <w:spacing w:val="20"/>
+          <w:sz w:val="15"/>
+          <w:szCs w:val="15"/>
+        </w:rPr>
+        <w:t xml:space="preserve">ACTIVITY   </w:t>
+      </w:r>
+      <w:r>
+        <w:rPr>
+          <w:b/>
+          <w:bCs/>
           <w:color w:val="3F8291"/>
           <w:sz w:val="18"/>
           <w:szCs w:val="18"/>
         </w:rPr>
-        <w:t xml:space="preserve">1h in-person · 1h independent</w:t>
+        <w:t xml:space="preserve">2h in-person · 1h independent</w:t>
       </w:r>
     </w:p>
     <w:tbl>
@@ -7628,19 +8560,113 @@
     </w:tbl>
     <w:p>
       <w:pPr>
-        <w:spacing w:after="80" w:before="40"/>
-      </w:pPr>
-      <w:r>
-        <w:rPr>
-          <w:i/>
-          <w:iCs/>
-          <w:color w:val="6B7280"/>
-          <w:sz w:val="18"/>
-          <w:szCs w:val="18"/>
-        </w:rPr>
-        <w:t xml:space="preserve">Flex: Naming who and what can help stays in-person; actually reaching out and using the help is the independent task.</w:t>
-      </w:r>
-    </w:p>
+        <w:spacing w:after="20" w:before="200"/>
+      </w:pPr>
+      <w:r>
+        <w:rPr>
+          <w:b/>
+          <w:bCs/>
+          <w:color w:val="041E42"/>
+          <w:sz w:val="26"/>
+          <w:szCs w:val="26"/>
+        </w:rPr>
+        <w:t xml:space="preserve">Pursue your goal, and mark your learning book</w:t>
+      </w:r>
+    </w:p>
+    <w:p>
+      <w:pPr>
+        <w:spacing w:after="80"/>
+      </w:pPr>
+      <w:r>
+        <w:rPr>
+          <w:b/>
+          <w:bCs/>
+          <w:color w:val="8A4E73"/>
+          <w:spacing w:val="20"/>
+          <w:sz w:val="15"/>
+          <w:szCs w:val="15"/>
+        </w:rPr>
+        <w:t xml:space="preserve">PRACTICE   </w:t>
+      </w:r>
+      <w:r>
+        <w:rPr>
+          <w:b/>
+          <w:bCs/>
+          <w:color w:val="3F8291"/>
+          <w:sz w:val="18"/>
+          <w:szCs w:val="18"/>
+        </w:rPr>
+        <w:t xml:space="preserve">1h in-person · 3h independent</w:t>
+      </w:r>
+    </w:p>
+    <w:p>
+      <w:pPr>
+        <w:spacing w:after="80"/>
+      </w:pPr>
+      <w:r>
+        <w:rPr>
+          <w:color w:val="041E42"/>
+          <w:sz w:val="21"/>
+          <w:szCs w:val="21"/>
+        </w:rPr>
+        <w:t xml:space="preserve">The heart of independent learning. Between sessions, learners take real steps towards their goal and make one small mark or drawing in their learning book each time. Open each session with a short, warm check-in in same-gender pairs or the group: what step did you take, what happened, what is next? A step taken, however small, is celebrated. This block is where the 20 independent hours mostly live, so protect it and keep the check-ins going.</w:t>
+      </w:r>
+    </w:p>
+    <w:tbl>
+      <w:tblPr>
+        <w:tblW w:type="pct" w:w="100%"/>
+        <w:tblBorders>
+          <w:top w:val="none" w:color="FFFFFF" w:sz="0"/>
+          <w:left w:val="none" w:color="FFFFFF" w:sz="0"/>
+          <w:bottom w:val="none" w:color="FFFFFF" w:sz="0"/>
+          <w:right w:val="none" w:color="FFFFFF" w:sz="0"/>
+          <w:insideH w:val="none" w:color="FFFFFF" w:sz="0"/>
+          <w:insideV w:val="none" w:color="FFFFFF" w:sz="0"/>
+        </w:tblBorders>
+      </w:tblPr>
+      <w:tblGrid>
+        <w:gridCol w:w="100"/>
+      </w:tblGrid>
+      <w:tr>
+        <w:tc>
+          <w:tcPr>
+            <w:shd w:fill="E1EEF1" w:color="auto" w:val="clear"/>
+            <w:tcMar>
+              <w:top w:type="dxa" w:w="90"/>
+              <w:left w:type="dxa" w:w="140"/>
+              <w:bottom w:type="dxa" w:w="90"/>
+              <w:right w:type="dxa" w:w="140"/>
+            </w:tcMar>
+          </w:tcPr>
+          <w:p>
+            <w:pPr>
+              <w:spacing w:after="40"/>
+            </w:pPr>
+            <w:r>
+              <w:rPr>
+                <w:b/>
+                <w:bCs/>
+                <w:color w:val="3F8291"/>
+                <w:spacing w:val="30"/>
+                <w:sz w:val="15"/>
+                <w:szCs w:val="15"/>
+              </w:rPr>
+              <w:t xml:space="preserve">INDEPENDENT TASK (3H)</w:t>
+            </w:r>
+          </w:p>
+          <w:p>
+            <w:r>
+              <w:rPr>
+                <w:color w:val="041E42"/>
+                <w:sz w:val="21"/>
+                <w:szCs w:val="21"/>
+              </w:rPr>
+              <w:t xml:space="preserve">Keep taking small steps towards your goal, and mark each one in your learning book.</w:t>
+            </w:r>
+          </w:p>
+        </w:tc>
+      </w:tr>
+    </w:tbl>
     <w:p>
       <w:r>
         <w:br w:type="page"/>
@@ -7661,7 +8687,7 @@
           <w:sz w:val="40"/>
           <w:szCs w:val="40"/>
         </w:rPr>
-        <w:t xml:space="preserve">Week 4 — Track progress, use feedback, and reflect</w:t>
+        <w:t xml:space="preserve">Phase 5 — Track progress, use feedback, and reflect</w:t>
       </w:r>
     </w:p>
     <w:p>
@@ -7718,7 +8744,7 @@
                 <w:sz w:val="15"/>
                 <w:szCs w:val="15"/>
               </w:rPr>
-              <w:t xml:space="preserve">OUTCOME OF THE WEEK</w:t>
+              <w:t xml:space="preserve">FOCUS OF THIS PHASE</w:t>
             </w:r>
           </w:p>
           <w:p>
@@ -7728,7 +8754,7 @@
                 <w:sz w:val="21"/>
                 <w:szCs w:val="21"/>
               </w:rPr>
-              <w:t xml:space="preserve">Each learner keeps a simple record of their progress, seeks and uses feedback, and reflects on how they have grown against their original goal. This completes the goal cycle and produces the evidence of self-directed learning the programme assesses.</w:t>
+              <w:t xml:space="preserve">Learners use their learning book to see their progress, seek and use feedback, and reflect on how they have grown against their original goal, completing the self-directed learning cycle.</w:t>
             </w:r>
           </w:p>
         </w:tc>
@@ -7744,12 +8770,12 @@
           <w:sz w:val="19"/>
           <w:szCs w:val="19"/>
         </w:rPr>
-        <w:t xml:space="preserve">This week: 3h in-person · 2h independent, across 3 sessions.</w:t>
-      </w:r>
-    </w:p>
-    <w:p>
-      <w:pPr>
-        <w:spacing w:after="40" w:before="200"/>
+        <w:t xml:space="preserve">5h in-person · 5.5h independent, across 3 blocks.</w:t>
+      </w:r>
+    </w:p>
+    <w:p>
+      <w:pPr>
+        <w:spacing w:after="20" w:before="200"/>
       </w:pPr>
       <w:r>
         <w:rPr>
@@ -7759,7 +8785,7 @@
           <w:sz w:val="26"/>
           <w:szCs w:val="26"/>
         </w:rPr>
-        <w:t xml:space="preserve">Session 1 — Keep your learning book</w:t>
+        <w:t xml:space="preserve">Ask for and use feedback</w:t>
       </w:r>
     </w:p>
     <w:p>
@@ -7770,808 +8796,22 @@
         <w:rPr>
           <w:b/>
           <w:bCs/>
+          <w:color w:val="8A4E73"/>
+          <w:spacing w:val="20"/>
+          <w:sz w:val="15"/>
+          <w:szCs w:val="15"/>
+        </w:rPr>
+        <w:t xml:space="preserve">ACTIVITY   </w:t>
+      </w:r>
+      <w:r>
+        <w:rPr>
+          <w:b/>
+          <w:bCs/>
           <w:color w:val="3F8291"/>
           <w:sz w:val="18"/>
           <w:szCs w:val="18"/>
         </w:rPr>
-        <w:t xml:space="preserve">1h in-person · 30 min independent</w:t>
-      </w:r>
-    </w:p>
-    <w:tbl>
-      <w:tblPr>
-        <w:tblW w:type="pct" w:w="100%"/>
-        <w:tblBorders>
-          <w:top w:val="none" w:color="FFFFFF" w:sz="0"/>
-          <w:left w:val="none" w:color="FFFFFF" w:sz="0"/>
-          <w:bottom w:val="none" w:color="FFFFFF" w:sz="0"/>
-          <w:right w:val="none" w:color="FFFFFF" w:sz="0"/>
-          <w:insideH w:val="none" w:color="FFFFFF" w:sz="0"/>
-          <w:insideV w:val="none" w:color="FFFFFF" w:sz="0"/>
-        </w:tblBorders>
-      </w:tblPr>
-      <w:tblGrid>
-        <w:gridCol w:w="100"/>
-      </w:tblGrid>
-      <w:tr>
-        <w:tc>
-          <w:tcPr>
-            <w:shd w:fill="FBEFE0" w:color="auto" w:val="clear"/>
-            <w:tcMar>
-              <w:top w:type="dxa" w:w="90"/>
-              <w:left w:type="dxa" w:w="140"/>
-              <w:bottom w:type="dxa" w:w="90"/>
-              <w:right w:type="dxa" w:w="140"/>
-            </w:tcMar>
-          </w:tcPr>
-          <w:p>
-            <w:pPr>
-              <w:spacing w:after="40"/>
-            </w:pPr>
-            <w:r>
-              <w:rPr>
-                <w:b/>
-                <w:bCs/>
-                <w:color w:val="EF9600"/>
-                <w:spacing w:val="30"/>
-                <w:sz w:val="15"/>
-                <w:szCs w:val="15"/>
-              </w:rPr>
-              <w:t xml:space="preserve">THE ONE THING TO GET RIGHT</w:t>
-            </w:r>
-          </w:p>
-          <w:p>
-            <w:r>
-              <w:rPr>
-                <w:color w:val="041E42"/>
-                <w:sz w:val="21"/>
-                <w:szCs w:val="21"/>
-              </w:rPr>
-              <w:t xml:space="preserve">This workbook is the spine the other Agency in Learning activities draw and mark into, so the one thing to get right is that it is easy and habitual, not a chore. Because most learners do not read or write, an entry is a drawing, a mark, a face, or a few words the facilitator scribes when asked, never a demand to write. A book a learner marks once a session beats a neat one they abandon. Say aloud, often, that there is no right way to keep it and one small drawing is enough, so no learner freezes at a blank page or hides an untidy one.</w:t>
-            </w:r>
-          </w:p>
-        </w:tc>
-      </w:tr>
-    </w:tbl>
-    <w:p>
-      <w:pPr>
-        <w:spacing w:after="40" w:before="160"/>
-      </w:pPr>
-      <w:r>
-        <w:rPr>
-          <w:b/>
-          <w:bCs/>
-          <w:color w:val="004976"/>
-          <w:spacing w:val="30"/>
-          <w:sz w:val="17"/>
-          <w:szCs w:val="17"/>
-        </w:rPr>
-        <w:t xml:space="preserve">PREPARE</w:t>
-      </w:r>
-    </w:p>
-    <w:p>
-      <w:pPr>
-        <w:pStyle w:val="ListParagraph"/>
-        <w:numPr>
-          <w:ilvl w:val="0"/>
-          <w:numId w:val="1"/>
-        </w:numPr>
-        <w:spacing w:after="40"/>
-      </w:pPr>
-      <w:r>
-        <w:rPr>
-          <w:color w:val="041E42"/>
-          <w:sz w:val="21"/>
-          <w:szCs w:val="21"/>
-        </w:rPr>
-        <w:t xml:space="preserve">The student workbook, one per learner, with blank picture pages and a place for their goal.</w:t>
-      </w:r>
-    </w:p>
-    <w:p>
-      <w:pPr>
-        <w:pStyle w:val="ListParagraph"/>
-        <w:numPr>
-          <w:ilvl w:val="0"/>
-          <w:numId w:val="1"/>
-        </w:numPr>
-        <w:spacing w:after="40"/>
-      </w:pPr>
-      <w:r>
-        <w:rPr>
-          <w:color w:val="041E42"/>
-          <w:sz w:val="21"/>
-          <w:szCs w:val="21"/>
-        </w:rPr>
-        <w:t xml:space="preserve">Coloured pencils or crayons the whole group can share, and a facilitator pen for scribing a few words when asked.</w:t>
-      </w:r>
-    </w:p>
-    <w:p>
-      <w:pPr>
-        <w:pStyle w:val="ListParagraph"/>
-        <w:numPr>
-          <w:ilvl w:val="0"/>
-          <w:numId w:val="1"/>
-        </w:numPr>
-        <w:spacing w:after="40"/>
-      </w:pPr>
-      <w:r>
-        <w:rPr>
-          <w:color w:val="041E42"/>
-          <w:sz w:val="21"/>
-          <w:szCs w:val="21"/>
-        </w:rPr>
-        <w:t xml:space="preserve">Your own simple example mark (one drawing plus one word), to show that a small mark is a full entry.</w:t>
-      </w:r>
-    </w:p>
-    <w:p>
-      <w:pPr>
-        <w:pStyle w:val="ListParagraph"/>
-        <w:numPr>
-          <w:ilvl w:val="0"/>
-          <w:numId w:val="1"/>
-        </w:numPr>
-        <w:spacing w:after="40"/>
-      </w:pPr>
-      <w:r>
-        <w:rPr>
-          <w:color w:val="041E42"/>
-          <w:sz w:val="21"/>
-          <w:szCs w:val="21"/>
-        </w:rPr>
-        <w:t xml:space="preserve">Sensitivity: a workbook can hold private things about home and family. Say clearly no one else reads it unless the learner chooses, and a learner may keep any page just for themselves.</w:t>
-      </w:r>
-    </w:p>
-    <w:p>
-      <w:pPr>
-        <w:spacing w:after="40" w:before="140"/>
-      </w:pPr>
-      <w:r>
-        <w:rPr>
-          <w:b/>
-          <w:bCs/>
-          <w:color w:val="004976"/>
-          <w:sz w:val="22"/>
-          <w:szCs w:val="22"/>
-        </w:rPr>
-        <w:t xml:space="preserve">1. Set up a book you can find and keep</w:t>
-      </w:r>
-      <w:r>
-        <w:rPr>
-          <w:color w:val="97999B"/>
-          <w:sz w:val="17"/>
-          <w:szCs w:val="17"/>
-        </w:rPr>
-        <w:t xml:space="preserve">   14-16 min</w:t>
-      </w:r>
-    </w:p>
-    <w:p>
-      <w:pPr>
-        <w:spacing w:after="80"/>
-      </w:pPr>
-      <w:r>
-        <w:rPr>
-          <w:color w:val="041E42"/>
-          <w:sz w:val="21"/>
-          <w:szCs w:val="21"/>
-        </w:rPr>
-        <w:t xml:space="preserve">Say aloud what the book is for: a private place where a learner keeps pictures of what they are learning across the whole programme, so they can see themselves grow. Hand out the workbooks and let each learner mark the front (their name, a drawing, or a mark only they know) so they can always find their own. Walk round and check every learner can recognise their book. The point is ownership, not neatness.</w:t>
-      </w:r>
-    </w:p>
-    <w:p>
-      <w:pPr>
-        <w:spacing w:after="20"/>
-      </w:pPr>
-      <w:r>
-        <w:rPr>
-          <w:b/>
-          <w:bCs/>
-          <w:color w:val="8F993E"/>
-          <w:sz w:val="18"/>
-          <w:szCs w:val="18"/>
-        </w:rPr>
-        <w:t xml:space="preserve">Ask:</w:t>
-      </w:r>
-    </w:p>
-    <w:p>
-      <w:pPr>
-        <w:pStyle w:val="ListParagraph"/>
-        <w:numPr>
-          <w:ilvl w:val="0"/>
-          <w:numId w:val="1"/>
-        </w:numPr>
-        <w:spacing w:after="20"/>
-      </w:pPr>
-      <w:r>
-        <w:rPr>
-          <w:color w:val="041E42"/>
-          <w:sz w:val="20"/>
-          <w:szCs w:val="20"/>
-        </w:rPr>
-        <w:t xml:space="preserve">Whose book is this, and how will you know it is yours when they are all stacked together?</w:t>
-      </w:r>
-    </w:p>
-    <w:p>
-      <w:pPr>
-        <w:pStyle w:val="ListParagraph"/>
-        <w:numPr>
-          <w:ilvl w:val="0"/>
-          <w:numId w:val="1"/>
-        </w:numPr>
-        <w:spacing w:after="20"/>
-      </w:pPr>
-      <w:r>
-        <w:rPr>
-          <w:color w:val="041E42"/>
-          <w:sz w:val="20"/>
-          <w:szCs w:val="20"/>
-        </w:rPr>
-        <w:t xml:space="preserve">What small mark or drawing could you put on the front so you find it fast?</w:t>
-      </w:r>
-    </w:p>
-    <w:p>
-      <w:pPr>
-        <w:spacing w:after="20" w:before="40"/>
-      </w:pPr>
-      <w:r>
-        <w:rPr>
-          <w:b/>
-          <w:bCs/>
-          <w:color w:val="BD472A"/>
-          <w:sz w:val="18"/>
-          <w:szCs w:val="18"/>
-        </w:rPr>
-        <w:t xml:space="preserve">Watch out:</w:t>
-      </w:r>
-    </w:p>
-    <w:p>
-      <w:pPr>
-        <w:pStyle w:val="ListParagraph"/>
-        <w:numPr>
-          <w:ilvl w:val="0"/>
-          <w:numId w:val="1"/>
-        </w:numPr>
-        <w:spacing w:after="20"/>
-      </w:pPr>
-      <w:r>
-        <w:rPr>
-          <w:color w:val="041E42"/>
-          <w:sz w:val="20"/>
-          <w:szCs w:val="20"/>
-        </w:rPr>
-        <w:t xml:space="preserve">A learner is anxious because they cannot write their name; offer to scribe it, or let a drawing or thumbprint be their mark, so no one is shamed at the very first step.</w:t>
-      </w:r>
-    </w:p>
-    <w:p>
-      <w:pPr>
-        <w:spacing w:after="40" w:before="20"/>
-      </w:pPr>
-      <w:r>
-        <w:rPr>
-          <w:i/>
-          <w:iCs/>
-          <w:color w:val="6B7280"/>
-          <w:sz w:val="18"/>
-          <w:szCs w:val="18"/>
-        </w:rPr>
-        <w:t xml:space="preserve">If low-resource: No printed book is needed if supply is short: a few stapled sheets or the back of a shared notebook works. The book being the learner's own, and findable again, matters far more than what it is made of.</w:t>
-      </w:r>
-    </w:p>
-    <w:p>
-      <w:pPr>
-        <w:spacing w:after="40" w:before="140"/>
-      </w:pPr>
-      <w:r>
-        <w:rPr>
-          <w:b/>
-          <w:bCs/>
-          <w:color w:val="004976"/>
-          <w:sz w:val="22"/>
-          <w:szCs w:val="22"/>
-        </w:rPr>
-        <w:t xml:space="preserve">2. Put your goal on the first page</w:t>
-      </w:r>
-      <w:r>
-        <w:rPr>
-          <w:color w:val="97999B"/>
-          <w:sz w:val="17"/>
-          <w:szCs w:val="17"/>
-        </w:rPr>
-        <w:t xml:space="preserve">   14-16 min</w:t>
-      </w:r>
-    </w:p>
-    <w:p>
-      <w:pPr>
-        <w:spacing w:after="80"/>
-      </w:pPr>
-      <w:r>
-        <w:rPr>
-          <w:color w:val="041E42"/>
-          <w:sz w:val="21"/>
-          <w:szCs w:val="21"/>
-        </w:rPr>
-        <w:t xml:space="preserve">Have each learner draw or mark their learning goal on the first page: the thing they are working towards, as a picture. If a learner wants a word or two added, scribe it for them beside the drawing. Anchoring the book to a real goal is what makes later marks meaningful, because the learner has something concrete to track against, not a blank page. Keep it to one goal so the page stays light.</w:t>
-      </w:r>
-    </w:p>
-    <w:p>
-      <w:pPr>
-        <w:spacing w:after="20"/>
-      </w:pPr>
-      <w:r>
-        <w:rPr>
-          <w:b/>
-          <w:bCs/>
-          <w:color w:val="8F993E"/>
-          <w:sz w:val="18"/>
-          <w:szCs w:val="18"/>
-        </w:rPr>
-        <w:t xml:space="preserve">Ask:</w:t>
-      </w:r>
-    </w:p>
-    <w:p>
-      <w:pPr>
-        <w:pStyle w:val="ListParagraph"/>
-        <w:numPr>
-          <w:ilvl w:val="0"/>
-          <w:numId w:val="1"/>
-        </w:numPr>
-        <w:spacing w:after="20"/>
-      </w:pPr>
-      <w:r>
-        <w:rPr>
-          <w:color w:val="041E42"/>
-          <w:sz w:val="20"/>
-          <w:szCs w:val="20"/>
-        </w:rPr>
-        <w:t xml:space="preserve">What are you working towards? Draw it, or show me and I will help you mark it.</w:t>
-      </w:r>
-    </w:p>
-    <w:p>
-      <w:pPr>
-        <w:pStyle w:val="ListParagraph"/>
-        <w:numPr>
-          <w:ilvl w:val="0"/>
-          <w:numId w:val="1"/>
-        </w:numPr>
-        <w:spacing w:after="20"/>
-      </w:pPr>
-      <w:r>
-        <w:rPr>
-          <w:color w:val="041E42"/>
-          <w:sz w:val="20"/>
-          <w:szCs w:val="20"/>
-        </w:rPr>
-        <w:t xml:space="preserve">When you turn to this page next time, what will remind you what you were aiming for?</w:t>
-      </w:r>
-    </w:p>
-    <w:p>
-      <w:pPr>
-        <w:spacing w:after="20" w:before="40"/>
-      </w:pPr>
-      <w:r>
-        <w:rPr>
-          <w:b/>
-          <w:bCs/>
-          <w:color w:val="BD472A"/>
-          <w:sz w:val="18"/>
-          <w:szCs w:val="18"/>
-        </w:rPr>
-        <w:t xml:space="preserve">Watch out:</w:t>
-      </w:r>
-    </w:p>
-    <w:p>
-      <w:pPr>
-        <w:pStyle w:val="ListParagraph"/>
-        <w:numPr>
-          <w:ilvl w:val="0"/>
-          <w:numId w:val="1"/>
-        </w:numPr>
-        <w:spacing w:after="20"/>
-      </w:pPr>
-      <w:r>
-        <w:rPr>
-          <w:color w:val="041E42"/>
-          <w:sz w:val="20"/>
-          <w:szCs w:val="20"/>
-        </w:rPr>
-        <w:t xml:space="preserve">A learner copies a neighbour's goal picture because they are unsure; kneel beside them and ask what they themselves want, then help them mark their own, so the book starts from their real goal.</w:t>
-      </w:r>
-    </w:p>
-    <w:p>
-      <w:pPr>
-        <w:spacing w:after="40" w:before="20"/>
-      </w:pPr>
-      <w:r>
-        <w:rPr>
-          <w:i/>
-          <w:iCs/>
-          <w:color w:val="6B7280"/>
-          <w:sz w:val="18"/>
-          <w:szCs w:val="18"/>
-        </w:rPr>
-        <w:t xml:space="preserve">If low-resource: If a learner has not set a goal yet, they draw one thing they want to get better at. A rough picture is plenty; the book can hold a clearer goal later without being restarted.</w:t>
-      </w:r>
-    </w:p>
-    <w:p>
-      <w:pPr>
-        <w:spacing w:after="40" w:before="140"/>
-      </w:pPr>
-      <w:r>
-        <w:rPr>
-          <w:b/>
-          <w:bCs/>
-          <w:color w:val="004976"/>
-          <w:sz w:val="22"/>
-          <w:szCs w:val="22"/>
-        </w:rPr>
-        <w:t xml:space="preserve">3. Make one small mark live</w:t>
-      </w:r>
-      <w:r>
-        <w:rPr>
-          <w:color w:val="97999B"/>
-          <w:sz w:val="17"/>
-          <w:szCs w:val="17"/>
-        </w:rPr>
-        <w:t xml:space="preserve">   14-16 min</w:t>
-      </w:r>
-    </w:p>
-    <w:p>
-      <w:pPr>
-        <w:spacing w:after="80"/>
-      </w:pPr>
-      <w:r>
-        <w:rPr>
-          <w:color w:val="041E42"/>
-          <w:sz w:val="21"/>
-          <w:szCs w:val="21"/>
-        </w:rPr>
-        <w:t xml:space="preserve">Break the empty page at once. Show your own example (one drawing and one word), then give quiet time for each learner to make one small mark about today: something they did, or a face for how the learning felt. Offer to scribe a few words for any learner who points and tells you. The point is to prove a mark can be quick and honest, so the book never feels like a task a learner has to steel themselves for.</w:t>
-      </w:r>
-    </w:p>
-    <w:p>
-      <w:pPr>
-        <w:spacing w:after="20"/>
-      </w:pPr>
-      <w:r>
-        <w:rPr>
-          <w:b/>
-          <w:bCs/>
-          <w:color w:val="8F993E"/>
-          <w:sz w:val="18"/>
-          <w:szCs w:val="18"/>
-        </w:rPr>
-        <w:t xml:space="preserve">Ask:</w:t>
-      </w:r>
-    </w:p>
-    <w:p>
-      <w:pPr>
-        <w:pStyle w:val="ListParagraph"/>
-        <w:numPr>
-          <w:ilvl w:val="0"/>
-          <w:numId w:val="1"/>
-        </w:numPr>
-        <w:spacing w:after="20"/>
-      </w:pPr>
-      <w:r>
-        <w:rPr>
-          <w:color w:val="041E42"/>
-          <w:sz w:val="20"/>
-          <w:szCs w:val="20"/>
-        </w:rPr>
-        <w:t xml:space="preserve">What is one thing you did today towards your goal? Draw it, however small.</w:t>
-      </w:r>
-    </w:p>
-    <w:p>
-      <w:pPr>
-        <w:pStyle w:val="ListParagraph"/>
-        <w:numPr>
-          <w:ilvl w:val="0"/>
-          <w:numId w:val="1"/>
-        </w:numPr>
-        <w:spacing w:after="20"/>
-      </w:pPr>
-      <w:r>
-        <w:rPr>
-          <w:color w:val="041E42"/>
-          <w:sz w:val="20"/>
-          <w:szCs w:val="20"/>
-        </w:rPr>
-        <w:t xml:space="preserve">How did today feel? Point to a face, or make a mark for it, and I will add a word if you like.</w:t>
-      </w:r>
-    </w:p>
-    <w:p>
-      <w:pPr>
-        <w:spacing w:after="20" w:before="40"/>
-      </w:pPr>
-      <w:r>
-        <w:rPr>
-          <w:b/>
-          <w:bCs/>
-          <w:color w:val="BD472A"/>
-          <w:sz w:val="18"/>
-          <w:szCs w:val="18"/>
-        </w:rPr>
-        <w:t xml:space="preserve">Watch out:</w:t>
-      </w:r>
-    </w:p>
-    <w:p>
-      <w:pPr>
-        <w:pStyle w:val="ListParagraph"/>
-        <w:numPr>
-          <w:ilvl w:val="0"/>
-          <w:numId w:val="1"/>
-        </w:numPr>
-        <w:spacing w:after="20"/>
-      </w:pPr>
-      <w:r>
-        <w:rPr>
-          <w:color w:val="041E42"/>
-          <w:sz w:val="20"/>
-          <w:szCs w:val="20"/>
-        </w:rPr>
-        <w:t xml:space="preserve">A learner freezes because they think the mark must be big or beautiful; say aloud that one small drawing is a full entry, and show just how quick and rough yours was.</w:t>
-      </w:r>
-    </w:p>
-    <w:p>
-      <w:pPr>
-        <w:spacing w:after="40" w:before="20"/>
-      </w:pPr>
-      <w:r>
-        <w:rPr>
-          <w:i/>
-          <w:iCs/>
-          <w:color w:val="6B7280"/>
-          <w:sz w:val="18"/>
-          <w:szCs w:val="18"/>
-        </w:rPr>
-        <w:t xml:space="preserve">If low-resource: If time is very short, one face or one mark against one prompt is a complete entry. One real mark made in the room is worth more than a fuller page promised for later.</w:t>
-      </w:r>
-    </w:p>
-    <w:p>
-      <w:pPr>
-        <w:spacing w:after="40" w:before="140"/>
-      </w:pPr>
-      <w:r>
-        <w:rPr>
-          <w:b/>
-          <w:bCs/>
-          <w:color w:val="004976"/>
-          <w:sz w:val="22"/>
-          <w:szCs w:val="22"/>
-        </w:rPr>
-        <w:t xml:space="preserve">4. Agree one moment each session</w:t>
-      </w:r>
-      <w:r>
-        <w:rPr>
-          <w:color w:val="97999B"/>
-          <w:sz w:val="17"/>
-          <w:szCs w:val="17"/>
-        </w:rPr>
-        <w:t xml:space="preserve">   12-14 min</w:t>
-      </w:r>
-    </w:p>
-    <w:p>
-      <w:pPr>
-        <w:spacing w:after="80"/>
-      </w:pPr>
-      <w:r>
-        <w:rPr>
-          <w:color w:val="041E42"/>
-          <w:sz w:val="21"/>
-          <w:szCs w:val="21"/>
-        </w:rPr>
-        <w:t xml:space="preserve">Turn the one mark into a habit. Agree together a fixed moment for marking the book (the last few minutes of each session, before anyone leaves), so it does not depend on remembering. Say clearly what counts as done: one drawing or one mark. Tell learners the book will be opened again in the goal-setting, feedback, and reflection sessions, so they know it is going somewhere.</w:t>
-      </w:r>
-    </w:p>
-    <w:p>
-      <w:pPr>
-        <w:spacing w:after="20"/>
-      </w:pPr>
-      <w:r>
-        <w:rPr>
-          <w:b/>
-          <w:bCs/>
-          <w:color w:val="8F993E"/>
-          <w:sz w:val="18"/>
-          <w:szCs w:val="18"/>
-        </w:rPr>
-        <w:t xml:space="preserve">Ask:</w:t>
-      </w:r>
-    </w:p>
-    <w:p>
-      <w:pPr>
-        <w:pStyle w:val="ListParagraph"/>
-        <w:numPr>
-          <w:ilvl w:val="0"/>
-          <w:numId w:val="1"/>
-        </w:numPr>
-        <w:spacing w:after="20"/>
-      </w:pPr>
-      <w:r>
-        <w:rPr>
-          <w:color w:val="041E42"/>
-          <w:sz w:val="20"/>
-          <w:szCs w:val="20"/>
-        </w:rPr>
-        <w:t xml:space="preserve">When exactly will we mark our books each time, so no one has to remember on their own?</w:t>
-      </w:r>
-    </w:p>
-    <w:p>
-      <w:pPr>
-        <w:pStyle w:val="ListParagraph"/>
-        <w:numPr>
-          <w:ilvl w:val="0"/>
-          <w:numId w:val="1"/>
-        </w:numPr>
-        <w:spacing w:after="20"/>
-      </w:pPr>
-      <w:r>
-        <w:rPr>
-          <w:color w:val="041E42"/>
-          <w:sz w:val="20"/>
-          <w:szCs w:val="20"/>
-        </w:rPr>
-        <w:t xml:space="preserve">What is the smallest mark that still counts as done for the day?</w:t>
-      </w:r>
-    </w:p>
-    <w:p>
-      <w:pPr>
-        <w:spacing w:after="20" w:before="40"/>
-      </w:pPr>
-      <w:r>
-        <w:rPr>
-          <w:b/>
-          <w:bCs/>
-          <w:color w:val="BD472A"/>
-          <w:sz w:val="18"/>
-          <w:szCs w:val="18"/>
-        </w:rPr>
-        <w:t xml:space="preserve">Watch out:</w:t>
-      </w:r>
-    </w:p>
-    <w:p>
-      <w:pPr>
-        <w:pStyle w:val="ListParagraph"/>
-        <w:numPr>
-          <w:ilvl w:val="0"/>
-          <w:numId w:val="1"/>
-        </w:numPr>
-        <w:spacing w:after="20"/>
-      </w:pPr>
-      <w:r>
-        <w:rPr>
-          <w:color w:val="041E42"/>
-          <w:sz w:val="20"/>
-          <w:szCs w:val="20"/>
-        </w:rPr>
-        <w:t xml:space="preserve">The group agrees an over-ambitious routine (a full drawing every day at home) that will collapse; steer them to one small mark at a fixed moment in the room, and say it can grow later if it works.</w:t>
-      </w:r>
-    </w:p>
-    <w:p>
-      <w:pPr>
-        <w:spacing w:after="40" w:before="160"/>
-      </w:pPr>
-      <w:r>
-        <w:rPr>
-          <w:b/>
-          <w:bCs/>
-          <w:color w:val="004976"/>
-          <w:spacing w:val="30"/>
-          <w:sz w:val="17"/>
-          <w:szCs w:val="17"/>
-        </w:rPr>
-        <w:t xml:space="preserve">CLOSING</w:t>
-      </w:r>
-    </w:p>
-    <w:p>
-      <w:pPr>
-        <w:spacing w:after="80"/>
-      </w:pPr>
-      <w:r>
-        <w:rPr>
-          <w:color w:val="041E42"/>
-          <w:sz w:val="21"/>
-          <w:szCs w:val="21"/>
-        </w:rPr>
-        <w:t xml:space="preserve">Ask two or three learners to hold up their book and show the front they made and their goal page, not the private marks inside, which stay theirs. Say aloud that this book is a living thing the other sessions will build on: goals go in it, small marks are made in it each time, and growth is looked back on from it. A kept book is how a learner watches their own learning move. Independent task: before the next session, make one small mark or drawing in your book about something you learned or did.</w:t>
-      </w:r>
-    </w:p>
-    <w:tbl>
-      <w:tblPr>
-        <w:tblW w:type="pct" w:w="100%"/>
-        <w:tblBorders>
-          <w:top w:val="none" w:color="FFFFFF" w:sz="0"/>
-          <w:left w:val="none" w:color="FFFFFF" w:sz="0"/>
-          <w:bottom w:val="none" w:color="FFFFFF" w:sz="0"/>
-          <w:right w:val="none" w:color="FFFFFF" w:sz="0"/>
-          <w:insideH w:val="none" w:color="FFFFFF" w:sz="0"/>
-          <w:insideV w:val="none" w:color="FFFFFF" w:sz="0"/>
-        </w:tblBorders>
-      </w:tblPr>
-      <w:tblGrid>
-        <w:gridCol w:w="100"/>
-      </w:tblGrid>
-      <w:tr>
-        <w:tc>
-          <w:tcPr>
-            <w:shd w:fill="E1EEF1" w:color="auto" w:val="clear"/>
-            <w:tcMar>
-              <w:top w:type="dxa" w:w="90"/>
-              <w:left w:type="dxa" w:w="140"/>
-              <w:bottom w:type="dxa" w:w="90"/>
-              <w:right w:type="dxa" w:w="140"/>
-            </w:tcMar>
-          </w:tcPr>
-          <w:p>
-            <w:pPr>
-              <w:spacing w:after="40"/>
-            </w:pPr>
-            <w:r>
-              <w:rPr>
-                <w:b/>
-                <w:bCs/>
-                <w:color w:val="3F8291"/>
-                <w:spacing w:val="30"/>
-                <w:sz w:val="15"/>
-                <w:szCs w:val="15"/>
-              </w:rPr>
-              <w:t xml:space="preserve">INDEPENDENT TASK (30 MIN)</w:t>
-            </w:r>
-          </w:p>
-          <w:p>
-            <w:r>
-              <w:rPr>
-                <w:color w:val="041E42"/>
-                <w:sz w:val="21"/>
-                <w:szCs w:val="21"/>
-              </w:rPr>
-              <w:t xml:space="preserve">Make one small mark or drawing in your learning book after each session this week.</w:t>
-            </w:r>
-          </w:p>
-        </w:tc>
-      </w:tr>
-    </w:tbl>
-    <w:p>
-      <w:pPr>
-        <w:spacing w:after="80" w:before="40"/>
-      </w:pPr>
-      <w:r>
-        <w:rPr>
-          <w:i/>
-          <w:iCs/>
-          <w:color w:val="6B7280"/>
-          <w:sz w:val="18"/>
-          <w:szCs w:val="18"/>
-        </w:rPr>
-        <w:t xml:space="preserve">Flex: Setting up the book and the first mark stay in-person; keeping the routine going is the independent practice, and the spine the whole component marks into.</w:t>
-      </w:r>
-    </w:p>
-    <w:p>
-      <w:pPr>
-        <w:spacing w:after="40" w:before="200"/>
-      </w:pPr>
-      <w:r>
-        <w:rPr>
-          <w:b/>
-          <w:bCs/>
-          <w:color w:val="041E42"/>
-          <w:sz w:val="26"/>
-          <w:szCs w:val="26"/>
-        </w:rPr>
-        <w:t xml:space="preserve">Session 2 — Ask for and use feedback</w:t>
-      </w:r>
-    </w:p>
-    <w:p>
-      <w:pPr>
-        <w:spacing w:after="80"/>
-      </w:pPr>
-      <w:r>
-        <w:rPr>
-          <w:b/>
-          <w:bCs/>
-          <w:color w:val="3F8291"/>
-          <w:sz w:val="18"/>
-          <w:szCs w:val="18"/>
-        </w:rPr>
-        <w:t xml:space="preserve">1h in-person · 30 min independent</w:t>
+        <w:t xml:space="preserve">2h in-person · 1h independent</w:t>
       </w:r>
     </w:p>
     <w:tbl>
@@ -9310,7 +9550,7 @@
                 <w:sz w:val="15"/>
                 <w:szCs w:val="15"/>
               </w:rPr>
-              <w:t xml:space="preserve">INDEPENDENT TASK (30 MIN)</w:t>
+              <w:t xml:space="preserve">INDEPENDENT TASK (1H)</w:t>
             </w:r>
           </w:p>
           <w:p>
@@ -9328,22 +9568,7 @@
     </w:tbl>
     <w:p>
       <w:pPr>
-        <w:spacing w:after="80" w:before="40"/>
-      </w:pPr>
-      <w:r>
-        <w:rPr>
-          <w:i/>
-          <w:iCs/>
-          <w:color w:val="6B7280"/>
-          <w:sz w:val="18"/>
-          <w:szCs w:val="18"/>
-        </w:rPr>
-        <w:t xml:space="preserve">Flex: Practising how to ask for and receive feedback stays in-person; asking someone for real is the independent task.</w:t>
-      </w:r>
-    </w:p>
-    <w:p>
-      <w:pPr>
-        <w:spacing w:after="40" w:before="200"/>
+        <w:spacing w:after="20" w:before="200"/>
       </w:pPr>
       <w:r>
         <w:rPr>
@@ -9353,7 +9578,7 @@
           <w:sz w:val="26"/>
           <w:szCs w:val="26"/>
         </w:rPr>
-        <w:t xml:space="preserve">Session 3 — Look back at how you have grown</w:t>
+        <w:t xml:space="preserve">Look back at how you have grown</w:t>
       </w:r>
     </w:p>
     <w:p>
@@ -9364,11 +9589,22 @@
         <w:rPr>
           <w:b/>
           <w:bCs/>
+          <w:color w:val="8A4E73"/>
+          <w:spacing w:val="20"/>
+          <w:sz w:val="15"/>
+          <w:szCs w:val="15"/>
+        </w:rPr>
+        <w:t xml:space="preserve">ACTIVITY   </w:t>
+      </w:r>
+      <w:r>
+        <w:rPr>
+          <w:b/>
+          <w:bCs/>
           <w:color w:val="3F8291"/>
           <w:sz w:val="18"/>
           <w:szCs w:val="18"/>
         </w:rPr>
-        <w:t xml:space="preserve">1h in-person · 1h independent</w:t>
+        <w:t xml:space="preserve">2h in-person · 1.5h independent</w:t>
       </w:r>
     </w:p>
     <w:tbl>
@@ -9987,7 +10223,7 @@
                 <w:sz w:val="15"/>
                 <w:szCs w:val="15"/>
               </w:rPr>
-              <w:t xml:space="preserve">INDEPENDENT TASK (1H)</w:t>
+              <w:t xml:space="preserve">INDEPENDENT TASK (1.5H)</w:t>
             </w:r>
           </w:p>
           <w:p>
@@ -10005,19 +10241,313 @@
     </w:tbl>
     <w:p>
       <w:pPr>
-        <w:spacing w:after="80" w:before="40"/>
-      </w:pPr>
-      <w:r>
-        <w:rPr>
-          <w:i/>
-          <w:iCs/>
-          <w:color w:val="6B7280"/>
-          <w:sz w:val="18"/>
-          <w:szCs w:val="18"/>
-        </w:rPr>
-        <w:t xml:space="preserve">Flex: The guided look back through the workbook stays in-person; noticing and preparing to share a growth is the independent reflection.</w:t>
-      </w:r>
-    </w:p>
+        <w:spacing w:after="20" w:before="200"/>
+      </w:pPr>
+      <w:r>
+        <w:rPr>
+          <w:b/>
+          <w:bCs/>
+          <w:color w:val="041E42"/>
+          <w:sz w:val="26"/>
+          <w:szCs w:val="26"/>
+        </w:rPr>
+        <w:t xml:space="preserve">Pursue your goal, and mark your learning book</w:t>
+      </w:r>
+    </w:p>
+    <w:p>
+      <w:pPr>
+        <w:spacing w:after="80"/>
+      </w:pPr>
+      <w:r>
+        <w:rPr>
+          <w:b/>
+          <w:bCs/>
+          <w:color w:val="8A4E73"/>
+          <w:spacing w:val="20"/>
+          <w:sz w:val="15"/>
+          <w:szCs w:val="15"/>
+        </w:rPr>
+        <w:t xml:space="preserve">PRACTICE   </w:t>
+      </w:r>
+      <w:r>
+        <w:rPr>
+          <w:b/>
+          <w:bCs/>
+          <w:color w:val="3F8291"/>
+          <w:sz w:val="18"/>
+          <w:szCs w:val="18"/>
+        </w:rPr>
+        <w:t xml:space="preserve">1h in-person · 3h independent</w:t>
+      </w:r>
+    </w:p>
+    <w:p>
+      <w:pPr>
+        <w:spacing w:after="80"/>
+      </w:pPr>
+      <w:r>
+        <w:rPr>
+          <w:color w:val="041E42"/>
+          <w:sz w:val="21"/>
+          <w:szCs w:val="21"/>
+        </w:rPr>
+        <w:t xml:space="preserve">Learners keep pursuing their goal and marking their book, now using the feedback they gathered and adjusting their steps when something is not working. Keep the short warm check-ins that open each session. By the end of this block most learners have taken real, tracked steps towards a goal they set themselves, which is the evidence of self-directed learning.</w:t>
+      </w:r>
+    </w:p>
+    <w:tbl>
+      <w:tblPr>
+        <w:tblW w:type="pct" w:w="100%"/>
+        <w:tblBorders>
+          <w:top w:val="none" w:color="FFFFFF" w:sz="0"/>
+          <w:left w:val="none" w:color="FFFFFF" w:sz="0"/>
+          <w:bottom w:val="none" w:color="FFFFFF" w:sz="0"/>
+          <w:right w:val="none" w:color="FFFFFF" w:sz="0"/>
+          <w:insideH w:val="none" w:color="FFFFFF" w:sz="0"/>
+          <w:insideV w:val="none" w:color="FFFFFF" w:sz="0"/>
+        </w:tblBorders>
+      </w:tblPr>
+      <w:tblGrid>
+        <w:gridCol w:w="100"/>
+      </w:tblGrid>
+      <w:tr>
+        <w:tc>
+          <w:tcPr>
+            <w:shd w:fill="E1EEF1" w:color="auto" w:val="clear"/>
+            <w:tcMar>
+              <w:top w:type="dxa" w:w="90"/>
+              <w:left w:type="dxa" w:w="140"/>
+              <w:bottom w:type="dxa" w:w="90"/>
+              <w:right w:type="dxa" w:w="140"/>
+            </w:tcMar>
+          </w:tcPr>
+          <w:p>
+            <w:pPr>
+              <w:spacing w:after="40"/>
+            </w:pPr>
+            <w:r>
+              <w:rPr>
+                <w:b/>
+                <w:bCs/>
+                <w:color w:val="3F8291"/>
+                <w:spacing w:val="30"/>
+                <w:sz w:val="15"/>
+                <w:szCs w:val="15"/>
+              </w:rPr>
+              <w:t xml:space="preserve">INDEPENDENT TASK (3H)</w:t>
+            </w:r>
+          </w:p>
+          <w:p>
+            <w:r>
+              <w:rPr>
+                <w:color w:val="041E42"/>
+                <w:sz w:val="21"/>
+                <w:szCs w:val="21"/>
+              </w:rPr>
+              <w:t xml:space="preserve">Keep taking steps and marking your book, and change your plan if a step is not working.</w:t>
+            </w:r>
+          </w:p>
+        </w:tc>
+      </w:tr>
+    </w:tbl>
+    <w:p>
+      <w:r>
+        <w:br w:type="page"/>
+      </w:r>
+    </w:p>
+    <w:p>
+      <w:pPr>
+        <w:pBdr>
+          <w:bottom w:val="single" w:color="8F993E" w:sz="12" w:space="6"/>
+        </w:pBdr>
+        <w:spacing w:after="60" w:before="240"/>
+      </w:pPr>
+      <w:r>
+        <w:rPr>
+          <w:b/>
+          <w:bCs/>
+          <w:color w:val="004976"/>
+          <w:sz w:val="40"/>
+          <w:szCs w:val="40"/>
+        </w:rPr>
+        <w:t xml:space="preserve">Phase 6 — Celebrate and look ahead</w:t>
+      </w:r>
+    </w:p>
+    <w:tbl>
+      <w:tblPr>
+        <w:tblW w:type="pct" w:w="100%"/>
+        <w:tblBorders>
+          <w:top w:val="none" w:color="FFFFFF" w:sz="0"/>
+          <w:left w:val="none" w:color="FFFFFF" w:sz="0"/>
+          <w:bottom w:val="none" w:color="FFFFFF" w:sz="0"/>
+          <w:right w:val="none" w:color="FFFFFF" w:sz="0"/>
+          <w:insideH w:val="none" w:color="FFFFFF" w:sz="0"/>
+          <w:insideV w:val="none" w:color="FFFFFF" w:sz="0"/>
+        </w:tblBorders>
+      </w:tblPr>
+      <w:tblGrid>
+        <w:gridCol w:w="100"/>
+      </w:tblGrid>
+      <w:tr>
+        <w:tc>
+          <w:tcPr>
+            <w:shd w:fill="FCEFC9" w:color="auto" w:val="clear"/>
+            <w:tcMar>
+              <w:top w:type="dxa" w:w="90"/>
+              <w:left w:type="dxa" w:w="140"/>
+              <w:bottom w:type="dxa" w:w="90"/>
+              <w:right w:type="dxa" w:w="140"/>
+            </w:tcMar>
+          </w:tcPr>
+          <w:p>
+            <w:pPr>
+              <w:spacing w:after="40"/>
+            </w:pPr>
+            <w:r>
+              <w:rPr>
+                <w:b/>
+                <w:bCs/>
+                <w:color w:val="EF9600"/>
+                <w:spacing w:val="30"/>
+                <w:sz w:val="15"/>
+                <w:szCs w:val="15"/>
+              </w:rPr>
+              <w:t xml:space="preserve">FOCUS OF THIS PHASE</w:t>
+            </w:r>
+          </w:p>
+          <w:p>
+            <w:r>
+              <w:rPr>
+                <w:color w:val="041E42"/>
+                <w:sz w:val="21"/>
+                <w:szCs w:val="21"/>
+              </w:rPr>
+              <w:t xml:space="preserve">Learners look back over the whole course, celebrate and share their growth, and set one goal to keep going with. On Learning Bridge+ this is where the educator gathers the evidence to judge the learner's progress in setting and pursuing goals.</w:t>
+            </w:r>
+          </w:p>
+        </w:tc>
+      </w:tr>
+    </w:tbl>
+    <w:p>
+      <w:pPr>
+        <w:spacing w:after="120" w:before="80"/>
+      </w:pPr>
+      <w:r>
+        <w:rPr>
+          <w:color w:val="97999B"/>
+          <w:sz w:val="19"/>
+          <w:szCs w:val="19"/>
+        </w:rPr>
+        <w:t xml:space="preserve">3h in-person · 2h independent, across 1 blocks.</w:t>
+      </w:r>
+    </w:p>
+    <w:p>
+      <w:pPr>
+        <w:spacing w:after="20" w:before="200"/>
+      </w:pPr>
+      <w:r>
+        <w:rPr>
+          <w:b/>
+          <w:bCs/>
+          <w:color w:val="041E42"/>
+          <w:sz w:val="26"/>
+          <w:szCs w:val="26"/>
+        </w:rPr>
+        <w:t xml:space="preserve">Celebrate and share my growth</w:t>
+      </w:r>
+    </w:p>
+    <w:p>
+      <w:pPr>
+        <w:spacing w:after="80"/>
+      </w:pPr>
+      <w:r>
+        <w:rPr>
+          <w:b/>
+          <w:bCs/>
+          <w:color w:val="8A4E73"/>
+          <w:spacing w:val="20"/>
+          <w:sz w:val="15"/>
+          <w:szCs w:val="15"/>
+        </w:rPr>
+        <w:t xml:space="preserve">CONSOLIDATION   </w:t>
+      </w:r>
+      <w:r>
+        <w:rPr>
+          <w:b/>
+          <w:bCs/>
+          <w:color w:val="3F8291"/>
+          <w:sz w:val="18"/>
+          <w:szCs w:val="18"/>
+        </w:rPr>
+        <w:t xml:space="preserve">3h in-person · 2h independent</w:t>
+      </w:r>
+    </w:p>
+    <w:p>
+      <w:pPr>
+        <w:spacing w:after="80"/>
+      </w:pPr>
+      <w:r>
+        <w:rPr>
+          <w:color w:val="041E42"/>
+          <w:sz w:val="21"/>
+          <w:szCs w:val="21"/>
+        </w:rPr>
+        <w:t xml:space="preserve">Close the course. Learners look back through their learning book from the first page, and prepare one way they have grown to share, by drawing and speaking, not writing. Hold a warm, celebratory sharing in same-gender groups, with no one forced to share. Each learner sets one goal to keep going with after the course. On Learning Bridge+, this is the point to gather and record the evidence of each learner's growth in setting and pursuing goals, from their book, their steps taken, and what they say, to inform the assessment judgement.</w:t>
+      </w:r>
+    </w:p>
+    <w:tbl>
+      <w:tblPr>
+        <w:tblW w:type="pct" w:w="100%"/>
+        <w:tblBorders>
+          <w:top w:val="none" w:color="FFFFFF" w:sz="0"/>
+          <w:left w:val="none" w:color="FFFFFF" w:sz="0"/>
+          <w:bottom w:val="none" w:color="FFFFFF" w:sz="0"/>
+          <w:right w:val="none" w:color="FFFFFF" w:sz="0"/>
+          <w:insideH w:val="none" w:color="FFFFFF" w:sz="0"/>
+          <w:insideV w:val="none" w:color="FFFFFF" w:sz="0"/>
+        </w:tblBorders>
+      </w:tblPr>
+      <w:tblGrid>
+        <w:gridCol w:w="100"/>
+      </w:tblGrid>
+      <w:tr>
+        <w:tc>
+          <w:tcPr>
+            <w:shd w:fill="E1EEF1" w:color="auto" w:val="clear"/>
+            <w:tcMar>
+              <w:top w:type="dxa" w:w="90"/>
+              <w:left w:type="dxa" w:w="140"/>
+              <w:bottom w:type="dxa" w:w="90"/>
+              <w:right w:type="dxa" w:w="140"/>
+            </w:tcMar>
+          </w:tcPr>
+          <w:p>
+            <w:pPr>
+              <w:spacing w:after="40"/>
+            </w:pPr>
+            <w:r>
+              <w:rPr>
+                <w:b/>
+                <w:bCs/>
+                <w:color w:val="3F8291"/>
+                <w:spacing w:val="30"/>
+                <w:sz w:val="15"/>
+                <w:szCs w:val="15"/>
+              </w:rPr>
+              <w:t xml:space="preserve">INDEPENDENT TASK (2H)</w:t>
+            </w:r>
+          </w:p>
+          <w:p>
+            <w:r>
+              <w:rPr>
+                <w:color w:val="041E42"/>
+                <w:sz w:val="21"/>
+                <w:szCs w:val="21"/>
+              </w:rPr>
+              <w:t xml:space="preserve">Choose one way you have grown to share, and one goal you will keep working on after the course.</w:t>
+            </w:r>
+          </w:p>
+        </w:tc>
+      </w:tr>
+    </w:tbl>
     <w:sectPr>
       <w:pgSz w:w="11906" w:h="16838" w:orient="portrait"/>
       <w:pgMar w:top="900" w:right="1000" w:bottom="900" w:left="1000" w:header="708" w:footer="708" w:gutter="0"/>

</xml_diff>

<commit_message>
feat: add an "explore the objectives" orientation to the AIL first phase
- New reusable, component-agnostic orientation activity `exploring-your-
  objectives` (main-site generic): learners unpack a course's objectives,
  discuss why each matters, clarify the words and ask questions, then say how
  they would approach each — surfacing prior knowledge so the facilitator can
  adjust. Applies to any component, including the Research Project.
- Cox's Bazar edition `cb-ail-exploring-our-objectives`: oral/visual, the four
  AIL objectives as pictures, words taught plainly with room for questions, and
  a listening step that reads the group's starting point.
- Added to the unit's Getting started phase (2.5h) and rebalanced other blocks
  so the component stays at 50h (30 in-person + 20 independent). Downloads
  regenerated.

Co-Authored-By: Claude Opus 4.8 <noreply@anthropic.com>
</commit_message>
<xml_diff>
--- a/public/downloads/agency-in-learning-facilitator-unit-plan.docx
+++ b/public/downloads/agency-in-learning-facilitator-unit-plan.docx
@@ -259,7 +259,7 @@
           <w:sz w:val="19"/>
           <w:szCs w:val="19"/>
         </w:rPr>
-        <w:t xml:space="preserve">3h in-person · 30 min independent, across 2 blocks.</w:t>
+        <w:t xml:space="preserve">5h in-person · 1h independent, across 3 blocks.</w:t>
       </w:r>
     </w:p>
     <w:p>
@@ -300,7 +300,7 @@
           <w:sz w:val="18"/>
           <w:szCs w:val="18"/>
         </w:rPr>
-        <w:t xml:space="preserve">1.5h in-person</w:t>
+        <w:t xml:space="preserve">1h in-person</w:t>
       </w:r>
     </w:p>
     <w:p>
@@ -314,6 +314,814 @@
           <w:szCs w:val="21"/>
         </w:rPr>
         <w:t xml:space="preserve">Open the course. Build a safe, welcoming space: names, a simple agreement about how the group treats each other, and reassurance that no one has to read, write, or share anything they would rather keep private. Introduce the big idea in your own words: many things here are decided by others, but what you learn is something you can choose, and this course is about taking hold of your own learning. Keep it warm, oral, and unhurried.</w:t>
+      </w:r>
+    </w:p>
+    <w:p>
+      <w:pPr>
+        <w:spacing w:after="20" w:before="200"/>
+      </w:pPr>
+      <w:r>
+        <w:rPr>
+          <w:b/>
+          <w:bCs/>
+          <w:color w:val="041E42"/>
+          <w:sz w:val="26"/>
+          <w:szCs w:val="26"/>
+        </w:rPr>
+        <w:t xml:space="preserve">What we will learn, and why</w:t>
+      </w:r>
+    </w:p>
+    <w:p>
+      <w:pPr>
+        <w:spacing w:after="80"/>
+      </w:pPr>
+      <w:r>
+        <w:rPr>
+          <w:b/>
+          <w:bCs/>
+          <w:color w:val="8A4E73"/>
+          <w:spacing w:val="20"/>
+          <w:sz w:val="15"/>
+          <w:szCs w:val="15"/>
+        </w:rPr>
+        <w:t xml:space="preserve">ACTIVITY   </w:t>
+      </w:r>
+      <w:r>
+        <w:rPr>
+          <w:b/>
+          <w:bCs/>
+          <w:color w:val="3F8291"/>
+          <w:sz w:val="18"/>
+          <w:szCs w:val="18"/>
+        </w:rPr>
+        <w:t xml:space="preserve">2.5h in-person · 30 min independent</w:t>
+      </w:r>
+    </w:p>
+    <w:tbl>
+      <w:tblPr>
+        <w:tblW w:type="pct" w:w="100%"/>
+        <w:tblBorders>
+          <w:top w:val="none" w:color="FFFFFF" w:sz="0"/>
+          <w:left w:val="none" w:color="FFFFFF" w:sz="0"/>
+          <w:bottom w:val="none" w:color="FFFFFF" w:sz="0"/>
+          <w:right w:val="none" w:color="FFFFFF" w:sz="0"/>
+          <w:insideH w:val="none" w:color="FFFFFF" w:sz="0"/>
+          <w:insideV w:val="none" w:color="FFFFFF" w:sz="0"/>
+        </w:tblBorders>
+      </w:tblPr>
+      <w:tblGrid>
+        <w:gridCol w:w="100"/>
+      </w:tblGrid>
+      <w:tr>
+        <w:tc>
+          <w:tcPr>
+            <w:shd w:fill="FBEFE0" w:color="auto" w:val="clear"/>
+            <w:tcMar>
+              <w:top w:type="dxa" w:w="90"/>
+              <w:left w:type="dxa" w:w="140"/>
+              <w:bottom w:type="dxa" w:w="90"/>
+              <w:right w:type="dxa" w:w="140"/>
+            </w:tcMar>
+          </w:tcPr>
+          <w:p>
+            <w:pPr>
+              <w:spacing w:after="40"/>
+            </w:pPr>
+            <w:r>
+              <w:rPr>
+                <w:b/>
+                <w:bCs/>
+                <w:color w:val="EF9600"/>
+                <w:spacing w:val="30"/>
+                <w:sz w:val="15"/>
+                <w:szCs w:val="15"/>
+              </w:rPr>
+              <w:t xml:space="preserve">THE ONE THING TO GET RIGHT</w:t>
+            </w:r>
+          </w:p>
+          <w:p>
+            <w:r>
+              <w:rPr>
+                <w:color w:val="041E42"/>
+                <w:sz w:val="21"/>
+                <w:szCs w:val="21"/>
+              </w:rPr>
+              <w:t xml:space="preserve">This is the map of the whole course, and a chance to hear what learners already know. The one thing to get right is that you listen more than you talk in the second half: how learners say they would approach each objective tells you what they already do and where to slow down or speed up. Keep the four objectives in plain, spoken words with a picture each, check every word is understood, and make it safe to ask questions and to not know. Learners who see where they are going, and why it is theirs, begin the course with agency rather than confusion.</w:t>
+            </w:r>
+          </w:p>
+        </w:tc>
+      </w:tr>
+    </w:tbl>
+    <w:p>
+      <w:pPr>
+        <w:spacing w:after="40" w:before="160"/>
+      </w:pPr>
+      <w:r>
+        <w:rPr>
+          <w:b/>
+          <w:bCs/>
+          <w:color w:val="004976"/>
+          <w:spacing w:val="30"/>
+          <w:sz w:val="17"/>
+          <w:szCs w:val="17"/>
+        </w:rPr>
+        <w:t xml:space="preserve">PREPARE</w:t>
+      </w:r>
+    </w:p>
+    <w:p>
+      <w:pPr>
+        <w:pStyle w:val="ListParagraph"/>
+        <w:numPr>
+          <w:ilvl w:val="0"/>
+          <w:numId w:val="1"/>
+        </w:numPr>
+        <w:spacing w:after="40"/>
+      </w:pPr>
+      <w:r>
+        <w:rPr>
+          <w:color w:val="041E42"/>
+          <w:sz w:val="21"/>
+          <w:szCs w:val="21"/>
+        </w:rPr>
+        <w:t xml:space="preserve">Four simple pictures or symbols, one for each objective, big enough for the group to see, drawn or on paper.</w:t>
+      </w:r>
+    </w:p>
+    <w:p>
+      <w:pPr>
+        <w:pStyle w:val="ListParagraph"/>
+        <w:numPr>
+          <w:ilvl w:val="0"/>
+          <w:numId w:val="1"/>
+        </w:numPr>
+        <w:spacing w:after="40"/>
+      </w:pPr>
+      <w:r>
+        <w:rPr>
+          <w:color w:val="041E42"/>
+          <w:sz w:val="21"/>
+          <w:szCs w:val="21"/>
+        </w:rPr>
+        <w:t xml:space="preserve">The key words ready to say and show: goal, plan, step, feedback, reflect, progress, each with a plain meaning.</w:t>
+      </w:r>
+    </w:p>
+    <w:p>
+      <w:pPr>
+        <w:pStyle w:val="ListParagraph"/>
+        <w:numPr>
+          <w:ilvl w:val="0"/>
+          <w:numId w:val="1"/>
+        </w:numPr>
+        <w:spacing w:after="40"/>
+      </w:pPr>
+      <w:r>
+        <w:rPr>
+          <w:color w:val="041E42"/>
+          <w:sz w:val="21"/>
+          <w:szCs w:val="21"/>
+        </w:rPr>
+        <w:t xml:space="preserve">The student workbook, with a page for the four objectives and space to mark or draw an approach to each.</w:t>
+      </w:r>
+    </w:p>
+    <w:p>
+      <w:pPr>
+        <w:pStyle w:val="ListParagraph"/>
+        <w:numPr>
+          <w:ilvl w:val="0"/>
+          <w:numId w:val="1"/>
+        </w:numPr>
+        <w:spacing w:after="40"/>
+      </w:pPr>
+      <w:r>
+        <w:rPr>
+          <w:color w:val="041E42"/>
+          <w:sz w:val="21"/>
+          <w:szCs w:val="21"/>
+        </w:rPr>
+        <w:t xml:space="preserve">Sensitivity: talking about why learning matters can raise hard feelings about the future. Keep it about what learners can control, their own learning now, and let anyone stay quiet.</w:t>
+      </w:r>
+    </w:p>
+    <w:p>
+      <w:pPr>
+        <w:spacing w:after="40" w:before="140"/>
+      </w:pPr>
+      <w:r>
+        <w:rPr>
+          <w:b/>
+          <w:bCs/>
+          <w:color w:val="004976"/>
+          <w:sz w:val="22"/>
+          <w:szCs w:val="22"/>
+        </w:rPr>
+        <w:t xml:space="preserve">1. The four things we will learn</w:t>
+      </w:r>
+      <w:r>
+        <w:rPr>
+          <w:color w:val="97999B"/>
+          <w:sz w:val="17"/>
+          <w:szCs w:val="17"/>
+        </w:rPr>
+        <w:t xml:space="preserve">   30 min</w:t>
+      </w:r>
+    </w:p>
+    <w:p>
+      <w:pPr>
+        <w:spacing w:after="80"/>
+      </w:pPr>
+      <w:r>
+        <w:rPr>
+          <w:color w:val="041E42"/>
+          <w:sz w:val="21"/>
+          <w:szCs w:val="21"/>
+        </w:rPr>
+        <w:t xml:space="preserve">Show the four pictures, one at a time, and say each objective in plain words: get to know yourself as a learner; choose a learning goal that matters to you; make a plan and take steps; and see how you are doing, and grow. Lay them out as a journey the group will travel together. Keep it spoken and visual; the aim is that every learner can see the whole path, not memorise it.</w:t>
+      </w:r>
+    </w:p>
+    <w:p>
+      <w:pPr>
+        <w:spacing w:after="20"/>
+      </w:pPr>
+      <w:r>
+        <w:rPr>
+          <w:b/>
+          <w:bCs/>
+          <w:color w:val="8F993E"/>
+          <w:sz w:val="18"/>
+          <w:szCs w:val="18"/>
+        </w:rPr>
+        <w:t xml:space="preserve">Ask:</w:t>
+      </w:r>
+    </w:p>
+    <w:p>
+      <w:pPr>
+        <w:pStyle w:val="ListParagraph"/>
+        <w:numPr>
+          <w:ilvl w:val="0"/>
+          <w:numId w:val="1"/>
+        </w:numPr>
+        <w:spacing w:after="20"/>
+      </w:pPr>
+      <w:r>
+        <w:rPr>
+          <w:color w:val="041E42"/>
+          <w:sz w:val="20"/>
+          <w:szCs w:val="20"/>
+        </w:rPr>
+        <w:t xml:space="preserve">Looking at these four pictures, what do you think this course will help you do?</w:t>
+      </w:r>
+    </w:p>
+    <w:p>
+      <w:pPr>
+        <w:pStyle w:val="ListParagraph"/>
+        <w:numPr>
+          <w:ilvl w:val="0"/>
+          <w:numId w:val="1"/>
+        </w:numPr>
+        <w:spacing w:after="20"/>
+      </w:pPr>
+      <w:r>
+        <w:rPr>
+          <w:color w:val="041E42"/>
+          <w:sz w:val="20"/>
+          <w:szCs w:val="20"/>
+        </w:rPr>
+        <w:t xml:space="preserve">Which of these four feels new to you, and which have you done a little of before?</w:t>
+      </w:r>
+    </w:p>
+    <w:p>
+      <w:pPr>
+        <w:spacing w:after="20" w:before="40"/>
+      </w:pPr>
+      <w:r>
+        <w:rPr>
+          <w:b/>
+          <w:bCs/>
+          <w:color w:val="BD472A"/>
+          <w:sz w:val="18"/>
+          <w:szCs w:val="18"/>
+        </w:rPr>
+        <w:t xml:space="preserve">Watch out:</w:t>
+      </w:r>
+    </w:p>
+    <w:p>
+      <w:pPr>
+        <w:pStyle w:val="ListParagraph"/>
+        <w:numPr>
+          <w:ilvl w:val="0"/>
+          <w:numId w:val="1"/>
+        </w:numPr>
+        <w:spacing w:after="20"/>
+      </w:pPr>
+      <w:r>
+        <w:rPr>
+          <w:color w:val="041E42"/>
+          <w:sz w:val="20"/>
+          <w:szCs w:val="20"/>
+        </w:rPr>
+        <w:t xml:space="preserve">Learners stay silent, unsure if it is safe to speak; start with the easiest picture and your own plain example, so speaking up feels safe before you ask anything harder.</w:t>
+      </w:r>
+    </w:p>
+    <w:p>
+      <w:pPr>
+        <w:spacing w:after="40" w:before="20"/>
+      </w:pPr>
+      <w:r>
+        <w:rPr>
+          <w:i/>
+          <w:iCs/>
+          <w:color w:val="6B7280"/>
+          <w:sz w:val="18"/>
+          <w:szCs w:val="18"/>
+        </w:rPr>
+        <w:t xml:space="preserve">If low-resource: No board is needed: draw the four pictures on paper or the ground, or hold them up one at a time, and say each objective aloud.</w:t>
+      </w:r>
+    </w:p>
+    <w:p>
+      <w:pPr>
+        <w:spacing w:after="40" w:before="140"/>
+      </w:pPr>
+      <w:r>
+        <w:rPr>
+          <w:b/>
+          <w:bCs/>
+          <w:color w:val="004976"/>
+          <w:sz w:val="22"/>
+          <w:szCs w:val="22"/>
+        </w:rPr>
+        <w:t xml:space="preserve">2. Why this matters to you</w:t>
+      </w:r>
+      <w:r>
+        <w:rPr>
+          <w:color w:val="97999B"/>
+          <w:sz w:val="17"/>
+          <w:szCs w:val="17"/>
+        </w:rPr>
+        <w:t xml:space="preserve">   30 min</w:t>
+      </w:r>
+    </w:p>
+    <w:p>
+      <w:pPr>
+        <w:spacing w:after="80"/>
+      </w:pPr>
+      <w:r>
+        <w:rPr>
+          <w:color w:val="041E42"/>
+          <w:sz w:val="21"/>
+          <w:szCs w:val="21"/>
+        </w:rPr>
+        <w:t xml:space="preserve">Take each objective and draw out why it matters in a learner's own life. In a place where much is decided for you, your own learning is something you can direct, and these four are how you do it. Ask learners, in same-gender pairs, to say which one matters most to them and why, then hear a few. Keep it about their learning and what they can control, not about far-off futures.</w:t>
+      </w:r>
+    </w:p>
+    <w:p>
+      <w:pPr>
+        <w:spacing w:after="20"/>
+      </w:pPr>
+      <w:r>
+        <w:rPr>
+          <w:b/>
+          <w:bCs/>
+          <w:color w:val="8F993E"/>
+          <w:sz w:val="18"/>
+          <w:szCs w:val="18"/>
+        </w:rPr>
+        <w:t xml:space="preserve">Ask:</w:t>
+      </w:r>
+    </w:p>
+    <w:p>
+      <w:pPr>
+        <w:pStyle w:val="ListParagraph"/>
+        <w:numPr>
+          <w:ilvl w:val="0"/>
+          <w:numId w:val="1"/>
+        </w:numPr>
+        <w:spacing w:after="20"/>
+      </w:pPr>
+      <w:r>
+        <w:rPr>
+          <w:color w:val="041E42"/>
+          <w:sz w:val="20"/>
+          <w:szCs w:val="20"/>
+        </w:rPr>
+        <w:t xml:space="preserve">Why might it help you to choose your own learning goal, rather than be told what to learn?</w:t>
+      </w:r>
+    </w:p>
+    <w:p>
+      <w:pPr>
+        <w:pStyle w:val="ListParagraph"/>
+        <w:numPr>
+          <w:ilvl w:val="0"/>
+          <w:numId w:val="1"/>
+        </w:numPr>
+        <w:spacing w:after="20"/>
+      </w:pPr>
+      <w:r>
+        <w:rPr>
+          <w:color w:val="041E42"/>
+          <w:sz w:val="20"/>
+          <w:szCs w:val="20"/>
+        </w:rPr>
+        <w:t xml:space="preserve">Which of these four would make the biggest difference to you right now?</w:t>
+      </w:r>
+    </w:p>
+    <w:p>
+      <w:pPr>
+        <w:spacing w:after="20" w:before="40"/>
+      </w:pPr>
+      <w:r>
+        <w:rPr>
+          <w:b/>
+          <w:bCs/>
+          <w:color w:val="BD472A"/>
+          <w:sz w:val="18"/>
+          <w:szCs w:val="18"/>
+        </w:rPr>
+        <w:t xml:space="preserve">Watch out:</w:t>
+      </w:r>
+    </w:p>
+    <w:p>
+      <w:pPr>
+        <w:pStyle w:val="ListParagraph"/>
+        <w:numPr>
+          <w:ilvl w:val="0"/>
+          <w:numId w:val="1"/>
+        </w:numPr>
+        <w:spacing w:after="20"/>
+      </w:pPr>
+      <w:r>
+        <w:rPr>
+          <w:color w:val="041E42"/>
+          <w:sz w:val="20"/>
+          <w:szCs w:val="20"/>
+        </w:rPr>
+        <w:t xml:space="preserve">The talk drifts to futures that feel blocked and learners deflate; gently bring it back to the learning they can control now, which is the whole point of the course.</w:t>
+      </w:r>
+    </w:p>
+    <w:p>
+      <w:pPr>
+        <w:spacing w:after="40" w:before="140"/>
+      </w:pPr>
+      <w:r>
+        <w:rPr>
+          <w:b/>
+          <w:bCs/>
+          <w:color w:val="004976"/>
+          <w:sz w:val="22"/>
+          <w:szCs w:val="22"/>
+        </w:rPr>
+        <w:t xml:space="preserve">3. The words we will use</w:t>
+      </w:r>
+      <w:r>
+        <w:rPr>
+          <w:color w:val="97999B"/>
+          <w:sz w:val="17"/>
+          <w:szCs w:val="17"/>
+        </w:rPr>
+        <w:t xml:space="preserve">   30 min</w:t>
+      </w:r>
+    </w:p>
+    <w:p>
+      <w:pPr>
+        <w:spacing w:after="80"/>
+      </w:pPr>
+      <w:r>
+        <w:rPr>
+          <w:color w:val="041E42"/>
+          <w:sz w:val="21"/>
+          <w:szCs w:val="21"/>
+        </w:rPr>
+        <w:t xml:space="preserve">Teach the key words plainly, with a gesture or example for each: a goal is a thing you want to be able to do; a plan is the steps to get there; a step is one small thing you do; feedback is what someone tells you to help you get better; to reflect is to think back on how you did; progress is getting better. Check understanding by asking learners to say each back in their own words, and make plenty of room for questions.</w:t>
+      </w:r>
+    </w:p>
+    <w:p>
+      <w:pPr>
+        <w:spacing w:after="20"/>
+      </w:pPr>
+      <w:r>
+        <w:rPr>
+          <w:b/>
+          <w:bCs/>
+          <w:color w:val="8F993E"/>
+          <w:sz w:val="18"/>
+          <w:szCs w:val="18"/>
+        </w:rPr>
+        <w:t xml:space="preserve">Ask:</w:t>
+      </w:r>
+    </w:p>
+    <w:p>
+      <w:pPr>
+        <w:pStyle w:val="ListParagraph"/>
+        <w:numPr>
+          <w:ilvl w:val="0"/>
+          <w:numId w:val="1"/>
+        </w:numPr>
+        <w:spacing w:after="20"/>
+      </w:pPr>
+      <w:r>
+        <w:rPr>
+          <w:color w:val="041E42"/>
+          <w:sz w:val="20"/>
+          <w:szCs w:val="20"/>
+        </w:rPr>
+        <w:t xml:space="preserve">Can you say what a goal is in your own words? What about a step?</w:t>
+      </w:r>
+    </w:p>
+    <w:p>
+      <w:pPr>
+        <w:pStyle w:val="ListParagraph"/>
+        <w:numPr>
+          <w:ilvl w:val="0"/>
+          <w:numId w:val="1"/>
+        </w:numPr>
+        <w:spacing w:after="20"/>
+      </w:pPr>
+      <w:r>
+        <w:rPr>
+          <w:color w:val="041E42"/>
+          <w:sz w:val="20"/>
+          <w:szCs w:val="20"/>
+        </w:rPr>
+        <w:t xml:space="preserve">What questions do you have about any of these words, or about the four things we will learn?</w:t>
+      </w:r>
+    </w:p>
+    <w:p>
+      <w:pPr>
+        <w:spacing w:after="20" w:before="40"/>
+      </w:pPr>
+      <w:r>
+        <w:rPr>
+          <w:b/>
+          <w:bCs/>
+          <w:color w:val="BD472A"/>
+          <w:sz w:val="18"/>
+          <w:szCs w:val="18"/>
+        </w:rPr>
+        <w:t xml:space="preserve">Watch out:</w:t>
+      </w:r>
+    </w:p>
+    <w:p>
+      <w:pPr>
+        <w:pStyle w:val="ListParagraph"/>
+        <w:numPr>
+          <w:ilvl w:val="0"/>
+          <w:numId w:val="1"/>
+        </w:numPr>
+        <w:spacing w:after="20"/>
+      </w:pPr>
+      <w:r>
+        <w:rPr>
+          <w:color w:val="041E42"/>
+          <w:sz w:val="20"/>
+          <w:szCs w:val="20"/>
+        </w:rPr>
+        <w:t xml:space="preserve">A learner nods without understanding a word; ask them to say it back or give an example, since a word left unclear now will trip up a whole later session.</w:t>
+      </w:r>
+    </w:p>
+    <w:p>
+      <w:pPr>
+        <w:spacing w:after="40" w:before="20"/>
+      </w:pPr>
+      <w:r>
+        <w:rPr>
+          <w:i/>
+          <w:iCs/>
+          <w:color w:val="6B7280"/>
+          <w:sz w:val="18"/>
+          <w:szCs w:val="18"/>
+        </w:rPr>
+        <w:t xml:space="preserve">If low-resource: No writing is needed: teach each word by saying it, showing a gesture or picture, and having learners say it back. The words can be added to the workbook later.</w:t>
+      </w:r>
+    </w:p>
+    <w:p>
+      <w:pPr>
+        <w:spacing w:after="40" w:before="140"/>
+      </w:pPr>
+      <w:r>
+        <w:rPr>
+          <w:b/>
+          <w:bCs/>
+          <w:color w:val="004976"/>
+          <w:sz w:val="22"/>
+          <w:szCs w:val="22"/>
+        </w:rPr>
+        <w:t xml:space="preserve">4. How would you try to reach each one?</w:t>
+      </w:r>
+      <w:r>
+        <w:rPr>
+          <w:color w:val="97999B"/>
+          <w:sz w:val="17"/>
+          <w:szCs w:val="17"/>
+        </w:rPr>
+        <w:t xml:space="preserve">   40 min</w:t>
+      </w:r>
+    </w:p>
+    <w:p>
+      <w:pPr>
+        <w:spacing w:after="80"/>
+      </w:pPr>
+      <w:r>
+        <w:rPr>
+          <w:color w:val="041E42"/>
+          <w:sz w:val="21"/>
+          <w:szCs w:val="21"/>
+        </w:rPr>
+        <w:t xml:space="preserve">This is the part where you listen. For each of the four objectives, ask learners to say or draw how they might try to reach it, and what they already do that is a little like it. Circulate and note what you hear: who already sets themselves small goals, who tracks anything, who asks for help. This surfaces what learners already know so you can adjust how much time each phase needs.</w:t>
+      </w:r>
+    </w:p>
+    <w:p>
+      <w:pPr>
+        <w:spacing w:after="20"/>
+      </w:pPr>
+      <w:r>
+        <w:rPr>
+          <w:b/>
+          <w:bCs/>
+          <w:color w:val="8F993E"/>
+          <w:sz w:val="18"/>
+          <w:szCs w:val="18"/>
+        </w:rPr>
+        <w:t xml:space="preserve">Ask:</w:t>
+      </w:r>
+    </w:p>
+    <w:p>
+      <w:pPr>
+        <w:pStyle w:val="ListParagraph"/>
+        <w:numPr>
+          <w:ilvl w:val="0"/>
+          <w:numId w:val="1"/>
+        </w:numPr>
+        <w:spacing w:after="20"/>
+      </w:pPr>
+      <w:r>
+        <w:rPr>
+          <w:color w:val="041E42"/>
+          <w:sz w:val="20"/>
+          <w:szCs w:val="20"/>
+        </w:rPr>
+        <w:t xml:space="preserve">If you wanted to get better at something, how would you start? What would you do first?</w:t>
+      </w:r>
+    </w:p>
+    <w:p>
+      <w:pPr>
+        <w:pStyle w:val="ListParagraph"/>
+        <w:numPr>
+          <w:ilvl w:val="0"/>
+          <w:numId w:val="1"/>
+        </w:numPr>
+        <w:spacing w:after="20"/>
+      </w:pPr>
+      <w:r>
+        <w:rPr>
+          <w:color w:val="041E42"/>
+          <w:sz w:val="20"/>
+          <w:szCs w:val="20"/>
+        </w:rPr>
+        <w:t xml:space="preserve">Who or what already helps you when you want to learn something?</w:t>
+      </w:r>
+    </w:p>
+    <w:p>
+      <w:pPr>
+        <w:spacing w:after="20" w:before="40"/>
+      </w:pPr>
+      <w:r>
+        <w:rPr>
+          <w:b/>
+          <w:bCs/>
+          <w:color w:val="BD472A"/>
+          <w:sz w:val="18"/>
+          <w:szCs w:val="18"/>
+        </w:rPr>
+        <w:t xml:space="preserve">Watch out:</w:t>
+      </w:r>
+    </w:p>
+    <w:p>
+      <w:pPr>
+        <w:pStyle w:val="ListParagraph"/>
+        <w:numPr>
+          <w:ilvl w:val="0"/>
+          <w:numId w:val="1"/>
+        </w:numPr>
+        <w:spacing w:after="20"/>
+      </w:pPr>
+      <w:r>
+        <w:rPr>
+          <w:color w:val="041E42"/>
+          <w:sz w:val="20"/>
+          <w:szCs w:val="20"/>
+        </w:rPr>
+        <w:t xml:space="preserve">Learners think there is a right answer and go quiet; make clear you want to know what they already do, that there is no wrong answer, and that this helps you teach them better.</w:t>
+      </w:r>
+    </w:p>
+    <w:p>
+      <w:pPr>
+        <w:spacing w:after="40" w:before="20"/>
+      </w:pPr>
+      <w:r>
+        <w:rPr>
+          <w:i/>
+          <w:iCs/>
+          <w:color w:val="6B7280"/>
+          <w:sz w:val="18"/>
+          <w:szCs w:val="18"/>
+        </w:rPr>
+        <w:t xml:space="preserve">If low-resource: Learners can act it out, draw it, or say it to a partner. The point is that you hear their real starting point, not that anything is written down.</w:t>
+      </w:r>
+    </w:p>
+    <w:p>
+      <w:pPr>
+        <w:spacing w:after="40" w:before="160"/>
+      </w:pPr>
+      <w:r>
+        <w:rPr>
+          <w:b/>
+          <w:bCs/>
+          <w:color w:val="004976"/>
+          <w:spacing w:val="30"/>
+          <w:sz w:val="17"/>
+          <w:szCs w:val="17"/>
+        </w:rPr>
+        <w:t xml:space="preserve">CLOSING</w:t>
+      </w:r>
+    </w:p>
+    <w:p>
+      <w:pPr>
+        <w:spacing w:after="80"/>
+      </w:pPr>
+      <w:r>
+        <w:rPr>
+          <w:color w:val="041E42"/>
+          <w:sz w:val="21"/>
+          <w:szCs w:val="21"/>
+        </w:rPr>
+        <w:t xml:space="preserve">Recap the four-part journey with the pictures, and remind learners they now have a map of where the course is going and why it is theirs. Answer any last questions, and reassure them that everyone starts from a different place and that is fine. Independent task: tell one person at home the one of the four things you most want to get better at, and why.</w:t>
+      </w:r>
+    </w:p>
+    <w:tbl>
+      <w:tblPr>
+        <w:tblW w:type="pct" w:w="100%"/>
+        <w:tblBorders>
+          <w:top w:val="none" w:color="FFFFFF" w:sz="0"/>
+          <w:left w:val="none" w:color="FFFFFF" w:sz="0"/>
+          <w:bottom w:val="none" w:color="FFFFFF" w:sz="0"/>
+          <w:right w:val="none" w:color="FFFFFF" w:sz="0"/>
+          <w:insideH w:val="none" w:color="FFFFFF" w:sz="0"/>
+          <w:insideV w:val="none" w:color="FFFFFF" w:sz="0"/>
+        </w:tblBorders>
+      </w:tblPr>
+      <w:tblGrid>
+        <w:gridCol w:w="100"/>
+      </w:tblGrid>
+      <w:tr>
+        <w:tc>
+          <w:tcPr>
+            <w:shd w:fill="E1EEF1" w:color="auto" w:val="clear"/>
+            <w:tcMar>
+              <w:top w:type="dxa" w:w="90"/>
+              <w:left w:type="dxa" w:w="140"/>
+              <w:bottom w:type="dxa" w:w="90"/>
+              <w:right w:type="dxa" w:w="140"/>
+            </w:tcMar>
+          </w:tcPr>
+          <w:p>
+            <w:pPr>
+              <w:spacing w:after="40"/>
+            </w:pPr>
+            <w:r>
+              <w:rPr>
+                <w:b/>
+                <w:bCs/>
+                <w:color w:val="3F8291"/>
+                <w:spacing w:val="30"/>
+                <w:sz w:val="15"/>
+                <w:szCs w:val="15"/>
+              </w:rPr>
+              <w:t xml:space="preserve">INDEPENDENT TASK (30 MIN)</w:t>
+            </w:r>
+          </w:p>
+          <w:p>
+            <w:r>
+              <w:rPr>
+                <w:color w:val="041E42"/>
+                <w:sz w:val="21"/>
+                <w:szCs w:val="21"/>
+              </w:rPr>
+              <w:t xml:space="preserve">Tell one person at home the one of the four things you most want to get better at, and why.</w:t>
+            </w:r>
+          </w:p>
+        </w:tc>
+      </w:tr>
+    </w:tbl>
+    <w:p>
+      <w:pPr>
+        <w:spacing w:after="80" w:before="40"/>
+      </w:pPr>
+      <w:r>
+        <w:rPr>
+          <w:i/>
+          <w:iCs/>
+          <w:color w:val="6B7280"/>
+          <w:sz w:val="18"/>
+          <w:szCs w:val="18"/>
+        </w:rPr>
+        <w:t xml:space="preserve">Note: Listen closely in the second half: how learners say they would approach each objective surfaces what they already know, so you can adjust how long each later phase needs. This same orientation activity works for the Research Project too (see exploring-your-objectives).</w:t>
       </w:r>
     </w:p>
     <w:p>
@@ -3664,7 +4472,7 @@
           <w:sz w:val="19"/>
           <w:szCs w:val="19"/>
         </w:rPr>
-        <w:t xml:space="preserve">6h in-person · 3h independent, across 3 blocks.</w:t>
+        <w:t xml:space="preserve">5.5h in-person · 3h independent, across 3 blocks.</w:t>
       </w:r>
     </w:p>
     <w:p>
@@ -3705,7 +4513,7 @@
           <w:sz w:val="18"/>
           <w:szCs w:val="18"/>
         </w:rPr>
-        <w:t xml:space="preserve">2h in-person · 30 min independent</w:t>
+        <w:t xml:space="preserve">1.5h in-person · 30 min independent</w:t>
       </w:r>
     </w:p>
     <w:tbl>
@@ -6068,7 +6876,7 @@
           <w:sz w:val="19"/>
           <w:szCs w:val="19"/>
         </w:rPr>
-        <w:t xml:space="preserve">7h in-person · 6h independent, across 4 blocks.</w:t>
+        <w:t xml:space="preserve">6h in-person · 6h independent, across 4 blocks.</w:t>
       </w:r>
     </w:p>
     <w:p>
@@ -6989,7 +7797,7 @@
           <w:sz w:val="18"/>
           <w:szCs w:val="18"/>
         </w:rPr>
-        <w:t xml:space="preserve">2h in-person · 1h independent</w:t>
+        <w:t xml:space="preserve">1.5h in-person · 1h independent</w:t>
       </w:r>
     </w:p>
     <w:tbl>
@@ -7716,7 +8524,7 @@
           <w:sz w:val="18"/>
           <w:szCs w:val="18"/>
         </w:rPr>
-        <w:t xml:space="preserve">2h in-person · 1h independent</w:t>
+        <w:t xml:space="preserve">1.5h in-person · 1h independent</w:t>
       </w:r>
     </w:p>
     <w:tbl>
@@ -8770,7 +9578,7 @@
           <w:sz w:val="19"/>
           <w:szCs w:val="19"/>
         </w:rPr>
-        <w:t xml:space="preserve">5h in-person · 5.5h independent, across 3 blocks.</w:t>
+        <w:t xml:space="preserve">5h in-person · 5h independent, across 3 blocks.</w:t>
       </w:r>
     </w:p>
     <w:p>
@@ -10277,7 +11085,7 @@
           <w:sz w:val="18"/>
           <w:szCs w:val="18"/>
         </w:rPr>
-        <w:t xml:space="preserve">1h in-person · 3h independent</w:t>
+        <w:t xml:space="preserve">1h in-person · 2.5h independent</w:t>
       </w:r>
     </w:p>
     <w:p>
@@ -10332,7 +11140,7 @@
                 <w:sz w:val="15"/>
                 <w:szCs w:val="15"/>
               </w:rPr>
-              <w:t xml:space="preserve">INDEPENDENT TASK (3H)</w:t>
+              <w:t xml:space="preserve">INDEPENDENT TASK (2.5H)</w:t>
             </w:r>
           </w:p>
           <w:p>

</xml_diff>

<commit_message>
feat: provide the pictures the activities suggest (Picture Cards + embedded icons)
- 19 clean brand SVG icons in public/diagrams/ail/ for every image the AIL
  materials call for: the four objectives, the goal tests, strengths prompts,
  when-I-learn times, and a wish/step/feedback set.
- New editable/printable "Picture Cards" PDF download: every suggested picture
  as a labelled, cut-out card, grouped by activity.
- Embedded the four objective icons in the workbook "What we will learn" page
  and the slides, and the time icons on the how-I-learn page.
- Updated the materials that suggest pictures to point at the provided pack, so
  facilitators are given the images rather than told to source them.

Co-Authored-By: Claude Opus 4.8 <noreply@anthropic.com>
</commit_message>
<xml_diff>
--- a/public/downloads/agency-in-learning-facilitator-unit-plan.docx
+++ b/public/downloads/agency-in-learning-facilitator-unit-plan.docx
@@ -443,7 +443,7 @@
           <w:sz w:val="21"/>
           <w:szCs w:val="21"/>
         </w:rPr>
-        <w:t xml:space="preserve">Four simple pictures or symbols, one for each objective, big enough for the group to see, drawn or on paper.</w:t>
+        <w:t xml:space="preserve">The four objective picture cards (in the provided Picture Cards pack), big enough for the group to see.</w:t>
       </w:r>
     </w:p>
     <w:p>
@@ -2979,7 +2979,7 @@
           <w:sz w:val="21"/>
           <w:szCs w:val="21"/>
         </w:rPr>
-        <w:t xml:space="preserve">Simple pictures or words for common learner strengths (asking questions, sticking at hard things, helping others, remembering, trying again), for learners who are not reading.</w:t>
+        <w:t xml:space="preserve">The strengths picture cards (in the provided Picture Cards pack): asking questions, sticking at hard things, helping others, remembering, trying again.</w:t>
       </w:r>
     </w:p>
     <w:p>
@@ -3739,7 +3739,7 @@
           <w:sz w:val="21"/>
           <w:szCs w:val="21"/>
         </w:rPr>
-        <w:t xml:space="preserve">The student workbook (a picture-clock for when, and simple pictures for where, who, and what helps or hinders).</w:t>
+        <w:t xml:space="preserve">The student workbook, and the time picture cards (in the provided Picture Cards pack): morning, midday, night.</w:t>
       </w:r>
     </w:p>
     <w:p>
@@ -4602,7 +4602,7 @@
           <w:sz w:val="21"/>
           <w:szCs w:val="21"/>
         </w:rPr>
-        <w:t xml:space="preserve">The four tests ready to say aloud, with a simple picture for each on the workbook page (small, clear, matters, by-when).</w:t>
+        <w:t xml:space="preserve">The four goal-test picture cards (in the provided Picture Cards pack): small, clear, it matters, by-when.</w:t>
       </w:r>
     </w:p>
     <w:p>

</xml_diff>

<commit_message>
feat: make the AIL unit's gradual release of control explicit, with cautions
Informed by the competency kit's teaching-for-competence spectrum: agency grows
as control is handed over, so the unit now shows and explains its arc.

- A `lead` level per phase (you lead -> shared -> learners lead), rendered as a
  badge on each phase, tracing the deliberate release from facilitator-led
  orientation to learner-led goal-pursuit and celebration.
- A `deliveryApproach` note on the unit ("How this unit hands over control")
  rendered on the unit page and on the facilitator Word doc cover, with the
  cautions: release gradually and safely; some learners need more structure for
  longer; autonomy is offered, never imposed; add support if a learner flounders,
  never withdraw help as a test.
- Facilitator doc also shows the "who leads" mode per phase.

Co-Authored-By: Claude Opus 4.8 <noreply@anthropic.com>
</commit_message>
<xml_diff>
--- a/public/downloads/agency-in-learning-facilitator-unit-plan.docx
+++ b/public/downloads/agency-in-learning-facilitator-unit-plan.docx
@@ -156,6 +156,61 @@
         </w:tc>
       </w:tr>
     </w:tbl>
+    <w:tbl>
+      <w:tblPr>
+        <w:tblW w:type="pct" w:w="100%"/>
+        <w:tblBorders>
+          <w:top w:val="none" w:color="FFFFFF" w:sz="0"/>
+          <w:left w:val="none" w:color="FFFFFF" w:sz="0"/>
+          <w:bottom w:val="none" w:color="FFFFFF" w:sz="0"/>
+          <w:right w:val="none" w:color="FFFFFF" w:sz="0"/>
+          <w:insideH w:val="none" w:color="FFFFFF" w:sz="0"/>
+          <w:insideV w:val="none" w:color="FFFFFF" w:sz="0"/>
+        </w:tblBorders>
+      </w:tblPr>
+      <w:tblGrid>
+        <w:gridCol w:w="100"/>
+      </w:tblGrid>
+      <w:tr>
+        <w:tc>
+          <w:tcPr>
+            <w:shd w:fill="EAF0F6" w:color="auto" w:val="clear"/>
+            <w:tcMar>
+              <w:top w:type="dxa" w:w="90"/>
+              <w:left w:type="dxa" w:w="140"/>
+              <w:bottom w:type="dxa" w:w="90"/>
+              <w:right w:type="dxa" w:w="140"/>
+            </w:tcMar>
+          </w:tcPr>
+          <w:p>
+            <w:pPr>
+              <w:spacing w:after="40"/>
+            </w:pPr>
+            <w:r>
+              <w:rPr>
+                <w:b/>
+                <w:bCs/>
+                <w:color w:val="004976"/>
+                <w:spacing w:val="30"/>
+                <w:sz w:val="15"/>
+                <w:szCs w:val="15"/>
+              </w:rPr>
+              <w:t xml:space="preserve">HOW THIS UNIT HANDS OVER CONTROL</w:t>
+            </w:r>
+          </w:p>
+          <w:p>
+            <w:r>
+              <w:rPr>
+                <w:color w:val="041E42"/>
+                <w:sz w:val="21"/>
+                <w:szCs w:val="21"/>
+              </w:rPr>
+              <w:t xml:space="preserve">This unit deliberately hands over control as it goes, because you cannot build a self-directed learner by directing them the whole way. Early on you lead: you set up a safe space and run the first activities. In the middle it is shared: learners choose and shape their own goals while you guide. Later the learners lead: they drive and pursue their own goals while you step back. Release control gradually and safely. Some learners need more structure for longer, and that is fine. Autonomy is offered, never imposed: if a learner flounders without structure, give them more support, not less, and never withdraw help as a test.</w:t>
+            </w:r>
+          </w:p>
+        </w:tc>
+      </w:tr>
+    </w:tbl>
     <w:p>
       <w:pPr>
         <w:spacing w:before="200"/>
@@ -192,6 +247,21 @@
           <w:szCs w:val="40"/>
         </w:rPr>
         <w:t xml:space="preserve">Phase 1 — Getting started</w:t>
+      </w:r>
+    </w:p>
+    <w:p>
+      <w:pPr>
+        <w:spacing w:after="60"/>
+      </w:pPr>
+      <w:r>
+        <w:rPr>
+          <w:b/>
+          <w:bCs/>
+          <w:color w:val="3F8291"/>
+          <w:sz w:val="18"/>
+          <w:szCs w:val="18"/>
+        </w:rPr>
+        <w:t xml:space="preserve">Who leads: You lead (directed, safe)</w:t>
       </w:r>
     </w:p>
     <w:tbl>
@@ -2557,6 +2627,21 @@
     </w:p>
     <w:p>
       <w:pPr>
+        <w:spacing w:after="60"/>
+      </w:pPr>
+      <w:r>
+        <w:rPr>
+          <w:b/>
+          <w:bCs/>
+          <w:color w:val="3F8291"/>
+          <w:sz w:val="18"/>
+          <w:szCs w:val="18"/>
+        </w:rPr>
+        <w:t xml:space="preserve">Who leads: Shared (learners choose, you guide)</w:t>
+      </w:r>
+    </w:p>
+    <w:p>
+      <w:pPr>
         <w:spacing w:after="80"/>
       </w:pPr>
       <w:r>
@@ -4994,6 +5079,21 @@
     </w:p>
     <w:p>
       <w:pPr>
+        <w:spacing w:after="60"/>
+      </w:pPr>
+      <w:r>
+        <w:rPr>
+          <w:b/>
+          <w:bCs/>
+          <w:color w:val="3F8291"/>
+          <w:sz w:val="18"/>
+          <w:szCs w:val="18"/>
+        </w:rPr>
+        <w:t xml:space="preserve">Who leads: Shared (learners choose, you guide)</w:t>
+      </w:r>
+    </w:p>
+    <w:p>
+      <w:pPr>
         <w:spacing w:after="80"/>
       </w:pPr>
       <w:r>
@@ -7398,6 +7498,21 @@
     </w:p>
     <w:p>
       <w:pPr>
+        <w:spacing w:after="60"/>
+      </w:pPr>
+      <w:r>
+        <w:rPr>
+          <w:b/>
+          <w:bCs/>
+          <w:color w:val="3F8291"/>
+          <w:sz w:val="18"/>
+          <w:szCs w:val="18"/>
+        </w:rPr>
+        <w:t xml:space="preserve">Who leads: Shared (learners choose, you guide)</w:t>
+      </w:r>
+    </w:p>
+    <w:p>
+      <w:pPr>
         <w:spacing w:after="80"/>
       </w:pPr>
       <w:r>
@@ -10100,6 +10215,21 @@
     </w:p>
     <w:p>
       <w:pPr>
+        <w:spacing w:after="60"/>
+      </w:pPr>
+      <w:r>
+        <w:rPr>
+          <w:b/>
+          <w:bCs/>
+          <w:color w:val="3F8291"/>
+          <w:sz w:val="18"/>
+          <w:szCs w:val="18"/>
+        </w:rPr>
+        <w:t xml:space="preserve">Who leads: Learners lead (you step back)</w:t>
+      </w:r>
+    </w:p>
+    <w:p>
+      <w:pPr>
         <w:spacing w:after="80"/>
       </w:pPr>
       <w:r>
@@ -11777,6 +11907,21 @@
           <w:szCs w:val="40"/>
         </w:rPr>
         <w:t xml:space="preserve">Phase 6 — Celebrate and look ahead</w:t>
+      </w:r>
+    </w:p>
+    <w:p>
+      <w:pPr>
+        <w:spacing w:after="60"/>
+      </w:pPr>
+      <w:r>
+        <w:rPr>
+          <w:b/>
+          <w:bCs/>
+          <w:color w:val="3F8291"/>
+          <w:sz w:val="18"/>
+          <w:szCs w:val="18"/>
+        </w:rPr>
+        <w:t xml:space="preserve">Who leads: Learners lead (you step back)</w:t>
       </w:r>
     </w:p>
     <w:tbl>

</xml_diff>

<commit_message>
feat: add an assessment note anchoring FSL2 judgement to Amala's proficiency scale
A `assessmentNote` on the unit, rendered on the unit page and the facilitator doc
cover: on Learning Bridge+, the learner's proficiency in the anchor competency
(FSL2, Set and pursue goals) is judged by educator judgement against Amala's
proficiency scale at two points (midway formative, end summative), from evidence
gathered across the whole component (goals set and steps taken, the workbook and
action plans, the goal-pursuit check-ins and final sharing, and the growth-path
self-placement) — not one artefact, and not over-assessed.

Co-Authored-By: Claude Opus 4.8 <noreply@anthropic.com>
</commit_message>
<xml_diff>
--- a/public/downloads/agency-in-learning-facilitator-unit-plan.docx
+++ b/public/downloads/agency-in-learning-facilitator-unit-plan.docx
@@ -206,6 +206,61 @@
                 <w:szCs w:val="21"/>
               </w:rPr>
               <w:t xml:space="preserve">This unit deliberately hands over control as it goes, because you cannot build a self-directed learner by directing them the whole way. Early on you lead: you set up a safe space and run the first activities. In the middle it is shared: learners choose and shape their own goals while you guide. Later the learners lead: they drive and pursue their own goals while you step back. Release control gradually and safely. Some learners need more structure for longer, and that is fine. Autonomy is offered, never imposed: if a learner flounders without structure, give them more support, not less, and never withdraw help as a test.</w:t>
+            </w:r>
+          </w:p>
+        </w:tc>
+      </w:tr>
+    </w:tbl>
+    <w:tbl>
+      <w:tblPr>
+        <w:tblW w:type="pct" w:w="100%"/>
+        <w:tblBorders>
+          <w:top w:val="none" w:color="FFFFFF" w:sz="0"/>
+          <w:left w:val="none" w:color="FFFFFF" w:sz="0"/>
+          <w:bottom w:val="none" w:color="FFFFFF" w:sz="0"/>
+          <w:right w:val="none" w:color="FFFFFF" w:sz="0"/>
+          <w:insideH w:val="none" w:color="FFFFFF" w:sz="0"/>
+          <w:insideV w:val="none" w:color="FFFFFF" w:sz="0"/>
+        </w:tblBorders>
+      </w:tblPr>
+      <w:tblGrid>
+        <w:gridCol w:w="100"/>
+      </w:tblGrid>
+      <w:tr>
+        <w:tc>
+          <w:tcPr>
+            <w:shd w:fill="EDE7EE" w:color="auto" w:val="clear"/>
+            <w:tcMar>
+              <w:top w:type="dxa" w:w="90"/>
+              <w:left w:type="dxa" w:w="140"/>
+              <w:bottom w:type="dxa" w:w="90"/>
+              <w:right w:type="dxa" w:w="140"/>
+            </w:tcMar>
+          </w:tcPr>
+          <w:p>
+            <w:pPr>
+              <w:spacing w:after="40"/>
+            </w:pPr>
+            <w:r>
+              <w:rPr>
+                <w:b/>
+                <w:bCs/>
+                <w:color w:val="8A4E73"/>
+                <w:spacing w:val="30"/>
+                <w:sz w:val="15"/>
+                <w:szCs w:val="15"/>
+              </w:rPr>
+              <w:t xml:space="preserve">HOW THE COMPETENCY IS ASSESSED</w:t>
+            </w:r>
+          </w:p>
+          <w:p>
+            <w:r>
+              <w:rPr>
+                <w:color w:val="041E42"/>
+                <w:sz w:val="21"/>
+                <w:szCs w:val="21"/>
+              </w:rPr>
+              <w:t xml:space="preserve">On Learning Bridge+, a learner's proficiency in the anchor competency, setting and pursuing goals (FSL2), is judged by the educator against Amala's proficiency scale at two points: midway (formative) and at the end (summative). It is not marked from a single artefact. Gather evidence from across the whole component: the goals learners set and the steps they took (their workbook and action plans), what they say in the goal-pursuit check-ins and the final sharing, and where they place themselves on the growth path over time. Do not over-assess: two considered judgements, built from evidence gathered over time, are worth more than repeated testing.</w:t>
             </w:r>
           </w:p>
         </w:tc>

</xml_diff>

<commit_message>
feat: strengthen agency coverage — managing uncertainty, adapting, asking for help
Coverage enrichment (no new hours), addressing the gaps most relevant to Cox's
Bazar surfaced by the competency-kit review:

- Goal-pursuit practice blocks: name the reality that a step may not work or
  plans get disrupted (fires, illness, a week kept indoors); adapting the plan
  and picking it back up is the skill, not a setback.
- Reflecting on your growth: a prompt on a time a plan changed and what they did
  next, mapped to FPS1 (Adaptable thinking).
- Find help and resources: reframe asking for help as a strength and an act of
  agency, not a weakness.

Co-Authored-By: Claude Opus 4.8 <noreply@anthropic.com>
</commit_message>
<xml_diff>
--- a/public/downloads/agency-in-learning-facilitator-unit-plan.docx
+++ b/public/downloads/agency-in-learning-facilitator-unit-plan.docx
@@ -9346,7 +9346,7 @@
                 <w:sz w:val="21"/>
                 <w:szCs w:val="21"/>
               </w:rPr>
-              <w:t xml:space="preserve">Learners often treat a goal as something they must reach alone, and so stall. The one thing to get right is the shift from what do I know to who and what could help me, and then the courage to ask. Keep the focus on help that is genuinely reachable in the camp, not an ideal list they can never use, and keep every suggested helper safe and appropriate for the learner. The most valuable help in the room is usually the room itself, so protect the pooling step. Your job is to help learners find and approach help, not to supply it for them.</w:t>
+              <w:t xml:space="preserve">Learners often treat a goal as something they must reach alone, and so stall. The one thing to get right is the shift from what do I know to who and what could help me, and then the courage to ask. Reframe asking for help as a strength, not a weakness: reaching out is itself an act of agency, and the strongest learners are the ones who know when and who to ask. Keep the focus on help that is genuinely reachable in the camp, not an ideal list they can never use, and keep every suggested helper safe and appropriate for the learner. The most valuable help in the room is usually the room itself, so protect the pooling step. Your job is to help learners find and approach help, not to supply it for them.</w:t>
             </w:r>
           </w:p>
         </w:tc>
@@ -10187,7 +10187,7 @@
           <w:sz w:val="21"/>
           <w:szCs w:val="21"/>
         </w:rPr>
-        <w:t xml:space="preserve">The heart of independent learning. Between sessions, learners take real steps towards their goal and make one small mark or drawing in their learning book each time. Open each session with a short, warm check-in in same-gender pairs or the group: what step did you take, what happened, what is next? A step taken, however small, is celebrated. This block is where the 20 independent hours mostly live, so protect it and keep the check-ins going.</w:t>
+        <w:t xml:space="preserve">The heart of independent learning. Between sessions, learners take real steps towards their goal and make one small mark or drawing in their learning book each time. Open each session with a short, warm check-in in same-gender pairs or the group: what step did you take, what happened, what is next? A step taken, however small, is celebrated. This block is where the 20 independent hours mostly live, so protect it and keep the check-ins going. When a step does not work, or something changes, that is normal, not a failure: help learners choose a smaller step or a different one and keep going. Adapting the plan is part of the skill.</w:t>
       </w:r>
     </w:p>
     <w:tbl>
@@ -11567,6 +11567,24 @@
     </w:p>
     <w:p>
       <w:pPr>
+        <w:pStyle w:val="ListParagraph"/>
+        <w:numPr>
+          <w:ilvl w:val="0"/>
+          <w:numId w:val="1"/>
+        </w:numPr>
+        <w:spacing w:after="20"/>
+      </w:pPr>
+      <w:r>
+        <w:rPr>
+          <w:color w:val="041E42"/>
+          <w:sz w:val="20"/>
+          <w:szCs w:val="20"/>
+        </w:rPr>
+        <w:t xml:space="preserve">Was there a time your plan changed, or a step did not work? What did you do next?</w:t>
+      </w:r>
+    </w:p>
+    <w:p>
+      <w:pPr>
         <w:spacing w:after="20" w:before="40"/>
       </w:pPr>
       <w:r>
@@ -11883,7 +11901,7 @@
           <w:sz w:val="21"/>
           <w:szCs w:val="21"/>
         </w:rPr>
-        <w:t xml:space="preserve">Learners keep pursuing their goal and marking their book, now using the feedback they gathered and adjusting their steps when something is not working. Keep the short warm check-ins that open each session. By the end of this block most learners have taken real, tracked steps towards a goal they set themselves, which is the evidence of self-directed learning.</w:t>
+        <w:t xml:space="preserve">Learners keep pursuing their goal and marking their book, now using the feedback they gathered and adjusting their steps when something is not working. Keep the short warm check-ins that open each session. By the end of this block most learners have taken real, tracked steps towards a goal they set themselves, which is the evidence of self-directed learning. In the camps, plans get disrupted by fires, illness, or a week kept indoors; treat adapting the plan and picking it back up as the real skill, not a setback.</w:t>
       </w:r>
     </w:p>
     <w:tbl>

</xml_diff>

<commit_message>
feat: set readiness at Practitioner, keep scaffolding high, and cut the print burden
Acting on the critical-review directions:
- Readiness bar defined as Practitioner in FSL2 (Amala's Pass) — the agreement
  sets ≥70% ready via summative assessment but names no level and tasks the
  consultant with the criteria; aim for as many as possible reaching higher.
- Delivery approach reframed so scaffolding stays high throughout: releasing
  control means shifting from directing to coaching, never withdrawing support;
  the workbook, sheets and check-ins hold every independent step (hours unchanged
  at 30 + 20 = 50).
- Print economy: the workbook and per-activity sheets cover the same activities,
  so teams need not print both — the local team decides what to print.

Co-Authored-By: Claude Opus 4.8 <noreply@anthropic.com>
</commit_message>
<xml_diff>
--- a/public/downloads/agency-in-learning-facilitator-unit-plan.docx
+++ b/public/downloads/agency-in-learning-facilitator-unit-plan.docx
@@ -205,7 +205,7 @@
                 <w:sz w:val="21"/>
                 <w:szCs w:val="21"/>
               </w:rPr>
-              <w:t xml:space="preserve">This unit deliberately hands over control as it goes, because you cannot build a self-directed learner by directing them the whole way. Early on you lead: you set up a safe space and run the first activities. In the middle it is shared: learners choose and shape their own goals while you guide. Later the learners lead: they drive and pursue their own goals while you step back. Release control gradually and safely. Some learners need more structure for longer, and that is fine. Autonomy is offered, never imposed: if a learner flounders without structure, give them more support, not less, and never withdraw help as a test.</w:t>
+              <w:t xml:space="preserve">This unit hands over ownership as it goes, but the scaffolding stays high the whole way through: you are always supporting, never leaving learners to sink. Early on you lead, with directed, structured activities in a safe space. In the middle it is shared: learners choose and shape their own goals while you guide closely, and the workbook, the sheets and the check-ins hold every step. Later the learners lead: they own and pursue their own goals, but the structure never withdraws, the workbook carries each independent task, every session opens with a warm check-in, and you coach, prompt and steady them. Releasing control means shifting from directing to coaching, not removing support. Do it gradually. Some learners need heavy structure for the whole course, and that is fine. Autonomy is offered, never imposed: if a learner flounders, add support, not less, and never withdraw help as a test.</w:t>
             </w:r>
           </w:p>
         </w:tc>
@@ -260,7 +260,7 @@
                 <w:sz w:val="21"/>
                 <w:szCs w:val="21"/>
               </w:rPr>
-              <w:t xml:space="preserve">On Learning Bridge+, a learner's proficiency in the anchor competency, setting and pursuing goals (FSL2), is judged by the educator against Amala's proficiency scale at two points: midway (formative) and at the end (summative). It is not marked from a single artefact. Gather evidence from across the whole component: the goals learners set and the steps they took (their workbook and action plans), what they say in the goal-pursuit check-ins and the final sharing, and where they place themselves on the growth path over time. Do not over-assess: two considered judgements, built from evidence gathered over time, are worth more than repeated testing.</w:t>
+              <w:t xml:space="preserve">On Learning Bridge+, a learner's proficiency in the anchor competency, setting and pursuing goals (FSL2), is judged by the educator against Amala's proficiency scale at two points: midway (formative) and at the end (summative). Readiness for the accredited secondary pathway is set at Practitioner level (Amala's Pass): the learner has set a goal and taken deliberate steps towards it, with a clear rationale. Aim to get as many learners as possible beyond that, to Reflective Practitioner or higher. The agreed target is that at least 70% of completers reach the readiness bar at the summative point. It is not marked from a single artefact: gather evidence from across the whole component, the goals learners set and the steps they took (their workbook and action plans), what they say in the goal-pursuit check-ins and the final sharing, and how they have grown over time. Do not over-assess: two considered judgements, built from evidence gathered over time, are worth more than repeated testing.</w:t>
             </w:r>
           </w:p>
         </w:tc>

</xml_diff>